<commit_message>
updated data with new allometric equations from literature, added new function to select from different kinds of equations
</commit_message>
<xml_diff>
--- a/allometry_flowchart.docx
+++ b/allometry_flowchart.docx
@@ -305,6 +305,8 @@
           <w:szCs w:val="24"/>
         </w:rPr>
       </w:pPr>
+      <w:bookmarkStart w:id="0" w:name="_GoBack"/>
+      <w:bookmarkEnd w:id="0"/>
       <w:r>
         <w:rPr>
           <w:rFonts w:ascii="Goudy Old Style" w:hAnsi="Goudy Old Style" w:cs="Times New Roman"/>
@@ -425,7 +427,132 @@
         <mc:AlternateContent>
           <mc:Choice Requires="wps">
             <w:drawing>
-              <wp:anchor distT="0" distB="0" distL="114300" distR="114300" simplePos="0" relativeHeight="251762688" behindDoc="0" locked="0" layoutInCell="1" allowOverlap="1" wp14:anchorId="0CB86A95" wp14:editId="5268717B">
+              <wp:anchor distT="45720" distB="45720" distL="114300" distR="114300" simplePos="0" relativeHeight="251791360" behindDoc="0" locked="0" layoutInCell="1" allowOverlap="1" wp14:anchorId="5581E0F6" wp14:editId="3B52E14D">
+                <wp:simplePos x="0" y="0"/>
+                <wp:positionH relativeFrom="column">
+                  <wp:posOffset>-698500</wp:posOffset>
+                </wp:positionH>
+                <wp:positionV relativeFrom="paragraph">
+                  <wp:posOffset>251460</wp:posOffset>
+                </wp:positionV>
+                <wp:extent cx="1181100" cy="647700"/>
+                <wp:effectExtent l="0" t="0" r="19050" b="19050"/>
+                <wp:wrapSquare wrapText="bothSides"/>
+                <wp:docPr id="4" name="Text Box 2"/>
+                <wp:cNvGraphicFramePr>
+                  <a:graphicFrameLocks xmlns:a="http://schemas.openxmlformats.org/drawingml/2006/main"/>
+                </wp:cNvGraphicFramePr>
+                <a:graphic xmlns:a="http://schemas.openxmlformats.org/drawingml/2006/main">
+                  <a:graphicData uri="http://schemas.microsoft.com/office/word/2010/wordprocessingShape">
+                    <wps:wsp>
+                      <wps:cNvSpPr txBox="1">
+                        <a:spLocks noChangeArrowheads="1"/>
+                      </wps:cNvSpPr>
+                      <wps:spPr bwMode="auto">
+                        <a:xfrm>
+                          <a:off x="0" y="0"/>
+                          <a:ext cx="1181100" cy="647700"/>
+                        </a:xfrm>
+                        <a:prstGeom prst="rect">
+                          <a:avLst/>
+                        </a:prstGeom>
+                        <a:solidFill>
+                          <a:srgbClr val="FFFFFF"/>
+                        </a:solidFill>
+                        <a:ln w="9525">
+                          <a:solidFill>
+                            <a:srgbClr val="000000"/>
+                          </a:solidFill>
+                          <a:miter lim="800000"/>
+                          <a:headEnd/>
+                          <a:tailEnd/>
+                        </a:ln>
+                      </wps:spPr>
+                      <wps:txbx>
+                        <w:txbxContent>
+                          <w:p>
+                            <w:proofErr w:type="spellStart"/>
+                            <w:r>
+                              <w:t>equation_</w:t>
+                            </w:r>
+                            <w:proofErr w:type="gramStart"/>
+                            <w:r>
+                              <w:t>finder</w:t>
+                            </w:r>
+                            <w:proofErr w:type="spellEnd"/>
+                            <w:r>
+                              <w:t>(</w:t>
+                            </w:r>
+                            <w:proofErr w:type="gramEnd"/>
+                            <w:r>
+                              <w:t>size, row, exception</w:t>
+                            </w:r>
+                            <w:r>
+                              <w:t>)</w:t>
+                            </w:r>
+                          </w:p>
+                        </w:txbxContent>
+                      </wps:txbx>
+                      <wps:bodyPr rot="0" vert="horz" wrap="square" lIns="91440" tIns="45720" rIns="91440" bIns="45720" anchor="t" anchorCtr="0">
+                        <a:noAutofit/>
+                      </wps:bodyPr>
+                    </wps:wsp>
+                  </a:graphicData>
+                </a:graphic>
+                <wp14:sizeRelH relativeFrom="margin">
+                  <wp14:pctWidth>0</wp14:pctWidth>
+                </wp14:sizeRelH>
+                <wp14:sizeRelV relativeFrom="margin">
+                  <wp14:pctHeight>0</wp14:pctHeight>
+                </wp14:sizeRelV>
+              </wp:anchor>
+            </w:drawing>
+          </mc:Choice>
+          <mc:Fallback>
+            <w:pict>
+              <v:shape w14:anchorId="5581E0F6" id="_x0000_s1028" type="#_x0000_t202" style="position:absolute;margin-left:-55pt;margin-top:19.8pt;width:93pt;height:51pt;z-index:251791360;visibility:visible;mso-wrap-style:square;mso-width-percent:0;mso-height-percent:0;mso-wrap-distance-left:9pt;mso-wrap-distance-top:3.6pt;mso-wrap-distance-right:9pt;mso-wrap-distance-bottom:3.6pt;mso-position-horizontal:absolute;mso-position-horizontal-relative:text;mso-position-vertical:absolute;mso-position-vertical-relative:text;mso-width-percent:0;mso-height-percent:0;mso-width-relative:margin;mso-height-relative:margin;v-text-anchor:top" o:gfxdata="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">
+                <v:textbox>
+                  <w:txbxContent>
+                    <w:p>
+                      <w:proofErr w:type="spellStart"/>
+                      <w:r>
+                        <w:t>equation_</w:t>
+                      </w:r>
+                      <w:proofErr w:type="gramStart"/>
+                      <w:r>
+                        <w:t>finder</w:t>
+                      </w:r>
+                      <w:proofErr w:type="spellEnd"/>
+                      <w:r>
+                        <w:t>(</w:t>
+                      </w:r>
+                      <w:proofErr w:type="gramEnd"/>
+                      <w:r>
+                        <w:t>size, row, exception</w:t>
+                      </w:r>
+                      <w:r>
+                        <w:t>)</w:t>
+                      </w:r>
+                    </w:p>
+                  </w:txbxContent>
+                </v:textbox>
+                <w10:wrap type="square"/>
+              </v:shape>
+            </w:pict>
+          </mc:Fallback>
+        </mc:AlternateContent>
+      </w:r>
+      <w:r>
+        <w:rPr>
+          <w:rFonts w:ascii="Goudy Old Style" w:hAnsi="Goudy Old Style" w:cs="Times New Roman"/>
+          <w:noProof/>
+          <w:sz w:val="24"/>
+          <w:szCs w:val="24"/>
+        </w:rPr>
+        <mc:AlternateContent>
+          <mc:Choice Requires="wps">
+            <w:drawing>
+              <wp:anchor distT="0" distB="0" distL="114300" distR="114300" simplePos="0" relativeHeight="251762688" behindDoc="0" locked="0" layoutInCell="1" allowOverlap="1" wp14:anchorId="0CB86A95" wp14:editId="49548C8E">
                 <wp:simplePos x="0" y="0"/>
                 <wp:positionH relativeFrom="column">
                   <wp:posOffset>2941983</wp:posOffset>
@@ -483,7 +610,7 @@
           </mc:Choice>
           <mc:Fallback>
             <w:pict>
-              <v:line w14:anchorId="2530AB9C" id="Straight Connector 43" o:spid="_x0000_s1026" style="position:absolute;z-index:251762688;visibility:visible;mso-wrap-style:square;mso-width-percent:0;mso-height-percent:0;mso-wrap-distance-left:9pt;mso-wrap-distance-top:0;mso-wrap-distance-right:9pt;mso-wrap-distance-bottom:0;mso-position-horizontal:absolute;mso-position-horizontal-relative:text;mso-position-vertical:absolute;mso-position-vertical-relative:text;mso-width-percent:0;mso-height-percent:0;mso-width-relative:margin;mso-height-relative:margin" from="231.65pt,18.5pt" to="440.9pt,96.1pt" o:gfxdata="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" strokecolor="black [3200]" strokeweight=".5pt">
+              <v:line w14:anchorId="108215B2" id="Straight Connector 43" o:spid="_x0000_s1026" style="position:absolute;z-index:251762688;visibility:visible;mso-wrap-style:square;mso-width-percent:0;mso-height-percent:0;mso-wrap-distance-left:9pt;mso-wrap-distance-top:0;mso-wrap-distance-right:9pt;mso-wrap-distance-bottom:0;mso-position-horizontal:absolute;mso-position-horizontal-relative:text;mso-position-vertical:absolute;mso-position-vertical-relative:text;mso-width-percent:0;mso-height-percent:0;mso-width-relative:margin;mso-height-relative:margin" from="231.65pt,18.5pt" to="440.9pt,96.1pt" o:gfxdata="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" strokecolor="black [3200]" strokeweight=".5pt">
                 <v:stroke endarrow="classic" endarrowwidth="wide" endarrowlength="long" joinstyle="miter"/>
               </v:line>
             </w:pict>
@@ -664,7 +791,7 @@
           </mc:Choice>
           <mc:Fallback>
             <w:pict>
-              <v:shape w14:anchorId="638839DA" id="_x0000_s1028" type="#_x0000_t202" style="position:absolute;margin-left:82.5pt;margin-top:12pt;width:30pt;height:22.3pt;z-index:251674624;visibility:visible;mso-wrap-style:square;mso-width-percent:0;mso-height-percent:0;mso-wrap-distance-left:9pt;mso-wrap-distance-top:3.6pt;mso-wrap-distance-right:9pt;mso-wrap-distance-bottom:3.6pt;mso-position-horizontal:absolute;mso-position-horizontal-relative:text;mso-position-vertical:absolute;mso-position-vertical-relative:text;mso-width-percent:0;mso-height-percent:0;mso-width-relative:margin;mso-height-relative:margin;v-text-anchor:top" o:gfxdata="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">
+              <v:shape w14:anchorId="638839DA" id="_x0000_s1029" type="#_x0000_t202" style="position:absolute;margin-left:82.5pt;margin-top:12pt;width:30pt;height:22.3pt;z-index:251674624;visibility:visible;mso-wrap-style:square;mso-width-percent:0;mso-height-percent:0;mso-wrap-distance-left:9pt;mso-wrap-distance-top:3.6pt;mso-wrap-distance-right:9pt;mso-wrap-distance-bottom:3.6pt;mso-position-horizontal:absolute;mso-position-horizontal-relative:text;mso-position-vertical:absolute;mso-position-vertical-relative:text;mso-width-percent:0;mso-height-percent:0;mso-width-relative:margin;mso-height-relative:margin;v-text-anchor:top" o:gfxdata="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">
                 <v:textbox>
                   <w:txbxContent>
                     <w:p>
@@ -773,7 +900,7 @@
           </mc:Choice>
           <mc:Fallback>
             <w:pict>
-              <v:shape w14:anchorId="48FCBF91" id="_x0000_s1029" type="#_x0000_t202" style="position:absolute;margin-left:330.15pt;margin-top:10.9pt;width:29.5pt;height:20.05pt;z-index:251676672;visibility:visible;mso-wrap-style:square;mso-width-percent:0;mso-height-percent:0;mso-wrap-distance-left:9pt;mso-wrap-distance-top:3.6pt;mso-wrap-distance-right:9pt;mso-wrap-distance-bottom:3.6pt;mso-position-horizontal:absolute;mso-position-horizontal-relative:text;mso-position-vertical:absolute;mso-position-vertical-relative:text;mso-width-percent:0;mso-height-percent:0;mso-width-relative:margin;mso-height-relative:margin;v-text-anchor:top" o:gfxdata="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">
+              <v:shape w14:anchorId="48FCBF91" id="_x0000_s1030" type="#_x0000_t202" style="position:absolute;margin-left:330.15pt;margin-top:10.9pt;width:29.5pt;height:20.05pt;z-index:251676672;visibility:visible;mso-wrap-style:square;mso-width-percent:0;mso-height-percent:0;mso-wrap-distance-left:9pt;mso-wrap-distance-top:3.6pt;mso-wrap-distance-right:9pt;mso-wrap-distance-bottom:3.6pt;mso-position-horizontal:absolute;mso-position-horizontal-relative:text;mso-position-vertical:absolute;mso-position-vertical-relative:text;mso-width-percent:0;mso-height-percent:0;mso-width-relative:margin;mso-height-relative:margin;v-text-anchor:top" o:gfxdata="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">
                 <v:textbox>
                   <w:txbxContent>
                     <w:p>
@@ -817,17 +944,6 @@
           <w:szCs w:val="24"/>
         </w:rPr>
       </w:pPr>
-    </w:p>
-    <w:p>
-      <w:pPr>
-        <w:rPr>
-          <w:rFonts w:ascii="Goudy Old Style" w:hAnsi="Goudy Old Style" w:cs="Times New Roman"/>
-          <w:b/>
-          <w:bCs/>
-          <w:sz w:val="24"/>
-          <w:szCs w:val="24"/>
-        </w:rPr>
-      </w:pPr>
       <w:r>
         <w:rPr>
           <w:rFonts w:ascii="Goudy Old Style" w:hAnsi="Goudy Old Style" w:cs="Times New Roman"/>
@@ -838,7 +954,172 @@
         <mc:AlternateContent>
           <mc:Choice Requires="wps">
             <w:drawing>
-              <wp:anchor distT="45720" distB="45720" distL="114300" distR="114300" simplePos="0" relativeHeight="251781120" behindDoc="0" locked="0" layoutInCell="1" allowOverlap="1" wp14:anchorId="7EDCFD21" wp14:editId="1C4BEA9D">
+              <wp:anchor distT="0" distB="0" distL="114300" distR="114300" simplePos="0" relativeHeight="251795456" behindDoc="0" locked="0" layoutInCell="1" allowOverlap="1" wp14:anchorId="4ECFC949" wp14:editId="536617FE">
+                <wp:simplePos x="0" y="0"/>
+                <wp:positionH relativeFrom="page">
+                  <wp:posOffset>704850</wp:posOffset>
+                </wp:positionH>
+                <wp:positionV relativeFrom="paragraph">
+                  <wp:posOffset>71120</wp:posOffset>
+                </wp:positionV>
+                <wp:extent cx="6350" cy="279400"/>
+                <wp:effectExtent l="95250" t="38100" r="69850" b="25400"/>
+                <wp:wrapNone/>
+                <wp:docPr id="6" name="Straight Connector 6"/>
+                <wp:cNvGraphicFramePr/>
+                <a:graphic xmlns:a="http://schemas.openxmlformats.org/drawingml/2006/main">
+                  <a:graphicData uri="http://schemas.microsoft.com/office/word/2010/wordprocessingShape">
+                    <wps:wsp>
+                      <wps:cNvCnPr/>
+                      <wps:spPr>
+                        <a:xfrm flipV="1">
+                          <a:off x="0" y="0"/>
+                          <a:ext cx="6350" cy="279400"/>
+                        </a:xfrm>
+                        <a:prstGeom prst="line">
+                          <a:avLst/>
+                        </a:prstGeom>
+                        <a:ln>
+                          <a:headEnd type="none"/>
+                          <a:tailEnd type="stealth" w="lg" len="lg"/>
+                        </a:ln>
+                      </wps:spPr>
+                      <wps:style>
+                        <a:lnRef idx="1">
+                          <a:schemeClr val="dk1"/>
+                        </a:lnRef>
+                        <a:fillRef idx="0">
+                          <a:schemeClr val="dk1"/>
+                        </a:fillRef>
+                        <a:effectRef idx="0">
+                          <a:schemeClr val="dk1"/>
+                        </a:effectRef>
+                        <a:fontRef idx="minor">
+                          <a:schemeClr val="tx1"/>
+                        </a:fontRef>
+                      </wps:style>
+                      <wps:bodyPr/>
+                    </wps:wsp>
+                  </a:graphicData>
+                </a:graphic>
+                <wp14:sizeRelH relativeFrom="margin">
+                  <wp14:pctWidth>0</wp14:pctWidth>
+                </wp14:sizeRelH>
+                <wp14:sizeRelV relativeFrom="margin">
+                  <wp14:pctHeight>0</wp14:pctHeight>
+                </wp14:sizeRelV>
+              </wp:anchor>
+            </w:drawing>
+          </mc:Choice>
+          <mc:Fallback>
+            <w:pict>
+              <v:line w14:anchorId="1F994C6B" id="Straight Connector 6" o:spid="_x0000_s1026" style="position:absolute;flip:y;z-index:251795456;visibility:visible;mso-wrap-style:square;mso-width-percent:0;mso-height-percent:0;mso-wrap-distance-left:9pt;mso-wrap-distance-top:0;mso-wrap-distance-right:9pt;mso-wrap-distance-bottom:0;mso-position-horizontal:absolute;mso-position-horizontal-relative:page;mso-position-vertical:absolute;mso-position-vertical-relative:text;mso-width-percent:0;mso-height-percent:0;mso-width-relative:margin;mso-height-relative:margin" from="55.5pt,5.6pt" to="56pt,27.6pt" o:gfxdata="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" strokecolor="black [3200]" strokeweight=".5pt">
+                <v:stroke endarrow="classic" endarrowwidth="wide" endarrowlength="long" joinstyle="miter"/>
+                <w10:wrap anchorx="page"/>
+              </v:line>
+            </w:pict>
+          </mc:Fallback>
+        </mc:AlternateContent>
+      </w:r>
+      <w:r>
+        <w:rPr>
+          <w:rFonts w:ascii="Goudy Old Style" w:hAnsi="Goudy Old Style" w:cs="Times New Roman"/>
+          <w:noProof/>
+          <w:sz w:val="24"/>
+          <w:szCs w:val="24"/>
+        </w:rPr>
+        <mc:AlternateContent>
+          <mc:Choice Requires="wps">
+            <w:drawing>
+              <wp:anchor distT="0" distB="0" distL="114300" distR="114300" simplePos="0" relativeHeight="251793408" behindDoc="0" locked="0" layoutInCell="1" allowOverlap="1" wp14:anchorId="1BDEA18B" wp14:editId="1361A711">
+                <wp:simplePos x="0" y="0"/>
+                <wp:positionH relativeFrom="page">
+                  <wp:posOffset>539750</wp:posOffset>
+                </wp:positionH>
+                <wp:positionV relativeFrom="paragraph">
+                  <wp:posOffset>77470</wp:posOffset>
+                </wp:positionV>
+                <wp:extent cx="0" cy="287020"/>
+                <wp:effectExtent l="95250" t="0" r="57150" b="55880"/>
+                <wp:wrapNone/>
+                <wp:docPr id="5" name="Straight Connector 5"/>
+                <wp:cNvGraphicFramePr/>
+                <a:graphic xmlns:a="http://schemas.openxmlformats.org/drawingml/2006/main">
+                  <a:graphicData uri="http://schemas.microsoft.com/office/word/2010/wordprocessingShape">
+                    <wps:wsp>
+                      <wps:cNvCnPr/>
+                      <wps:spPr>
+                        <a:xfrm>
+                          <a:off x="0" y="0"/>
+                          <a:ext cx="0" cy="287020"/>
+                        </a:xfrm>
+                        <a:prstGeom prst="line">
+                          <a:avLst/>
+                        </a:prstGeom>
+                        <a:ln>
+                          <a:headEnd type="none"/>
+                          <a:tailEnd type="stealth" w="lg" len="lg"/>
+                        </a:ln>
+                      </wps:spPr>
+                      <wps:style>
+                        <a:lnRef idx="1">
+                          <a:schemeClr val="dk1"/>
+                        </a:lnRef>
+                        <a:fillRef idx="0">
+                          <a:schemeClr val="dk1"/>
+                        </a:fillRef>
+                        <a:effectRef idx="0">
+                          <a:schemeClr val="dk1"/>
+                        </a:effectRef>
+                        <a:fontRef idx="minor">
+                          <a:schemeClr val="tx1"/>
+                        </a:fontRef>
+                      </wps:style>
+                      <wps:bodyPr/>
+                    </wps:wsp>
+                  </a:graphicData>
+                </a:graphic>
+                <wp14:sizeRelH relativeFrom="margin">
+                  <wp14:pctWidth>0</wp14:pctWidth>
+                </wp14:sizeRelH>
+                <wp14:sizeRelV relativeFrom="margin">
+                  <wp14:pctHeight>0</wp14:pctHeight>
+                </wp14:sizeRelV>
+              </wp:anchor>
+            </w:drawing>
+          </mc:Choice>
+          <mc:Fallback>
+            <w:pict>
+              <v:line w14:anchorId="563A9EEF" id="Straight Connector 5" o:spid="_x0000_s1026" style="position:absolute;z-index:251793408;visibility:visible;mso-wrap-style:square;mso-width-percent:0;mso-height-percent:0;mso-wrap-distance-left:9pt;mso-wrap-distance-top:0;mso-wrap-distance-right:9pt;mso-wrap-distance-bottom:0;mso-position-horizontal:absolute;mso-position-horizontal-relative:page;mso-position-vertical:absolute;mso-position-vertical-relative:text;mso-width-percent:0;mso-height-percent:0;mso-width-relative:margin;mso-height-relative:margin" from="42.5pt,6.1pt" to="42.5pt,28.7pt" o:gfxdata="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" strokecolor="black [3200]" strokeweight=".5pt">
+                <v:stroke endarrow="classic" endarrowwidth="wide" endarrowlength="long" joinstyle="miter"/>
+                <w10:wrap anchorx="page"/>
+              </v:line>
+            </w:pict>
+          </mc:Fallback>
+        </mc:AlternateContent>
+      </w:r>
+    </w:p>
+    <w:p>
+      <w:pPr>
+        <w:rPr>
+          <w:rFonts w:ascii="Goudy Old Style" w:hAnsi="Goudy Old Style" w:cs="Times New Roman"/>
+          <w:b/>
+          <w:bCs/>
+          <w:sz w:val="24"/>
+          <w:szCs w:val="24"/>
+        </w:rPr>
+      </w:pPr>
+      <w:r>
+        <w:rPr>
+          <w:rFonts w:ascii="Goudy Old Style" w:hAnsi="Goudy Old Style" w:cs="Times New Roman"/>
+          <w:noProof/>
+          <w:sz w:val="24"/>
+          <w:szCs w:val="24"/>
+        </w:rPr>
+        <mc:AlternateContent>
+          <mc:Choice Requires="wps">
+            <w:drawing>
+              <wp:anchor distT="45720" distB="45720" distL="114300" distR="114300" simplePos="0" relativeHeight="251781120" behindDoc="0" locked="0" layoutInCell="1" allowOverlap="1" wp14:anchorId="7EDCFD21" wp14:editId="0FDB5AAF">
                 <wp:simplePos x="0" y="0"/>
                 <wp:positionH relativeFrom="column">
                   <wp:posOffset>1891831</wp:posOffset>
@@ -905,7 +1186,7 @@
           </mc:Choice>
           <mc:Fallback>
             <w:pict>
-              <v:shape w14:anchorId="7EDCFD21" id="Text Box 20" o:spid="_x0000_s1030" type="#_x0000_t202" style="position:absolute;margin-left:148.95pt;margin-top:9.65pt;width:172.8pt;height:19.4pt;z-index:251781120;visibility:visible;mso-wrap-style:square;mso-width-percent:0;mso-height-percent:0;mso-wrap-distance-left:9pt;mso-wrap-distance-top:3.6pt;mso-wrap-distance-right:9pt;mso-wrap-distance-bottom:3.6pt;mso-position-horizontal:absolute;mso-position-horizontal-relative:text;mso-position-vertical:absolute;mso-position-vertical-relative:text;mso-width-percent:0;mso-height-percent:0;mso-width-relative:margin;mso-height-relative:margin;v-text-anchor:top" o:gfxdata="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">
+              <v:shape w14:anchorId="7EDCFD21" id="Text Box 20" o:spid="_x0000_s1031" type="#_x0000_t202" style="position:absolute;margin-left:148.95pt;margin-top:9.65pt;width:172.8pt;height:19.4pt;z-index:251781120;visibility:visible;mso-wrap-style:square;mso-width-percent:0;mso-height-percent:0;mso-wrap-distance-left:9pt;mso-wrap-distance-top:3.6pt;mso-wrap-distance-right:9pt;mso-wrap-distance-bottom:3.6pt;mso-position-horizontal:absolute;mso-position-horizontal-relative:text;mso-position-vertical:absolute;mso-position-vertical-relative:text;mso-width-percent:0;mso-height-percent:0;mso-width-relative:margin;mso-height-relative:margin;v-text-anchor:top" o:gfxdata="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">
                 <v:textbox>
                   <w:txbxContent>
                     <w:p>
@@ -1044,7 +1325,7 @@
           </mc:Choice>
           <mc:Fallback>
             <w:pict>
-              <v:shape w14:anchorId="18888D7A" id="_x0000_s1031" type="#_x0000_t202" style="position:absolute;margin-left:-59.6pt;margin-top:10.9pt;width:170.65pt;height:64.15pt;z-index:251766784;visibility:visible;mso-wrap-style:square;mso-width-percent:0;mso-height-percent:0;mso-wrap-distance-left:9pt;mso-wrap-distance-top:3.6pt;mso-wrap-distance-right:9pt;mso-wrap-distance-bottom:3.6pt;mso-position-horizontal:absolute;mso-position-horizontal-relative:text;mso-position-vertical:absolute;mso-position-vertical-relative:text;mso-width-percent:0;mso-height-percent:0;mso-width-relative:margin;mso-height-relative:margin;v-text-anchor:top" o:gfxdata="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">
+              <v:shape w14:anchorId="18888D7A" id="_x0000_s1032" type="#_x0000_t202" style="position:absolute;margin-left:-59.6pt;margin-top:10.9pt;width:170.65pt;height:64.15pt;z-index:251766784;visibility:visible;mso-wrap-style:square;mso-width-percent:0;mso-height-percent:0;mso-wrap-distance-left:9pt;mso-wrap-distance-top:3.6pt;mso-wrap-distance-right:9pt;mso-wrap-distance-bottom:3.6pt;mso-position-horizontal:absolute;mso-position-horizontal-relative:text;mso-position-vertical:absolute;mso-position-vertical-relative:text;mso-width-percent:0;mso-height-percent:0;mso-width-relative:margin;mso-height-relative:margin;v-text-anchor:top" o:gfxdata="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">
                 <v:textbox>
                   <w:txbxContent>
                     <w:p>
@@ -1222,7 +1503,7 @@
           </mc:Choice>
           <mc:Fallback>
             <w:pict>
-              <v:shape w14:anchorId="2DF2C401" id="_x0000_s1032" type="#_x0000_t202" style="position:absolute;margin-left:355.8pt;margin-top:12.55pt;width:170.65pt;height:65.4pt;z-index:251764736;visibility:visible;mso-wrap-style:square;mso-width-percent:0;mso-height-percent:0;mso-wrap-distance-left:9pt;mso-wrap-distance-top:3.6pt;mso-wrap-distance-right:9pt;mso-wrap-distance-bottom:3.6pt;mso-position-horizontal:absolute;mso-position-horizontal-relative:text;mso-position-vertical:absolute;mso-position-vertical-relative:text;mso-width-percent:0;mso-height-percent:0;mso-width-relative:margin;mso-height-relative:margin;v-text-anchor:top" o:gfxdata="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">
+              <v:shape w14:anchorId="2DF2C401" id="_x0000_s1033" type="#_x0000_t202" style="position:absolute;margin-left:355.8pt;margin-top:12.55pt;width:170.65pt;height:65.4pt;z-index:251764736;visibility:visible;mso-wrap-style:square;mso-width-percent:0;mso-height-percent:0;mso-wrap-distance-left:9pt;mso-wrap-distance-top:3.6pt;mso-wrap-distance-right:9pt;mso-wrap-distance-bottom:3.6pt;mso-position-horizontal:absolute;mso-position-horizontal-relative:text;mso-position-vertical:absolute;mso-position-vertical-relative:text;mso-width-percent:0;mso-height-percent:0;mso-width-relative:margin;mso-height-relative:margin;v-text-anchor:top" o:gfxdata="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">
                 <v:textbox>
                   <w:txbxContent>
                     <w:p>
@@ -1786,7 +2067,7 @@
           </mc:Choice>
           <mc:Fallback>
             <w:pict>
-              <v:shape w14:anchorId="66709996" id="_x0000_s1033" type="#_x0000_t202" style="position:absolute;margin-left:162.85pt;margin-top:83.95pt;width:169.8pt;height:32.8pt;z-index:251768832;visibility:visible;mso-wrap-style:square;mso-width-percent:0;mso-height-percent:0;mso-wrap-distance-left:9pt;mso-wrap-distance-top:3.6pt;mso-wrap-distance-right:9pt;mso-wrap-distance-bottom:3.6pt;mso-position-horizontal:absolute;mso-position-horizontal-relative:margin;mso-position-vertical:absolute;mso-position-vertical-relative:text;mso-width-percent:0;mso-height-percent:0;mso-width-relative:margin;mso-height-relative:margin;v-text-anchor:top" o:gfxdata="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">
+              <v:shape w14:anchorId="66709996" id="_x0000_s1034" type="#_x0000_t202" style="position:absolute;margin-left:162.85pt;margin-top:83.95pt;width:169.8pt;height:32.8pt;z-index:251768832;visibility:visible;mso-wrap-style:square;mso-width-percent:0;mso-height-percent:0;mso-wrap-distance-left:9pt;mso-wrap-distance-top:3.6pt;mso-wrap-distance-right:9pt;mso-wrap-distance-bottom:3.6pt;mso-position-horizontal:absolute;mso-position-horizontal-relative:margin;mso-position-vertical:absolute;mso-position-vertical-relative:text;mso-width-percent:0;mso-height-percent:0;mso-width-relative:margin;mso-height-relative:margin;v-text-anchor:top" o:gfxdata="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">
                 <v:textbox>
                   <w:txbxContent>
                     <w:p>
@@ -1992,7 +2273,7 @@
           </mc:Choice>
           <mc:Fallback>
             <w:pict>
-              <v:shape w14:anchorId="6B7A4D0B" id="_x0000_s1034" type="#_x0000_t202" style="position:absolute;margin-left:0;margin-top:231.35pt;width:84.15pt;height:34.35pt;z-index:251772928;visibility:visible;mso-wrap-style:square;mso-width-percent:0;mso-height-percent:0;mso-wrap-distance-left:9pt;mso-wrap-distance-top:3.6pt;mso-wrap-distance-right:9pt;mso-wrap-distance-bottom:3.6pt;mso-position-horizontal:center;mso-position-horizontal-relative:margin;mso-position-vertical:absolute;mso-position-vertical-relative:text;mso-width-percent:0;mso-height-percent:0;mso-width-relative:margin;mso-height-relative:margin;v-text-anchor:top" o:gfxdata="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">
+              <v:shape w14:anchorId="6B7A4D0B" id="_x0000_s1035" type="#_x0000_t202" style="position:absolute;margin-left:0;margin-top:231.35pt;width:84.15pt;height:34.35pt;z-index:251772928;visibility:visible;mso-wrap-style:square;mso-width-percent:0;mso-height-percent:0;mso-wrap-distance-left:9pt;mso-wrap-distance-top:3.6pt;mso-wrap-distance-right:9pt;mso-wrap-distance-bottom:3.6pt;mso-position-horizontal:center;mso-position-horizontal-relative:margin;mso-position-vertical:absolute;mso-position-vertical-relative:text;mso-width-percent:0;mso-height-percent:0;mso-width-relative:margin;mso-height-relative:margin;v-text-anchor:top" o:gfxdata="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">
                 <v:textbox>
                   <w:txbxContent>
                     <w:p>
@@ -2252,17 +2533,7 @@
           <w:sz w:val="24"/>
           <w:szCs w:val="24"/>
         </w:rPr>
-        <w:t xml:space="preserve"> initial data table wit</w:t>
-      </w:r>
-      <w:bookmarkStart w:id="0" w:name="_GoBack"/>
-      <w:bookmarkEnd w:id="0"/>
-      <w:r>
-        <w:rPr>
-          <w:rFonts w:ascii="Goudy Old Style" w:hAnsi="Goudy Old Style" w:cs="Times New Roman"/>
-          <w:sz w:val="24"/>
-          <w:szCs w:val="24"/>
-        </w:rPr>
-        <w:t>h two extra columns:</w:t>
+        <w:t xml:space="preserve"> initial data table with two extra columns:</w:t>
       </w:r>
       <w:r>
         <w:rPr>
@@ -2280,16 +2551,6 @@
         </w:rPr>
         <w:t>, as well as path taken through the function</w:t>
       </w:r>
-    </w:p>
-    <w:p>
-      <w:pPr>
-        <w:contextualSpacing/>
-        <w:rPr>
-          <w:rFonts w:ascii="Goudy Old Style" w:hAnsi="Goudy Old Style" w:cs="Times New Roman"/>
-          <w:sz w:val="24"/>
-          <w:szCs w:val="24"/>
-        </w:rPr>
-      </w:pPr>
     </w:p>
     <w:p>
       <w:pPr>
@@ -3362,6 +3623,42 @@
           <w:szCs w:val="24"/>
         </w:rPr>
       </w:pPr>
+      <w:proofErr w:type="spellStart"/>
+      <w:r>
+        <w:rPr>
+          <w:rFonts w:ascii="Goudy Old Style" w:hAnsi="Goudy Old Style" w:cs="Times New Roman"/>
+          <w:sz w:val="24"/>
+          <w:szCs w:val="24"/>
+        </w:rPr>
+        <w:t>equation_</w:t>
+      </w:r>
+      <w:proofErr w:type="gramStart"/>
+      <w:r>
+        <w:rPr>
+          <w:rFonts w:ascii="Goudy Old Style" w:hAnsi="Goudy Old Style" w:cs="Times New Roman"/>
+          <w:sz w:val="24"/>
+          <w:szCs w:val="24"/>
+        </w:rPr>
+        <w:t>finder</w:t>
+      </w:r>
+      <w:proofErr w:type="spellEnd"/>
+      <w:r>
+        <w:rPr>
+          <w:rFonts w:ascii="Goudy Old Style" w:hAnsi="Goudy Old Style" w:cs="Times New Roman"/>
+          <w:sz w:val="24"/>
+          <w:szCs w:val="24"/>
+        </w:rPr>
+        <w:t>(</w:t>
+      </w:r>
+      <w:proofErr w:type="gramEnd"/>
+      <w:r>
+        <w:rPr>
+          <w:rFonts w:ascii="Goudy Old Style" w:hAnsi="Goudy Old Style" w:cs="Times New Roman"/>
+          <w:sz w:val="24"/>
+          <w:szCs w:val="24"/>
+        </w:rPr>
+        <w:t>size, row, exception)</w:t>
+      </w:r>
     </w:p>
     <w:p>
       <w:pPr>
@@ -3372,6 +3669,62 @@
           <w:szCs w:val="24"/>
         </w:rPr>
       </w:pPr>
+      <w:r>
+        <w:rPr>
+          <w:rFonts w:ascii="Goudy Old Style" w:hAnsi="Goudy Old Style" w:cs="Times New Roman"/>
+          <w:sz w:val="24"/>
+          <w:szCs w:val="24"/>
+        </w:rPr>
+        <w:sym w:font="Wingdings" w:char="F0E0"/>
+      </w:r>
+      <w:r>
+        <w:rPr>
+          <w:rFonts w:ascii="Goudy Old Style" w:hAnsi="Goudy Old Style" w:cs="Times New Roman"/>
+          <w:sz w:val="24"/>
+          <w:szCs w:val="24"/>
+        </w:rPr>
+        <w:t xml:space="preserve"> called when biomass computation happens because some equations are in log10 format</w:t>
+      </w:r>
+      <w:r>
+        <w:rPr>
+          <w:rFonts w:ascii="Goudy Old Style" w:hAnsi="Goudy Old Style" w:cs="Times New Roman"/>
+          <w:sz w:val="24"/>
+          <w:szCs w:val="24"/>
+        </w:rPr>
+        <w:t xml:space="preserve"> (log10(biomass) = slope x log10(size) + intercept)</w:t>
+      </w:r>
+      <w:r>
+        <w:rPr>
+          <w:rFonts w:ascii="Goudy Old Style" w:hAnsi="Goudy Old Style" w:cs="Times New Roman"/>
+          <w:sz w:val="24"/>
+          <w:szCs w:val="24"/>
+        </w:rPr>
+        <w:t>, others in ln format</w:t>
+      </w:r>
+      <w:r>
+        <w:rPr>
+          <w:rFonts w:ascii="Goudy Old Style" w:hAnsi="Goudy Old Style" w:cs="Times New Roman"/>
+          <w:sz w:val="24"/>
+          <w:szCs w:val="24"/>
+        </w:rPr>
+        <w:t xml:space="preserve"> (</w:t>
+      </w:r>
+      <w:r>
+        <w:rPr>
+          <w:rFonts w:ascii="Goudy Old Style" w:hAnsi="Goudy Old Style" w:cs="Times New Roman"/>
+          <w:sz w:val="24"/>
+          <w:szCs w:val="24"/>
+        </w:rPr>
+        <w:t xml:space="preserve">ln(biomass) = </w:t>
+      </w:r>
+      <w:r>
+        <w:rPr>
+          <w:rFonts w:ascii="Goudy Old Style" w:hAnsi="Goudy Old Style" w:cs="Times New Roman"/>
+          <w:sz w:val="24"/>
+          <w:szCs w:val="24"/>
+        </w:rPr>
+        <w:t>slope x ln(size) + ln(intercept))</w:t>
+      </w:r>
     </w:p>
     <w:p>
       <w:pPr>
@@ -3382,36 +3735,39 @@
           <w:szCs w:val="24"/>
         </w:rPr>
       </w:pPr>
-    </w:p>
-    <w:p>
-      <w:pPr>
-        <w:contextualSpacing/>
-        <w:rPr>
-          <w:rFonts w:ascii="Goudy Old Style" w:hAnsi="Goudy Old Style" w:cs="Times New Roman"/>
-          <w:sz w:val="24"/>
-          <w:szCs w:val="24"/>
-        </w:rPr>
-      </w:pPr>
-    </w:p>
-    <w:p>
-      <w:pPr>
-        <w:contextualSpacing/>
-        <w:rPr>
-          <w:rFonts w:ascii="Goudy Old Style" w:hAnsi="Goudy Old Style" w:cs="Times New Roman"/>
-          <w:sz w:val="24"/>
-          <w:szCs w:val="24"/>
-        </w:rPr>
-      </w:pPr>
-    </w:p>
-    <w:p>
-      <w:pPr>
-        <w:contextualSpacing/>
-        <w:rPr>
-          <w:rFonts w:ascii="Goudy Old Style" w:hAnsi="Goudy Old Style" w:cs="Times New Roman"/>
-          <w:sz w:val="24"/>
-          <w:szCs w:val="24"/>
-        </w:rPr>
-      </w:pPr>
+      <w:r>
+        <w:rPr>
+          <w:rFonts w:ascii="Goudy Old Style" w:hAnsi="Goudy Old Style" w:cs="Times New Roman"/>
+          <w:sz w:val="24"/>
+          <w:szCs w:val="24"/>
+        </w:rPr>
+        <w:sym w:font="Wingdings" w:char="F0E0"/>
+      </w:r>
+      <w:r>
+        <w:rPr>
+          <w:rFonts w:ascii="Goudy Old Style" w:hAnsi="Goudy Old Style" w:cs="Times New Roman"/>
+          <w:sz w:val="24"/>
+          <w:szCs w:val="24"/>
+        </w:rPr>
+        <w:t xml:space="preserve"> has an exception argument, so far used for Acari, because equation used generates weight in micrograms, not milligrams (argument controls the conversion)</w:t>
+      </w:r>
+    </w:p>
+    <w:p>
+      <w:pPr>
+        <w:rPr>
+          <w:rFonts w:ascii="Goudy Old Style" w:hAnsi="Goudy Old Style" w:cs="Times New Roman"/>
+          <w:sz w:val="24"/>
+          <w:szCs w:val="24"/>
+        </w:rPr>
+      </w:pPr>
+      <w:r>
+        <w:rPr>
+          <w:rFonts w:ascii="Goudy Old Style" w:hAnsi="Goudy Old Style" w:cs="Times New Roman"/>
+          <w:sz w:val="24"/>
+          <w:szCs w:val="24"/>
+        </w:rPr>
+        <w:br w:type="page"/>
+      </w:r>
     </w:p>
     <w:p>
       <w:pPr>
@@ -4484,7 +4840,6 @@
   <w:style w:type="character" w:default="1" w:styleId="DefaultParagraphFont">
     <w:name w:val="Default Paragraph Font"/>
     <w:uiPriority w:val="1"/>
-    <w:semiHidden/>
     <w:unhideWhenUsed/>
   </w:style>
   <w:style w:type="table" w:default="1" w:styleId="TableNormal">
@@ -4950,7 +5305,7 @@
 </file>
 
 <file path=customXml/itemProps1.xml><?xml version="1.0" encoding="utf-8"?>
-<ds:datastoreItem xmlns:ds="http://schemas.openxmlformats.org/officeDocument/2006/customXml" ds:itemID="{8577FEB2-25DC-41A8-A4DE-C3BDA57D2E20}">
+<ds:datastoreItem xmlns:ds="http://schemas.openxmlformats.org/officeDocument/2006/customXml" ds:itemID="{11C8348E-F29F-4018-9715-E6AD12393645}">
   <ds:schemaRefs>
     <ds:schemaRef ds:uri="http://schemas.openxmlformats.org/officeDocument/2006/bibliography"/>
   </ds:schemaRefs>

</xml_diff>

<commit_message>
updated code to fit new input organisation, added data to data folder
</commit_message>
<xml_diff>
--- a/allometry_flowchart.docx
+++ b/allometry_flowchart.docx
@@ -120,12 +120,13 @@
                             <w:r>
                               <w:t>(</w:t>
                             </w:r>
-                            <w:proofErr w:type="spellStart"/>
                             <w:proofErr w:type="gramEnd"/>
                             <w:r>
-                              <w:t>allometry_table</w:t>
+                              <w:t>allometry</w:t>
                             </w:r>
-                            <w:proofErr w:type="spellEnd"/>
+                            <w:r>
+                              <w:t xml:space="preserve"> data</w:t>
+                            </w:r>
                             <w:r>
                               <w:t xml:space="preserve">, </w:t>
                             </w:r>
@@ -169,34 +170,14 @@
                       <w:pPr>
                         <w:jc w:val="center"/>
                       </w:pPr>
-                      <w:proofErr w:type="spellStart"/>
                       <w:r>
-                        <w:t>hello_</w:t>
+                        <w:t>hello_metry(allometry</w:t>
                       </w:r>
-                      <w:proofErr w:type="gramStart"/>
                       <w:r>
-                        <w:t>metry</w:t>
+                        <w:t xml:space="preserve"> data</w:t>
                       </w:r>
-                      <w:proofErr w:type="spellEnd"/>
                       <w:r>
-                        <w:t>(</w:t>
-                      </w:r>
-                      <w:proofErr w:type="spellStart"/>
-                      <w:proofErr w:type="gramEnd"/>
-                      <w:r>
-                        <w:t>allometry_table</w:t>
-                      </w:r>
-                      <w:proofErr w:type="spellEnd"/>
-                      <w:r>
-                        <w:t xml:space="preserve">, </w:t>
-                      </w:r>
-                      <w:proofErr w:type="spellStart"/>
-                      <w:r>
-                        <w:t>data_table</w:t>
-                      </w:r>
-                      <w:proofErr w:type="spellEnd"/>
-                      <w:r>
-                        <w:t>)</w:t>
+                        <w:t>, data_table)</w:t>
                       </w:r>
                     </w:p>
                     <w:p/>
@@ -305,8 +286,6 @@
           <w:szCs w:val="24"/>
         </w:rPr>
       </w:pPr>
-      <w:bookmarkStart w:id="0" w:name="_GoBack"/>
-      <w:bookmarkEnd w:id="0"/>
       <w:r>
         <w:rPr>
           <w:rFonts w:ascii="Goudy Old Style" w:hAnsi="Goudy Old Style" w:cs="Times New Roman"/>
@@ -485,10 +464,7 @@
                             </w:r>
                             <w:proofErr w:type="gramEnd"/>
                             <w:r>
-                              <w:t>size, row, exception</w:t>
-                            </w:r>
-                            <w:r>
-                              <w:t>)</w:t>
+                              <w:t>size, row, exception)</w:t>
                             </w:r>
                           </w:p>
                         </w:txbxContent>
@@ -514,24 +490,8 @@
                 <v:textbox>
                   <w:txbxContent>
                     <w:p>
-                      <w:proofErr w:type="spellStart"/>
                       <w:r>
-                        <w:t>equation_</w:t>
-                      </w:r>
-                      <w:proofErr w:type="gramStart"/>
-                      <w:r>
-                        <w:t>finder</w:t>
-                      </w:r>
-                      <w:proofErr w:type="spellEnd"/>
-                      <w:r>
-                        <w:t>(</w:t>
-                      </w:r>
-                      <w:proofErr w:type="gramEnd"/>
-                      <w:r>
-                        <w:t>size, row, exception</w:t>
-                      </w:r>
-                      <w:r>
-                        <w:t>)</w:t>
+                        <w:t>equation_finder(size, row, exception)</w:t>
                       </w:r>
                     </w:p>
                   </w:txbxContent>
@@ -1296,11 +1256,12 @@
                             <w:r>
                               <w:t xml:space="preserve">, </w:t>
                             </w:r>
-                            <w:proofErr w:type="spellStart"/>
                             <w:r>
-                              <w:t>allometry_table</w:t>
+                              <w:t>allometry</w:t>
                             </w:r>
-                            <w:proofErr w:type="spellEnd"/>
+                            <w:r>
+                              <w:t xml:space="preserve"> data</w:t>
+                            </w:r>
                             <w:r>
                               <w:t>)</w:t>
                             </w:r>
@@ -1332,49 +1293,21 @@
                       <w:pPr>
                         <w:jc w:val="center"/>
                       </w:pPr>
-                      <w:proofErr w:type="spellStart"/>
                       <w:r>
-                        <w:t>get_allometric_equations</w:t>
-                      </w:r>
-                      <w:proofErr w:type="spellEnd"/>
-                      <w:r>
-                        <w:t xml:space="preserve"> </w:t>
+                        <w:t xml:space="preserve">get_allometric_equations </w:t>
                       </w:r>
                       <w:r>
-                        <w:t>(</w:t>
-                      </w:r>
-                      <w:proofErr w:type="spellStart"/>
-                      <w:r>
-                        <w:t>species_name</w:t>
-                      </w:r>
-                      <w:proofErr w:type="spellEnd"/>
-                      <w:r>
-                        <w:t xml:space="preserve">, </w:t>
-                      </w:r>
-                      <w:proofErr w:type="spellStart"/>
-                      <w:r>
-                        <w:t>taxonomic_level</w:t>
-                      </w:r>
-                      <w:proofErr w:type="spellEnd"/>
-                      <w:r>
-                        <w:t xml:space="preserve">, size, </w:t>
-                      </w:r>
-                      <w:proofErr w:type="gramStart"/>
-                      <w:r>
-                        <w:t xml:space="preserve">abundance, </w:t>
+                        <w:t xml:space="preserve">(species_name, taxonomic_level, size, abundance, </w:t>
                       </w:r>
                       <w:r>
-                        <w:t xml:space="preserve"> path</w:t>
+                        <w:t xml:space="preserve"> path, </w:t>
                       </w:r>
-                      <w:proofErr w:type="gramEnd"/>
                       <w:r>
-                        <w:t xml:space="preserve">, </w:t>
+                        <w:t>allometry</w:t>
                       </w:r>
-                      <w:proofErr w:type="spellStart"/>
                       <w:r>
-                        <w:t>allometry_table</w:t>
+                        <w:t xml:space="preserve"> data</w:t>
                       </w:r>
-                      <w:proofErr w:type="spellEnd"/>
                       <w:r>
                         <w:t>)</w:t>
                       </w:r>
@@ -1466,11 +1399,12 @@
                             <w:r>
                               <w:t xml:space="preserve">path, </w:t>
                             </w:r>
-                            <w:proofErr w:type="spellStart"/>
                             <w:r>
-                              <w:t>allometry_table</w:t>
+                              <w:t>allometry</w:t>
                             </w:r>
-                            <w:proofErr w:type="spellEnd"/>
+                            <w:r>
+                              <w:t xml:space="preserve"> data</w:t>
+                            </w:r>
                             <w:r>
                               <w:t xml:space="preserve">, </w:t>
                             </w:r>
@@ -1510,42 +1444,20 @@
                       <w:pPr>
                         <w:jc w:val="center"/>
                       </w:pPr>
-                      <w:proofErr w:type="spellStart"/>
-                      <w:proofErr w:type="gramStart"/>
                       <w:r>
-                        <w:t>sizest</w:t>
-                      </w:r>
-                      <w:proofErr w:type="spellEnd"/>
-                      <w:r>
-                        <w:t>(</w:t>
-                      </w:r>
-                      <w:proofErr w:type="spellStart"/>
-                      <w:proofErr w:type="gramEnd"/>
-                      <w:r>
-                        <w:t>species_name</w:t>
-                      </w:r>
-                      <w:proofErr w:type="spellEnd"/>
-                      <w:r>
-                        <w:t xml:space="preserve">, size, </w:t>
+                        <w:t xml:space="preserve">sizest(species_name, size, </w:t>
                       </w:r>
                       <w:r>
                         <w:t xml:space="preserve">path, </w:t>
                       </w:r>
-                      <w:proofErr w:type="spellStart"/>
                       <w:r>
-                        <w:t>allometry_table</w:t>
+                        <w:t>allometry</w:t>
                       </w:r>
-                      <w:proofErr w:type="spellEnd"/>
                       <w:r>
-                        <w:t xml:space="preserve">, </w:t>
+                        <w:t xml:space="preserve"> data</w:t>
                       </w:r>
-                      <w:proofErr w:type="spellStart"/>
                       <w:r>
-                        <w:t>data_table</w:t>
-                      </w:r>
-                      <w:proofErr w:type="spellEnd"/>
-                      <w:r>
-                        <w:t>)</w:t>
+                        <w:t>, data_table)</w:t>
                       </w:r>
                     </w:p>
                     <w:p/>
@@ -2037,15 +1949,10 @@
                             </w:r>
                             <w:proofErr w:type="spellEnd"/>
                             <w:r>
-                              <w:t xml:space="preserve">, </w:t>
+                              <w:t>, allometry</w:t>
                             </w:r>
-                            <w:proofErr w:type="spellStart"/>
                             <w:r>
-                              <w:t>allometry_table</w:t>
-                            </w:r>
-                            <w:proofErr w:type="spellEnd"/>
-                            <w:r>
-                              <w:t>)</w:t>
+                              <w:t xml:space="preserve"> data)</w:t>
                             </w:r>
                           </w:p>
                         </w:txbxContent>
@@ -2071,35 +1978,14 @@
                 <v:textbox>
                   <w:txbxContent>
                     <w:p>
-                      <w:proofErr w:type="spellStart"/>
                       <w:r>
-                        <w:t>matcher_of_</w:t>
+                        <w:t>matcher_of_traits(species_name, allometry</w:t>
                       </w:r>
-                      <w:proofErr w:type="gramStart"/>
                       <w:r>
-                        <w:t>traits</w:t>
+                        <w:t xml:space="preserve"> data)</w:t>
                       </w:r>
-                      <w:proofErr w:type="spellEnd"/>
-                      <w:r>
-                        <w:t>(</w:t>
-                      </w:r>
-                      <w:proofErr w:type="spellStart"/>
-                      <w:proofErr w:type="gramEnd"/>
-                      <w:r>
-                        <w:t>species_name</w:t>
-                      </w:r>
-                      <w:proofErr w:type="spellEnd"/>
-                      <w:r>
-                        <w:t xml:space="preserve">, </w:t>
-                      </w:r>
-                      <w:proofErr w:type="spellStart"/>
-                      <w:r>
-                        <w:t>allometry_table</w:t>
-                      </w:r>
-                      <w:proofErr w:type="spellEnd"/>
-                      <w:r>
-                        <w:t>)</w:t>
-                      </w:r>
+                      <w:bookmarkStart w:id="1" w:name="_GoBack"/>
+                      <w:bookmarkEnd w:id="1"/>
                     </w:p>
                   </w:txbxContent>
                 </v:textbox>
@@ -2462,7 +2348,25 @@
           <w:sz w:val="24"/>
           <w:szCs w:val="24"/>
         </w:rPr>
-        <w:t>allometry_table</w:t>
+        <w:t>equation_table</w:t>
+      </w:r>
+      <w:proofErr w:type="spellEnd"/>
+      <w:r>
+        <w:rPr>
+          <w:rFonts w:ascii="Goudy Old Style" w:hAnsi="Goudy Old Style" w:cs="Times New Roman"/>
+          <w:sz w:val="24"/>
+          <w:szCs w:val="24"/>
+        </w:rPr>
+        <w:t xml:space="preserve">, </w:t>
+      </w:r>
+      <w:proofErr w:type="spellStart"/>
+      <w:r>
+        <w:rPr>
+          <w:rFonts w:ascii="Goudy Old Style" w:hAnsi="Goudy Old Style" w:cs="Times New Roman"/>
+          <w:sz w:val="24"/>
+          <w:szCs w:val="24"/>
+        </w:rPr>
+        <w:t>measurement_table</w:t>
       </w:r>
       <w:proofErr w:type="spellEnd"/>
       <w:r>
@@ -2644,7 +2548,25 @@
           <w:sz w:val="24"/>
           <w:szCs w:val="24"/>
         </w:rPr>
-        <w:t>allometry_table</w:t>
+        <w:t>equation_table</w:t>
+      </w:r>
+      <w:proofErr w:type="spellEnd"/>
+      <w:r>
+        <w:rPr>
+          <w:rFonts w:ascii="Goudy Old Style" w:hAnsi="Goudy Old Style" w:cs="Times New Roman"/>
+          <w:sz w:val="24"/>
+          <w:szCs w:val="24"/>
+        </w:rPr>
+        <w:t xml:space="preserve">, </w:t>
+      </w:r>
+      <w:proofErr w:type="spellStart"/>
+      <w:r>
+        <w:rPr>
+          <w:rFonts w:ascii="Goudy Old Style" w:hAnsi="Goudy Old Style" w:cs="Times New Roman"/>
+          <w:sz w:val="24"/>
+          <w:szCs w:val="24"/>
+        </w:rPr>
+        <w:t>measurement_table</w:t>
       </w:r>
       <w:proofErr w:type="spellEnd"/>
       <w:r>
@@ -3098,7 +3020,25 @@
           <w:sz w:val="24"/>
           <w:szCs w:val="24"/>
         </w:rPr>
-        <w:t>allometry_table</w:t>
+        <w:t>equation_table</w:t>
+      </w:r>
+      <w:proofErr w:type="spellEnd"/>
+      <w:r>
+        <w:rPr>
+          <w:rFonts w:ascii="Goudy Old Style" w:hAnsi="Goudy Old Style" w:cs="Times New Roman"/>
+          <w:sz w:val="24"/>
+          <w:szCs w:val="24"/>
+        </w:rPr>
+        <w:t xml:space="preserve">, </w:t>
+      </w:r>
+      <w:proofErr w:type="spellStart"/>
+      <w:r>
+        <w:rPr>
+          <w:rFonts w:ascii="Goudy Old Style" w:hAnsi="Goudy Old Style" w:cs="Times New Roman"/>
+          <w:sz w:val="24"/>
+          <w:szCs w:val="24"/>
+        </w:rPr>
+        <w:t>measurement_table</w:t>
       </w:r>
       <w:proofErr w:type="spellEnd"/>
       <w:r>
@@ -3348,7 +3288,15 @@
           <w:sz w:val="24"/>
           <w:szCs w:val="24"/>
         </w:rPr>
-        <w:t>allometry_table</w:t>
+        <w:t>measurement</w:t>
+      </w:r>
+      <w:r>
+        <w:rPr>
+          <w:rFonts w:ascii="Goudy Old Style" w:hAnsi="Goudy Old Style" w:cs="Times New Roman"/>
+          <w:sz w:val="24"/>
+          <w:szCs w:val="24"/>
+        </w:rPr>
+        <w:t>_table</w:t>
       </w:r>
       <w:proofErr w:type="spellEnd"/>
       <w:r>
@@ -3657,7 +3605,25 @@
           <w:sz w:val="24"/>
           <w:szCs w:val="24"/>
         </w:rPr>
-        <w:t>size, row, exception)</w:t>
+        <w:t xml:space="preserve">size, row, </w:t>
+      </w:r>
+      <w:proofErr w:type="spellStart"/>
+      <w:r>
+        <w:rPr>
+          <w:rFonts w:ascii="Goudy Old Style" w:hAnsi="Goudy Old Style" w:cs="Times New Roman"/>
+          <w:sz w:val="24"/>
+          <w:szCs w:val="24"/>
+        </w:rPr>
+        <w:t>measurement_tables</w:t>
+      </w:r>
+      <w:proofErr w:type="spellEnd"/>
+      <w:r>
+        <w:rPr>
+          <w:rFonts w:ascii="Goudy Old Style" w:hAnsi="Goudy Old Style" w:cs="Times New Roman"/>
+          <w:sz w:val="24"/>
+          <w:szCs w:val="24"/>
+        </w:rPr>
+        <w:t>)</w:t>
       </w:r>
     </w:p>
     <w:p>
@@ -3766,6 +3732,7 @@
           <w:sz w:val="24"/>
           <w:szCs w:val="24"/>
         </w:rPr>
+        <w:lastRenderedPageBreak/>
         <w:br w:type="page"/>
       </w:r>
     </w:p>
@@ -4377,6 +4344,8 @@
         </w:rPr>
         <w:t>_5_BM:bwg_name_1</w:t>
       </w:r>
+      <w:bookmarkStart w:id="0" w:name="_GoBack"/>
+      <w:bookmarkEnd w:id="0"/>
     </w:p>
     <w:sectPr>
       <w:pgSz w:w="12240" w:h="15840"/>
@@ -4840,6 +4809,7 @@
   <w:style w:type="character" w:default="1" w:styleId="DefaultParagraphFont">
     <w:name w:val="Default Paragraph Font"/>
     <w:uiPriority w:val="1"/>
+    <w:semiHidden/>
     <w:unhideWhenUsed/>
   </w:style>
   <w:style w:type="table" w:default="1" w:styleId="TableNormal">
@@ -5305,7 +5275,7 @@
 </file>
 
 <file path=customXml/itemProps1.xml><?xml version="1.0" encoding="utf-8"?>
-<ds:datastoreItem xmlns:ds="http://schemas.openxmlformats.org/officeDocument/2006/customXml" ds:itemID="{11C8348E-F29F-4018-9715-E6AD12393645}">
+<ds:datastoreItem xmlns:ds="http://schemas.openxmlformats.org/officeDocument/2006/customXml" ds:itemID="{509CA38B-C367-44B2-A39F-26EEDFA0E7FC}">
   <ds:schemaRefs>
     <ds:schemaRef ds:uri="http://schemas.openxmlformats.org/officeDocument/2006/bibliography"/>
   </ds:schemaRefs>

</xml_diff>

<commit_message>
forgot to save before pushing...
</commit_message>
<xml_diff>
--- a/allometry_flowchart.docx
+++ b/allometry_flowchart.docx
@@ -1944,7 +1944,7 @@
           </mc:Choice>
           <mc:Fallback>
             <w:pict>
-              <v:line w14:anchorId="51FC09D3" id="Straight Connector 45" o:spid="_x0000_s1026" style="position:absolute;z-index:251774976;visibility:visible;mso-wrap-style:square;mso-width-percent:0;mso-height-percent:0;mso-wrap-distance-left:9pt;mso-wrap-distance-top:0;mso-wrap-distance-right:9pt;mso-wrap-distance-bottom:0;mso-position-horizontal:absolute;mso-position-horizontal-relative:text;mso-position-vertical:absolute;mso-position-vertical-relative:text;mso-width-percent:0;mso-height-percent:0;mso-width-relative:margin;mso-height-relative:margin" from="22.5pt,43.85pt" to="212.05pt,223.4pt" o:gfxdata="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" strokecolor="black [3200]" strokeweight=".5pt">
+              <v:line w14:anchorId="7228CC3E" id="Straight Connector 45" o:spid="_x0000_s1026" style="position:absolute;z-index:251774976;visibility:visible;mso-wrap-style:square;mso-width-percent:0;mso-height-percent:0;mso-wrap-distance-left:9pt;mso-wrap-distance-top:0;mso-wrap-distance-right:9pt;mso-wrap-distance-bottom:0;mso-position-horizontal:absolute;mso-position-horizontal-relative:text;mso-position-vertical:absolute;mso-position-vertical-relative:text;mso-width-percent:0;mso-height-percent:0;mso-width-relative:margin;mso-height-relative:margin" from="22.5pt,43.85pt" to="212.05pt,223.4pt" o:gfxdata="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" strokecolor="black [3200]" strokeweight=".5pt">
                 <v:stroke endarrow="classic" endarrowwidth="wide" endarrowlength="long" joinstyle="miter"/>
               </v:line>
             </w:pict>
@@ -2251,7 +2251,7 @@
           </mc:Choice>
           <mc:Fallback>
             <w:pict>
-              <v:line w14:anchorId="2173DB6E" id="Straight Connector 30" o:spid="_x0000_s1026" style="position:absolute;flip:y;z-index:251785216;visibility:visible;mso-wrap-style:square;mso-width-percent:0;mso-height-percent:0;mso-wrap-distance-left:9pt;mso-wrap-distance-top:0;mso-wrap-distance-right:9pt;mso-wrap-distance-bottom:0;mso-position-horizontal:absolute;mso-position-horizontal-relative:page;mso-position-vertical:absolute;mso-position-vertical-relative:text;mso-width-percent:0;mso-height-percent:0;mso-width-relative:margin;mso-height-relative:margin" from="411.35pt,36.8pt" to="508.4pt,94.85pt" o:gfxdata="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" strokecolor="black [3200]" strokeweight=".5pt">
+              <v:line w14:anchorId="6FE9E400" id="Straight Connector 30" o:spid="_x0000_s1026" style="position:absolute;flip:y;z-index:251785216;visibility:visible;mso-wrap-style:square;mso-width-percent:0;mso-height-percent:0;mso-wrap-distance-left:9pt;mso-wrap-distance-top:0;mso-wrap-distance-right:9pt;mso-wrap-distance-bottom:0;mso-position-horizontal:absolute;mso-position-horizontal-relative:page;mso-position-vertical:absolute;mso-position-vertical-relative:text;mso-width-percent:0;mso-height-percent:0;mso-width-relative:margin;mso-height-relative:margin" from="411.35pt,36.8pt" to="508.4pt,94.85pt" o:gfxdata="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" strokecolor="black [3200]" strokeweight=".5pt">
                 <v:stroke endarrow="classic" endarrowwidth="wide" endarrowlength="long" joinstyle="miter"/>
                 <w10:wrap anchorx="page"/>
               </v:line>
@@ -2384,8 +2384,6 @@
         </w:rPr>
         <w:t xml:space="preserve"> </w:t>
       </w:r>
-      <w:bookmarkStart w:id="0" w:name="_GoBack"/>
-      <w:bookmarkEnd w:id="0"/>
       <w:r>
         <w:rPr>
           <w:rFonts w:ascii="Goudy Old Style" w:hAnsi="Goudy Old Style" w:cs="Times New Roman"/>
@@ -2869,7 +2867,15 @@
           <w:sz w:val="24"/>
           <w:szCs w:val="24"/>
         </w:rPr>
-        <w:t>allometry and data tables. Look for at least three distinct numeric measurements in</w:t>
+        <w:t>measurement</w:t>
+      </w:r>
+      <w:r>
+        <w:rPr>
+          <w:rFonts w:ascii="Goudy Old Style" w:hAnsi="Goudy Old Style" w:cs="Times New Roman"/>
+          <w:sz w:val="24"/>
+          <w:szCs w:val="24"/>
+        </w:rPr>
+        <w:t xml:space="preserve"> and data tables. Look for at least three distinct numeric measurements in</w:t>
       </w:r>
       <w:r>
         <w:rPr>
@@ -2885,7 +2891,15 @@
           <w:sz w:val="24"/>
           <w:szCs w:val="24"/>
         </w:rPr>
-        <w:t xml:space="preserve"> the following order: species to family, traits, suborder to class</w:t>
+        <w:t xml:space="preserve"> the following order: species to family, traits, suborder to </w:t>
+      </w:r>
+      <w:r>
+        <w:rPr>
+          <w:rFonts w:ascii="Goudy Old Style" w:hAnsi="Goudy Old Style" w:cs="Times New Roman"/>
+          <w:sz w:val="24"/>
+          <w:szCs w:val="24"/>
+        </w:rPr>
+        <w:t>phylum</w:t>
       </w:r>
       <w:r>
         <w:rPr>
@@ -3313,7 +3327,15 @@
           <w:sz w:val="24"/>
           <w:szCs w:val="24"/>
         </w:rPr>
-        <w:t xml:space="preserve"> the following order: species to family, traits, suborder to class</w:t>
+        <w:t xml:space="preserve"> the following order: species to family, traits, suborder to </w:t>
+      </w:r>
+      <w:r>
+        <w:rPr>
+          <w:rFonts w:ascii="Goudy Old Style" w:hAnsi="Goudy Old Style" w:cs="Times New Roman"/>
+          <w:sz w:val="24"/>
+          <w:szCs w:val="24"/>
+        </w:rPr>
+        <w:t>phylum</w:t>
       </w:r>
     </w:p>
     <w:p>
@@ -3751,6 +3773,8 @@
           <w:szCs w:val="24"/>
         </w:rPr>
       </w:pPr>
+      <w:bookmarkStart w:id="0" w:name="_GoBack"/>
+      <w:bookmarkEnd w:id="0"/>
     </w:p>
     <w:p>
       <w:pPr>
@@ -5462,7 +5486,7 @@
 </file>
 
 <file path=customXml/itemProps1.xml><?xml version="1.0" encoding="utf-8"?>
-<ds:datastoreItem xmlns:ds="http://schemas.openxmlformats.org/officeDocument/2006/customXml" ds:itemID="{CFC541A7-4027-46B5-8C4B-7D74CD78F531}">
+<ds:datastoreItem xmlns:ds="http://schemas.openxmlformats.org/officeDocument/2006/customXml" ds:itemID="{4898A930-03E8-42D8-B5E7-CD5FD07F0267}">
   <ds:schemaRefs>
     <ds:schemaRef ds:uri="http://schemas.openxmlformats.org/officeDocument/2006/bibliography"/>
   </ds:schemaRefs>

</xml_diff>

<commit_message>
added new raw data, added switch to have only dry estimates or both
</commit_message>
<xml_diff>
--- a/allometry_flowchart.docx
+++ b/allometry_flowchart.docx
@@ -1,6 +1,6 @@
 
 <file path=word/document.xml><?xml version="1.0" encoding="utf-8"?>
-<w:document xmlns:wpc="http://schemas.microsoft.com/office/word/2010/wordprocessingCanvas" xmlns:cx="http://schemas.microsoft.com/office/drawing/2014/chartex" xmlns:cx1="http://schemas.microsoft.com/office/drawing/2015/9/8/chartex" xmlns:cx2="http://schemas.microsoft.com/office/drawing/2015/10/21/chartex" xmlns:cx3="http://schemas.microsoft.com/office/drawing/2016/5/9/chartex" xmlns:cx4="http://schemas.microsoft.com/office/drawing/2016/5/10/chartex" xmlns:cx5="http://schemas.microsoft.com/office/drawing/2016/5/11/chartex" xmlns:cx6="http://schemas.microsoft.com/office/drawing/2016/5/12/chartex" xmlns:cx7="http://schemas.microsoft.com/office/drawing/2016/5/13/chartex" xmlns:cx8="http://schemas.microsoft.com/office/drawing/2016/5/14/chartex" xmlns:mc="http://schemas.openxmlformats.org/markup-compatibility/2006" xmlns:aink="http://schemas.microsoft.com/office/drawing/2016/ink" xmlns:am3d="http://schemas.microsoft.com/office/drawing/2017/model3d" xmlns:o="urn:schemas-microsoft-com:office:office" xmlns:r="http://schemas.openxmlformats.org/officeDocument/2006/relationships" xmlns:m="http://schemas.openxmlformats.org/officeDocument/2006/math" xmlns:v="urn:schemas-microsoft-com:vml" xmlns:wp14="http://schemas.microsoft.com/office/word/2010/wordprocessingDrawing" xmlns:wp="http://schemas.openxmlformats.org/drawingml/2006/wordprocessingDrawing" xmlns:w10="urn:schemas-microsoft-com:office:word" xmlns:w="http://schemas.openxmlformats.org/wordprocessingml/2006/main" xmlns:w14="http://schemas.microsoft.com/office/word/2010/wordml" xmlns:w15="http://schemas.microsoft.com/office/word/2012/wordml" xmlns:w16cid="http://schemas.microsoft.com/office/word/2016/wordml/cid" xmlns:w16se="http://schemas.microsoft.com/office/word/2015/wordml/symex" xmlns:wpg="http://schemas.microsoft.com/office/word/2010/wordprocessingGroup" xmlns:wpi="http://schemas.microsoft.com/office/word/2010/wordprocessingInk" xmlns:wne="http://schemas.microsoft.com/office/word/2006/wordml" xmlns:wps="http://schemas.microsoft.com/office/word/2010/wordprocessingShape" mc:Ignorable="w14 w15 w16se w16cid wp14">
+<w:document xmlns:wpc="http://schemas.microsoft.com/office/word/2010/wordprocessingCanvas" xmlns:cx="http://schemas.microsoft.com/office/drawing/2014/chartex" xmlns:cx1="http://schemas.microsoft.com/office/drawing/2015/9/8/chartex" xmlns:cx2="http://schemas.microsoft.com/office/drawing/2015/10/21/chartex" xmlns:cx3="http://schemas.microsoft.com/office/drawing/2016/5/9/chartex" xmlns:cx4="http://schemas.microsoft.com/office/drawing/2016/5/10/chartex" xmlns:cx5="http://schemas.microsoft.com/office/drawing/2016/5/11/chartex" xmlns:cx6="http://schemas.microsoft.com/office/drawing/2016/5/12/chartex" xmlns:cx7="http://schemas.microsoft.com/office/drawing/2016/5/13/chartex" xmlns:cx8="http://schemas.microsoft.com/office/drawing/2016/5/14/chartex" xmlns:mc="http://schemas.openxmlformats.org/markup-compatibility/2006" xmlns:aink="http://schemas.microsoft.com/office/drawing/2016/ink" xmlns:am3d="http://schemas.microsoft.com/office/drawing/2017/model3d" xmlns:o="urn:schemas-microsoft-com:office:office" xmlns:r="http://schemas.openxmlformats.org/officeDocument/2006/relationships" xmlns:m="http://schemas.openxmlformats.org/officeDocument/2006/math" xmlns:v="urn:schemas-microsoft-com:vml" xmlns:wp14="http://schemas.microsoft.com/office/word/2010/wordprocessingDrawing" xmlns:wp="http://schemas.openxmlformats.org/drawingml/2006/wordprocessingDrawing" xmlns:w10="urn:schemas-microsoft-com:office:word" xmlns:w="http://schemas.openxmlformats.org/wordprocessingml/2006/main" xmlns:w14="http://schemas.microsoft.com/office/word/2010/wordml" xmlns:w15="http://schemas.microsoft.com/office/word/2012/wordml" xmlns:w16cex="http://schemas.microsoft.com/office/word/2018/wordml/cex" xmlns:w16cid="http://schemas.microsoft.com/office/word/2016/wordml/cid" xmlns:w16="http://schemas.microsoft.com/office/word/2018/wordml" xmlns:w16se="http://schemas.microsoft.com/office/word/2015/wordml/symex" xmlns:wpg="http://schemas.microsoft.com/office/word/2010/wordprocessingGroup" xmlns:wpi="http://schemas.microsoft.com/office/word/2010/wordprocessingInk" xmlns:wne="http://schemas.microsoft.com/office/word/2006/wordml" xmlns:wps="http://schemas.microsoft.com/office/word/2010/wordprocessingShape" mc:Ignorable="w14 w15 w16se w16cid w16 w16cex wp14">
   <w:body>
     <w:p>
       <w:pPr>
@@ -108,42 +108,14 @@
                             <w:pPr>
                               <w:jc w:val="center"/>
                             </w:pPr>
-                            <w:proofErr w:type="spellStart"/>
                             <w:r>
-                              <w:t>hello_</w:t>
+                              <w:t>hello_metry(</w:t>
                             </w:r>
-                            <w:proofErr w:type="gramStart"/>
                             <w:r>
-                              <w:t>metry</w:t>
+                              <w:t>equation_table, measurement_table</w:t>
                             </w:r>
-                            <w:proofErr w:type="spellEnd"/>
                             <w:r>
-                              <w:t>(</w:t>
-                            </w:r>
-                            <w:proofErr w:type="spellStart"/>
-                            <w:proofErr w:type="gramEnd"/>
-                            <w:r>
-                              <w:t>equation_table</w:t>
-                            </w:r>
-                            <w:proofErr w:type="spellEnd"/>
-                            <w:r>
-                              <w:t xml:space="preserve">, </w:t>
-                            </w:r>
-                            <w:proofErr w:type="spellStart"/>
-                            <w:r>
-                              <w:t>measurement_table</w:t>
-                            </w:r>
-                            <w:proofErr w:type="spellEnd"/>
-                            <w:r>
-                              <w:t xml:space="preserve">, </w:t>
-                            </w:r>
-                            <w:proofErr w:type="spellStart"/>
-                            <w:r>
-                              <w:t>data_table</w:t>
-                            </w:r>
-                            <w:proofErr w:type="spellEnd"/>
-                            <w:r>
-                              <w:t>)</w:t>
+                              <w:t>, data_table)</w:t>
                             </w:r>
                           </w:p>
                           <w:p/>
@@ -177,42 +149,14 @@
                       <w:pPr>
                         <w:jc w:val="center"/>
                       </w:pPr>
-                      <w:proofErr w:type="spellStart"/>
                       <w:r>
-                        <w:t>hello_</w:t>
+                        <w:t>hello_metry(</w:t>
                       </w:r>
-                      <w:proofErr w:type="gramStart"/>
                       <w:r>
-                        <w:t>metry</w:t>
+                        <w:t>equation_table, measurement_table</w:t>
                       </w:r>
-                      <w:proofErr w:type="spellEnd"/>
                       <w:r>
-                        <w:t>(</w:t>
-                      </w:r>
-                      <w:proofErr w:type="spellStart"/>
-                      <w:proofErr w:type="gramEnd"/>
-                      <w:r>
-                        <w:t>equation_table</w:t>
-                      </w:r>
-                      <w:proofErr w:type="spellEnd"/>
-                      <w:r>
-                        <w:t xml:space="preserve">, </w:t>
-                      </w:r>
-                      <w:proofErr w:type="spellStart"/>
-                      <w:r>
-                        <w:t>measurement_table</w:t>
-                      </w:r>
-                      <w:proofErr w:type="spellEnd"/>
-                      <w:r>
-                        <w:t xml:space="preserve">, </w:t>
-                      </w:r>
-                      <w:proofErr w:type="spellStart"/>
-                      <w:r>
-                        <w:t>data_table</w:t>
-                      </w:r>
-                      <w:proofErr w:type="spellEnd"/>
-                      <w:r>
-                        <w:t>)</w:t>
+                        <w:t>, data_table)</w:t>
                       </w:r>
                     </w:p>
                     <w:p/>
@@ -488,21 +432,8 @@
                             <w:pPr>
                               <w:contextualSpacing/>
                             </w:pPr>
-                            <w:proofErr w:type="spellStart"/>
                             <w:r>
-                              <w:t>equation_</w:t>
-                            </w:r>
-                            <w:proofErr w:type="gramStart"/>
-                            <w:r>
-                              <w:t>finder</w:t>
-                            </w:r>
-                            <w:proofErr w:type="spellEnd"/>
-                            <w:r>
-                              <w:t>(</w:t>
-                            </w:r>
-                            <w:proofErr w:type="gramEnd"/>
-                            <w:r>
-                              <w:t xml:space="preserve">size, row, </w:t>
+                              <w:t xml:space="preserve">equation_finder(size, row, </w:t>
                             </w:r>
                             <w:r>
                               <w:t>measurement_</w:t>
@@ -545,21 +476,8 @@
                       <w:pPr>
                         <w:contextualSpacing/>
                       </w:pPr>
-                      <w:proofErr w:type="spellStart"/>
                       <w:r>
-                        <w:t>equation_</w:t>
-                      </w:r>
-                      <w:proofErr w:type="gramStart"/>
-                      <w:r>
-                        <w:t>finder</w:t>
-                      </w:r>
-                      <w:proofErr w:type="spellEnd"/>
-                      <w:r>
-                        <w:t>(</w:t>
-                      </w:r>
-                      <w:proofErr w:type="gramEnd"/>
-                      <w:r>
-                        <w:t xml:space="preserve">size, row, </w:t>
+                        <w:t xml:space="preserve">equation_finder(size, row, </w:t>
                       </w:r>
                       <w:r>
                         <w:t>measurement_</w:t>
@@ -1208,57 +1126,18 @@
                             <w:pPr>
                               <w:jc w:val="center"/>
                             </w:pPr>
-                            <w:proofErr w:type="spellStart"/>
                             <w:r>
-                              <w:t>get_allometric_equations</w:t>
-                            </w:r>
-                            <w:proofErr w:type="spellEnd"/>
-                            <w:r>
-                              <w:t xml:space="preserve"> </w:t>
+                              <w:t xml:space="preserve">get_allometric_equations </w:t>
                             </w:r>
                             <w:r>
-                              <w:t>(</w:t>
-                            </w:r>
-                            <w:proofErr w:type="spellStart"/>
-                            <w:r>
-                              <w:t>species_name</w:t>
-                            </w:r>
-                            <w:proofErr w:type="spellEnd"/>
-                            <w:r>
-                              <w:t xml:space="preserve">, </w:t>
-                            </w:r>
-                            <w:proofErr w:type="spellStart"/>
-                            <w:r>
-                              <w:t>taxonomic_level</w:t>
-                            </w:r>
-                            <w:proofErr w:type="spellEnd"/>
-                            <w:r>
-                              <w:t xml:space="preserve">, size, </w:t>
-                            </w:r>
-                            <w:proofErr w:type="gramStart"/>
-                            <w:r>
-                              <w:t xml:space="preserve">abundance, </w:t>
+                              <w:t xml:space="preserve">(species_name, taxonomic_level, size, abundance, </w:t>
                             </w:r>
                             <w:r>
-                              <w:t xml:space="preserve"> path</w:t>
+                              <w:t xml:space="preserve"> path, </w:t>
                             </w:r>
-                            <w:proofErr w:type="gramEnd"/>
                             <w:r>
-                              <w:t xml:space="preserve">, </w:t>
+                              <w:t>equation_table, measurement_table</w:t>
                             </w:r>
-                            <w:proofErr w:type="spellStart"/>
-                            <w:r>
-                              <w:t>equation_table</w:t>
-                            </w:r>
-                            <w:proofErr w:type="spellEnd"/>
-                            <w:r>
-                              <w:t xml:space="preserve">, </w:t>
-                            </w:r>
-                            <w:proofErr w:type="spellStart"/>
-                            <w:r>
-                              <w:t>measurement_table</w:t>
-                            </w:r>
-                            <w:proofErr w:type="spellEnd"/>
                             <w:r>
                               <w:t>)</w:t>
                             </w:r>
@@ -1290,57 +1169,18 @@
                       <w:pPr>
                         <w:jc w:val="center"/>
                       </w:pPr>
-                      <w:proofErr w:type="spellStart"/>
                       <w:r>
-                        <w:t>get_allometric_equations</w:t>
-                      </w:r>
-                      <w:proofErr w:type="spellEnd"/>
-                      <w:r>
-                        <w:t xml:space="preserve"> </w:t>
+                        <w:t xml:space="preserve">get_allometric_equations </w:t>
                       </w:r>
                       <w:r>
-                        <w:t>(</w:t>
-                      </w:r>
-                      <w:proofErr w:type="spellStart"/>
-                      <w:r>
-                        <w:t>species_name</w:t>
-                      </w:r>
-                      <w:proofErr w:type="spellEnd"/>
-                      <w:r>
-                        <w:t xml:space="preserve">, </w:t>
-                      </w:r>
-                      <w:proofErr w:type="spellStart"/>
-                      <w:r>
-                        <w:t>taxonomic_level</w:t>
-                      </w:r>
-                      <w:proofErr w:type="spellEnd"/>
-                      <w:r>
-                        <w:t xml:space="preserve">, size, </w:t>
-                      </w:r>
-                      <w:proofErr w:type="gramStart"/>
-                      <w:r>
-                        <w:t xml:space="preserve">abundance, </w:t>
+                        <w:t xml:space="preserve">(species_name, taxonomic_level, size, abundance, </w:t>
                       </w:r>
                       <w:r>
-                        <w:t xml:space="preserve"> path</w:t>
+                        <w:t xml:space="preserve"> path, </w:t>
                       </w:r>
-                      <w:proofErr w:type="gramEnd"/>
                       <w:r>
-                        <w:t xml:space="preserve">, </w:t>
+                        <w:t>equation_table, measurement_table</w:t>
                       </w:r>
-                      <w:proofErr w:type="spellStart"/>
-                      <w:r>
-                        <w:t>equation_table</w:t>
-                      </w:r>
-                      <w:proofErr w:type="spellEnd"/>
-                      <w:r>
-                        <w:t xml:space="preserve">, </w:t>
-                      </w:r>
-                      <w:proofErr w:type="spellStart"/>
-                      <w:r>
-                        <w:t>measurement_table</w:t>
-                      </w:r>
-                      <w:proofErr w:type="spellEnd"/>
                       <w:r>
                         <w:t>)</w:t>
                       </w:r>
@@ -1503,50 +1343,17 @@
                             <w:pPr>
                               <w:jc w:val="center"/>
                             </w:pPr>
-                            <w:proofErr w:type="spellStart"/>
-                            <w:proofErr w:type="gramStart"/>
                             <w:r>
-                              <w:t>sizest</w:t>
-                            </w:r>
-                            <w:proofErr w:type="spellEnd"/>
-                            <w:r>
-                              <w:t>(</w:t>
-                            </w:r>
-                            <w:proofErr w:type="spellStart"/>
-                            <w:proofErr w:type="gramEnd"/>
-                            <w:r>
-                              <w:t>species_name</w:t>
-                            </w:r>
-                            <w:proofErr w:type="spellEnd"/>
-                            <w:r>
-                              <w:t xml:space="preserve">, size, </w:t>
+                              <w:t xml:space="preserve">sizest(species_name, size, </w:t>
                             </w:r>
                             <w:r>
                               <w:t xml:space="preserve">path, </w:t>
                             </w:r>
-                            <w:proofErr w:type="spellStart"/>
                             <w:r>
-                              <w:t>equation_table</w:t>
+                              <w:t>equation_table, measurement_table</w:t>
                             </w:r>
-                            <w:proofErr w:type="spellEnd"/>
                             <w:r>
-                              <w:t xml:space="preserve">, </w:t>
-                            </w:r>
-                            <w:proofErr w:type="spellStart"/>
-                            <w:r>
-                              <w:t>measurement_table</w:t>
-                            </w:r>
-                            <w:proofErr w:type="spellEnd"/>
-                            <w:r>
-                              <w:t xml:space="preserve">, </w:t>
-                            </w:r>
-                            <w:proofErr w:type="spellStart"/>
-                            <w:r>
-                              <w:t>data_table</w:t>
-                            </w:r>
-                            <w:proofErr w:type="spellEnd"/>
-                            <w:r>
-                              <w:t>)</w:t>
+                              <w:t>, data_table)</w:t>
                             </w:r>
                           </w:p>
                           <w:p/>
@@ -1576,50 +1383,17 @@
                       <w:pPr>
                         <w:jc w:val="center"/>
                       </w:pPr>
-                      <w:proofErr w:type="spellStart"/>
-                      <w:proofErr w:type="gramStart"/>
                       <w:r>
-                        <w:t>sizest</w:t>
-                      </w:r>
-                      <w:proofErr w:type="spellEnd"/>
-                      <w:r>
-                        <w:t>(</w:t>
-                      </w:r>
-                      <w:proofErr w:type="spellStart"/>
-                      <w:proofErr w:type="gramEnd"/>
-                      <w:r>
-                        <w:t>species_name</w:t>
-                      </w:r>
-                      <w:proofErr w:type="spellEnd"/>
-                      <w:r>
-                        <w:t xml:space="preserve">, size, </w:t>
+                        <w:t xml:space="preserve">sizest(species_name, size, </w:t>
                       </w:r>
                       <w:r>
                         <w:t xml:space="preserve">path, </w:t>
                       </w:r>
-                      <w:proofErr w:type="spellStart"/>
                       <w:r>
-                        <w:t>equation_table</w:t>
+                        <w:t>equation_table, measurement_table</w:t>
                       </w:r>
-                      <w:proofErr w:type="spellEnd"/>
                       <w:r>
-                        <w:t xml:space="preserve">, </w:t>
-                      </w:r>
-                      <w:proofErr w:type="spellStart"/>
-                      <w:r>
-                        <w:t>measurement_table</w:t>
-                      </w:r>
-                      <w:proofErr w:type="spellEnd"/>
-                      <w:r>
-                        <w:t xml:space="preserve">, </w:t>
-                      </w:r>
-                      <w:proofErr w:type="spellStart"/>
-                      <w:r>
-                        <w:t>data_table</w:t>
-                      </w:r>
-                      <w:proofErr w:type="spellEnd"/>
-                      <w:r>
-                        <w:t>)</w:t>
+                        <w:t>, data_table)</w:t>
                       </w:r>
                     </w:p>
                     <w:p/>
@@ -1784,32 +1558,12 @@
                       <wps:txbx>
                         <w:txbxContent>
                           <w:p>
-                            <w:proofErr w:type="spellStart"/>
                             <w:r>
-                              <w:t>matcher_of_</w:t>
+                              <w:t xml:space="preserve">matcher_of_traits(species_name, </w:t>
                             </w:r>
-                            <w:proofErr w:type="gramStart"/>
-                            <w:r>
-                              <w:t>traits</w:t>
-                            </w:r>
-                            <w:proofErr w:type="spellEnd"/>
-                            <w:r>
-                              <w:t>(</w:t>
-                            </w:r>
-                            <w:proofErr w:type="spellStart"/>
-                            <w:proofErr w:type="gramEnd"/>
-                            <w:r>
-                              <w:t>species_name</w:t>
-                            </w:r>
-                            <w:proofErr w:type="spellEnd"/>
-                            <w:r>
-                              <w:t xml:space="preserve">, </w:t>
-                            </w:r>
-                            <w:proofErr w:type="spellStart"/>
                             <w:r>
                               <w:t>measurement_table</w:t>
                             </w:r>
-                            <w:proofErr w:type="spellEnd"/>
                             <w:r>
                               <w:t>)</w:t>
                             </w:r>
@@ -1837,32 +1591,12 @@
                 <v:textbox>
                   <w:txbxContent>
                     <w:p>
-                      <w:proofErr w:type="spellStart"/>
                       <w:r>
-                        <w:t>matcher_of_</w:t>
+                        <w:t xml:space="preserve">matcher_of_traits(species_name, </w:t>
                       </w:r>
-                      <w:proofErr w:type="gramStart"/>
-                      <w:r>
-                        <w:t>traits</w:t>
-                      </w:r>
-                      <w:proofErr w:type="spellEnd"/>
-                      <w:r>
-                        <w:t>(</w:t>
-                      </w:r>
-                      <w:proofErr w:type="spellStart"/>
-                      <w:proofErr w:type="gramEnd"/>
-                      <w:r>
-                        <w:t>species_name</w:t>
-                      </w:r>
-                      <w:proofErr w:type="spellEnd"/>
-                      <w:r>
-                        <w:t xml:space="preserve">, </w:t>
-                      </w:r>
-                      <w:proofErr w:type="spellStart"/>
                       <w:r>
                         <w:t>measurement_table</w:t>
                       </w:r>
-                      <w:proofErr w:type="spellEnd"/>
                       <w:r>
                         <w:t>)</w:t>
                       </w:r>
@@ -2425,7 +2159,6 @@
         </w:rPr>
         <w:t xml:space="preserve"> (</w:t>
       </w:r>
-      <w:proofErr w:type="spellStart"/>
       <w:r>
         <w:rPr>
           <w:rFonts w:ascii="Goudy Old Style" w:hAnsi="Goudy Old Style" w:cs="Times New Roman"/>
@@ -2434,9 +2167,8 @@
           <w:sz w:val="28"/>
           <w:szCs w:val="28"/>
         </w:rPr>
-        <w:t>R_code</w:t>
-      </w:r>
-      <w:proofErr w:type="spellEnd"/>
+        <w:t>R_code/</w:t>
+      </w:r>
       <w:r>
         <w:rPr>
           <w:rFonts w:ascii="Goudy Old Style" w:hAnsi="Goudy Old Style" w:cs="Times New Roman"/>
@@ -2445,10 +2177,8 @@
           <w:sz w:val="28"/>
           <w:szCs w:val="28"/>
         </w:rPr>
-        <w:t>/</w:t>
-      </w:r>
-      <w:proofErr w:type="spellStart"/>
-      <w:proofErr w:type="gramStart"/>
+        <w:t>functions.R)</w:t>
+      </w:r>
       <w:r>
         <w:rPr>
           <w:rFonts w:ascii="Goudy Old Style" w:hAnsi="Goudy Old Style" w:cs="Times New Roman"/>
@@ -2457,11 +2187,64 @@
           <w:sz w:val="28"/>
           <w:szCs w:val="28"/>
         </w:rPr>
-        <w:t>functions.R</w:t>
-      </w:r>
-      <w:proofErr w:type="spellEnd"/>
-      <w:proofErr w:type="gramEnd"/>
-      <w:r>
+        <w:t>:</w:t>
+      </w:r>
+    </w:p>
+    <w:p>
+      <w:pPr>
+        <w:contextualSpacing/>
+        <w:rPr>
+          <w:rFonts w:ascii="Goudy Old Style" w:hAnsi="Goudy Old Style" w:cs="Times New Roman"/>
+          <w:sz w:val="24"/>
+          <w:szCs w:val="24"/>
+        </w:rPr>
+      </w:pPr>
+    </w:p>
+    <w:p>
+      <w:pPr>
+        <w:contextualSpacing/>
+        <w:rPr>
+          <w:rFonts w:ascii="Goudy Old Style" w:hAnsi="Goudy Old Style" w:cs="Times New Roman"/>
+          <w:sz w:val="24"/>
+          <w:szCs w:val="24"/>
+        </w:rPr>
+      </w:pPr>
+      <w:r>
+        <w:rPr>
+          <w:rFonts w:ascii="Goudy Old Style" w:hAnsi="Goudy Old Style" w:cs="Times New Roman"/>
+          <w:sz w:val="24"/>
+          <w:szCs w:val="24"/>
+        </w:rPr>
+        <w:t>hello_metry(</w:t>
+      </w:r>
+      <w:r>
+        <w:rPr>
+          <w:rFonts w:ascii="Goudy Old Style" w:hAnsi="Goudy Old Style" w:cs="Times New Roman"/>
+          <w:sz w:val="24"/>
+          <w:szCs w:val="24"/>
+        </w:rPr>
+        <w:t>equation_table, measurement_table</w:t>
+      </w:r>
+      <w:r>
+        <w:rPr>
+          <w:rFonts w:ascii="Goudy Old Style" w:hAnsi="Goudy Old Style" w:cs="Times New Roman"/>
+          <w:sz w:val="24"/>
+          <w:szCs w:val="24"/>
+        </w:rPr>
+        <w:t>, data_table, print</w:t>
+      </w:r>
+      <w:r>
+        <w:rPr>
+          <w:rFonts w:ascii="Goudy Old Style" w:hAnsi="Goudy Old Style" w:cs="Times New Roman"/>
+          <w:sz w:val="24"/>
+          <w:szCs w:val="24"/>
+        </w:rPr>
+        <w:t>)</w:t>
+      </w:r>
+    </w:p>
+    <w:p>
+      <w:pPr>
+        <w:contextualSpacing/>
         <w:rPr>
           <w:rFonts w:ascii="Goudy Old Style" w:hAnsi="Goudy Old Style" w:cs="Times New Roman"/>
           <w:b/>
@@ -2469,7 +2252,1087 @@
           <w:sz w:val="28"/>
           <w:szCs w:val="28"/>
         </w:rPr>
+      </w:pPr>
+      <w:r>
+        <w:rPr>
+          <w:rFonts w:ascii="Goudy Old Style" w:hAnsi="Goudy Old Style" w:cs="Times New Roman"/>
+          <w:sz w:val="24"/>
+          <w:szCs w:val="24"/>
+        </w:rPr>
+        <w:sym w:font="Wingdings" w:char="F0E0"/>
+      </w:r>
+      <w:r>
+        <w:rPr>
+          <w:rFonts w:ascii="Goudy Old Style" w:hAnsi="Goudy Old Style" w:cs="Times New Roman"/>
+          <w:sz w:val="24"/>
+          <w:szCs w:val="24"/>
+        </w:rPr>
+        <w:t xml:space="preserve"> wrapper function, returns</w:t>
+      </w:r>
+      <w:r>
+        <w:rPr>
+          <w:rFonts w:ascii="Goudy Old Style" w:hAnsi="Goudy Old Style" w:cs="Times New Roman"/>
+          <w:sz w:val="24"/>
+          <w:szCs w:val="24"/>
+        </w:rPr>
+        <w:t xml:space="preserve"> initial data table with two extra columns:</w:t>
+      </w:r>
+      <w:r>
+        <w:rPr>
+          <w:rFonts w:ascii="Goudy Old Style" w:hAnsi="Goudy Old Style" w:cs="Times New Roman"/>
+          <w:sz w:val="24"/>
+          <w:szCs w:val="24"/>
+        </w:rPr>
+        <w:t xml:space="preserve"> total biomass from given species, size and abundance</w:t>
+      </w:r>
+      <w:r>
+        <w:rPr>
+          <w:rFonts w:ascii="Goudy Old Style" w:hAnsi="Goudy Old Style" w:cs="Times New Roman"/>
+          <w:sz w:val="24"/>
+          <w:szCs w:val="24"/>
+        </w:rPr>
+        <w:t>, as well as path taken through the function</w:t>
+      </w:r>
+    </w:p>
+    <w:p>
+      <w:pPr>
+        <w:contextualSpacing/>
+        <w:rPr>
+          <w:rFonts w:ascii="Goudy Old Style" w:hAnsi="Goudy Old Style" w:cs="Times New Roman"/>
+          <w:sz w:val="24"/>
+          <w:szCs w:val="24"/>
+        </w:rPr>
+      </w:pPr>
+    </w:p>
+    <w:p>
+      <w:pPr>
+        <w:contextualSpacing/>
+        <w:rPr>
+          <w:rFonts w:ascii="Goudy Old Style" w:hAnsi="Goudy Old Style" w:cs="Times New Roman"/>
+          <w:sz w:val="24"/>
+          <w:szCs w:val="24"/>
+        </w:rPr>
+      </w:pPr>
+    </w:p>
+    <w:p>
+      <w:pPr>
+        <w:contextualSpacing/>
+        <w:rPr>
+          <w:rFonts w:ascii="Goudy Old Style" w:hAnsi="Goudy Old Style" w:cs="Times New Roman"/>
+          <w:sz w:val="24"/>
+          <w:szCs w:val="24"/>
+        </w:rPr>
+      </w:pPr>
+      <w:r>
+        <w:rPr>
+          <w:rFonts w:ascii="Goudy Old Style" w:hAnsi="Goudy Old Style" w:cs="Times New Roman"/>
+          <w:sz w:val="24"/>
+          <w:szCs w:val="24"/>
+        </w:rPr>
+        <w:t>sizest(</w:t>
+      </w:r>
+      <w:r>
+        <w:rPr>
+          <w:rFonts w:ascii="Goudy Old Style" w:hAnsi="Goudy Old Style" w:cs="Times New Roman"/>
+          <w:sz w:val="24"/>
+          <w:szCs w:val="24"/>
+        </w:rPr>
+        <w:t xml:space="preserve">specname, size, level, path, taxo, </w:t>
+      </w:r>
+      <w:r>
+        <w:rPr>
+          <w:rFonts w:ascii="Goudy Old Style" w:hAnsi="Goudy Old Style" w:cs="Times New Roman"/>
+          <w:sz w:val="24"/>
+          <w:szCs w:val="24"/>
+        </w:rPr>
+        <w:t>equation_table, measurement_table</w:t>
+      </w:r>
+      <w:r>
+        <w:rPr>
+          <w:rFonts w:ascii="Goudy Old Style" w:hAnsi="Goudy Old Style" w:cs="Times New Roman"/>
+          <w:sz w:val="24"/>
+          <w:szCs w:val="24"/>
+        </w:rPr>
+        <w:t>, data_table</w:t>
+      </w:r>
+      <w:r>
+        <w:rPr>
+          <w:rFonts w:ascii="Goudy Old Style" w:hAnsi="Goudy Old Style" w:cs="Times New Roman"/>
+          <w:sz w:val="24"/>
+          <w:szCs w:val="24"/>
+        </w:rPr>
         <w:t>)</w:t>
+      </w:r>
+    </w:p>
+    <w:p>
+      <w:pPr>
+        <w:contextualSpacing/>
+        <w:rPr>
+          <w:rFonts w:ascii="Goudy Old Style" w:hAnsi="Goudy Old Style" w:cs="Times New Roman"/>
+          <w:sz w:val="24"/>
+          <w:szCs w:val="24"/>
+        </w:rPr>
+      </w:pPr>
+      <w:r>
+        <w:rPr>
+          <w:rFonts w:ascii="Goudy Old Style" w:hAnsi="Goudy Old Style" w:cs="Times New Roman"/>
+          <w:sz w:val="24"/>
+          <w:szCs w:val="24"/>
+        </w:rPr>
+        <w:sym w:font="Wingdings" w:char="F0E0"/>
+      </w:r>
+      <w:r>
+        <w:rPr>
+          <w:rFonts w:ascii="Goudy Old Style" w:hAnsi="Goudy Old Style" w:cs="Times New Roman"/>
+          <w:sz w:val="24"/>
+          <w:szCs w:val="24"/>
+        </w:rPr>
+        <w:t xml:space="preserve"> returns size estimate</w:t>
+      </w:r>
+      <w:r>
+        <w:rPr>
+          <w:rFonts w:ascii="Goudy Old Style" w:hAnsi="Goudy Old Style" w:cs="Times New Roman"/>
+          <w:sz w:val="24"/>
+          <w:szCs w:val="24"/>
+        </w:rPr>
+        <w:t xml:space="preserve"> based on taxonomic approach or trait approach</w:t>
+      </w:r>
+    </w:p>
+    <w:p>
+      <w:pPr>
+        <w:contextualSpacing/>
+        <w:rPr>
+          <w:rFonts w:ascii="Goudy Old Style" w:hAnsi="Goudy Old Style" w:cs="Times New Roman"/>
+          <w:sz w:val="24"/>
+          <w:szCs w:val="24"/>
+        </w:rPr>
+      </w:pPr>
+      <w:r>
+        <w:rPr>
+          <w:rFonts w:ascii="Goudy Old Style" w:hAnsi="Goudy Old Style" w:cs="Times New Roman"/>
+          <w:sz w:val="24"/>
+          <w:szCs w:val="24"/>
+        </w:rPr>
+        <w:sym w:font="Wingdings" w:char="F0E0"/>
+      </w:r>
+      <w:r>
+        <w:rPr>
+          <w:rFonts w:ascii="Goudy Old Style" w:hAnsi="Goudy Old Style" w:cs="Times New Roman"/>
+          <w:sz w:val="24"/>
+          <w:szCs w:val="24"/>
+        </w:rPr>
+        <w:t xml:space="preserve"> </w:t>
+      </w:r>
+      <w:r>
+        <w:rPr>
+          <w:rFonts w:ascii="Goudy Old Style" w:hAnsi="Goudy Old Style" w:cs="Times New Roman"/>
+          <w:sz w:val="24"/>
+          <w:szCs w:val="24"/>
+        </w:rPr>
+        <w:t xml:space="preserve">Collect abundance/size distribution from species in </w:t>
+      </w:r>
+      <w:r>
+        <w:rPr>
+          <w:rFonts w:ascii="Goudy Old Style" w:hAnsi="Goudy Old Style" w:cs="Times New Roman"/>
+          <w:b/>
+          <w:bCs/>
+          <w:sz w:val="24"/>
+          <w:szCs w:val="24"/>
+        </w:rPr>
+        <w:t xml:space="preserve">both </w:t>
+      </w:r>
+      <w:r>
+        <w:rPr>
+          <w:rFonts w:ascii="Goudy Old Style" w:hAnsi="Goudy Old Style" w:cs="Times New Roman"/>
+          <w:sz w:val="24"/>
+          <w:szCs w:val="24"/>
+        </w:rPr>
+        <w:t>measurement</w:t>
+      </w:r>
+      <w:r>
+        <w:rPr>
+          <w:rFonts w:ascii="Goudy Old Style" w:hAnsi="Goudy Old Style" w:cs="Times New Roman"/>
+          <w:sz w:val="24"/>
+          <w:szCs w:val="24"/>
+        </w:rPr>
+        <w:t xml:space="preserve"> and data tables. Look for at least three distinct numeric measurements in</w:t>
+      </w:r>
+      <w:r>
+        <w:rPr>
+          <w:rFonts w:ascii="Goudy Old Style" w:hAnsi="Goudy Old Style" w:cs="Times New Roman"/>
+          <w:sz w:val="24"/>
+          <w:szCs w:val="24"/>
+        </w:rPr>
+        <w:t xml:space="preserve"> a given grouping in</w:t>
+      </w:r>
+      <w:r>
+        <w:rPr>
+          <w:rFonts w:ascii="Goudy Old Style" w:hAnsi="Goudy Old Style" w:cs="Times New Roman"/>
+          <w:sz w:val="24"/>
+          <w:szCs w:val="24"/>
+        </w:rPr>
+        <w:t xml:space="preserve"> the following order: species to family, traits, suborder to </w:t>
+      </w:r>
+      <w:r>
+        <w:rPr>
+          <w:rFonts w:ascii="Goudy Old Style" w:hAnsi="Goudy Old Style" w:cs="Times New Roman"/>
+          <w:sz w:val="24"/>
+          <w:szCs w:val="24"/>
+        </w:rPr>
+        <w:t>phylum</w:t>
+      </w:r>
+      <w:r>
+        <w:rPr>
+          <w:rFonts w:ascii="Goudy Old Style" w:hAnsi="Goudy Old Style" w:cs="Times New Roman"/>
+          <w:sz w:val="24"/>
+          <w:szCs w:val="24"/>
+        </w:rPr>
+        <w:t>.</w:t>
+      </w:r>
+    </w:p>
+    <w:p>
+      <w:pPr>
+        <w:contextualSpacing/>
+        <w:rPr>
+          <w:rFonts w:ascii="Goudy Old Style" w:hAnsi="Goudy Old Style" w:cs="Times New Roman"/>
+          <w:sz w:val="24"/>
+          <w:szCs w:val="24"/>
+        </w:rPr>
+      </w:pPr>
+      <w:r>
+        <w:rPr>
+          <w:rFonts w:ascii="Goudy Old Style" w:hAnsi="Goudy Old Style" w:cs="Times New Roman"/>
+          <w:sz w:val="24"/>
+          <w:szCs w:val="24"/>
+        </w:rPr>
+        <w:sym w:font="Wingdings" w:char="F0E0"/>
+      </w:r>
+      <w:r>
+        <w:rPr>
+          <w:rFonts w:ascii="Goudy Old Style" w:hAnsi="Goudy Old Style" w:cs="Times New Roman"/>
+          <w:sz w:val="24"/>
+          <w:szCs w:val="24"/>
+        </w:rPr>
+        <w:t xml:space="preserve"> </w:t>
+      </w:r>
+      <w:r>
+        <w:rPr>
+          <w:rFonts w:ascii="Goudy Old Style" w:hAnsi="Goudy Old Style" w:cs="Times New Roman"/>
+          <w:sz w:val="24"/>
+          <w:szCs w:val="24"/>
+        </w:rPr>
+        <w:t>Once threshold of at least three distinct numeric measurements is met</w:t>
+      </w:r>
+      <w:r>
+        <w:rPr>
+          <w:rFonts w:ascii="Goudy Old Style" w:hAnsi="Goudy Old Style" w:cs="Times New Roman"/>
+          <w:sz w:val="24"/>
+          <w:szCs w:val="24"/>
+        </w:rPr>
+        <w:t>:</w:t>
+      </w:r>
+    </w:p>
+    <w:p>
+      <w:pPr>
+        <w:contextualSpacing/>
+        <w:rPr>
+          <w:rFonts w:ascii="Goudy Old Style" w:hAnsi="Goudy Old Style" w:cs="Times New Roman"/>
+          <w:sz w:val="24"/>
+          <w:szCs w:val="24"/>
+        </w:rPr>
+      </w:pPr>
+      <w:r>
+        <w:rPr>
+          <w:rFonts w:ascii="Goudy Old Style" w:hAnsi="Goudy Old Style" w:cs="Times New Roman"/>
+          <w:sz w:val="24"/>
+          <w:szCs w:val="24"/>
+        </w:rPr>
+        <w:tab/>
+        <w:t xml:space="preserve">- if </w:t>
+      </w:r>
+      <w:r>
+        <w:rPr>
+          <w:rFonts w:ascii="Goudy Old Style" w:hAnsi="Goudy Old Style" w:cs="Times New Roman"/>
+          <w:sz w:val="24"/>
+          <w:szCs w:val="24"/>
+        </w:rPr>
+        <w:t>size category “unknown”</w:t>
+      </w:r>
+      <w:r>
+        <w:rPr>
+          <w:rFonts w:ascii="Goudy Old Style" w:hAnsi="Goudy Old Style" w:cs="Times New Roman"/>
+          <w:sz w:val="24"/>
+          <w:szCs w:val="24"/>
+        </w:rPr>
+        <w:t>, r</w:t>
+      </w:r>
+      <w:r>
+        <w:rPr>
+          <w:rFonts w:ascii="Goudy Old Style" w:hAnsi="Goudy Old Style" w:cs="Times New Roman"/>
+          <w:sz w:val="24"/>
+          <w:szCs w:val="24"/>
+        </w:rPr>
+        <w:t xml:space="preserve">eturn weighted average of all available measurements </w:t>
+      </w:r>
+    </w:p>
+    <w:p>
+      <w:pPr>
+        <w:contextualSpacing/>
+        <w:rPr>
+          <w:rFonts w:ascii="Goudy Old Style" w:hAnsi="Goudy Old Style" w:cs="Times New Roman"/>
+          <w:sz w:val="24"/>
+          <w:szCs w:val="24"/>
+        </w:rPr>
+      </w:pPr>
+      <w:r>
+        <w:rPr>
+          <w:rFonts w:ascii="Goudy Old Style" w:hAnsi="Goudy Old Style" w:cs="Times New Roman"/>
+          <w:sz w:val="24"/>
+          <w:szCs w:val="24"/>
+        </w:rPr>
+        <w:tab/>
+        <w:t xml:space="preserve">- if </w:t>
+      </w:r>
+      <w:r>
+        <w:rPr>
+          <w:rFonts w:ascii="Goudy Old Style" w:hAnsi="Goudy Old Style" w:cs="Times New Roman"/>
+          <w:sz w:val="24"/>
+          <w:szCs w:val="24"/>
+        </w:rPr>
+        <w:t>size category one of S, M, L</w:t>
+      </w:r>
+      <w:r>
+        <w:rPr>
+          <w:rFonts w:ascii="Goudy Old Style" w:hAnsi="Goudy Old Style" w:cs="Times New Roman"/>
+          <w:sz w:val="24"/>
+          <w:szCs w:val="24"/>
+        </w:rPr>
+        <w:t>, d</w:t>
+      </w:r>
+      <w:r>
+        <w:rPr>
+          <w:rFonts w:ascii="Goudy Old Style" w:hAnsi="Goudy Old Style" w:cs="Times New Roman"/>
+          <w:sz w:val="24"/>
+          <w:szCs w:val="24"/>
+        </w:rPr>
+        <w:t>ivide measurements into three bins</w:t>
+      </w:r>
+      <w:r>
+        <w:rPr>
+          <w:rFonts w:ascii="Goudy Old Style" w:hAnsi="Goudy Old Style" w:cs="Times New Roman"/>
+          <w:sz w:val="24"/>
+          <w:szCs w:val="24"/>
+        </w:rPr>
+        <w:t xml:space="preserve"> of unique </w:t>
+      </w:r>
+    </w:p>
+    <w:p>
+      <w:pPr>
+        <w:ind w:left="720" w:firstLine="120"/>
+        <w:contextualSpacing/>
+        <w:rPr>
+          <w:rFonts w:ascii="Goudy Old Style" w:hAnsi="Goudy Old Style" w:cs="Times New Roman"/>
+          <w:sz w:val="24"/>
+          <w:szCs w:val="24"/>
+        </w:rPr>
+      </w:pPr>
+      <w:r>
+        <w:rPr>
+          <w:rFonts w:ascii="Goudy Old Style" w:hAnsi="Goudy Old Style" w:cs="Times New Roman"/>
+          <w:sz w:val="24"/>
+          <w:szCs w:val="24"/>
+        </w:rPr>
+        <w:t>measurement values</w:t>
+      </w:r>
+      <w:r>
+        <w:rPr>
+          <w:rFonts w:ascii="Goudy Old Style" w:hAnsi="Goudy Old Style" w:cs="Times New Roman"/>
+          <w:sz w:val="24"/>
+          <w:szCs w:val="24"/>
+        </w:rPr>
+        <w:t>, if bins not equal, larger bins for S and L</w:t>
+      </w:r>
+      <w:r>
+        <w:rPr>
+          <w:rFonts w:ascii="Goudy Old Style" w:hAnsi="Goudy Old Style" w:cs="Times New Roman"/>
+          <w:sz w:val="24"/>
+          <w:szCs w:val="24"/>
+        </w:rPr>
+        <w:t xml:space="preserve">. </w:t>
+      </w:r>
+      <w:r>
+        <w:rPr>
+          <w:rFonts w:ascii="Goudy Old Style" w:hAnsi="Goudy Old Style" w:cs="Times New Roman"/>
+          <w:sz w:val="24"/>
+          <w:szCs w:val="24"/>
+        </w:rPr>
+        <w:t xml:space="preserve">Return average of </w:t>
+      </w:r>
+      <w:r>
+        <w:rPr>
+          <w:rFonts w:ascii="Goudy Old Style" w:hAnsi="Goudy Old Style" w:cs="Times New Roman"/>
+          <w:sz w:val="24"/>
+          <w:szCs w:val="24"/>
+        </w:rPr>
+        <w:t xml:space="preserve">    </w:t>
+      </w:r>
+    </w:p>
+    <w:p>
+      <w:pPr>
+        <w:ind w:left="720" w:firstLine="120"/>
+        <w:contextualSpacing/>
+        <w:rPr>
+          <w:rFonts w:ascii="Goudy Old Style" w:hAnsi="Goudy Old Style" w:cs="Times New Roman"/>
+          <w:sz w:val="24"/>
+          <w:szCs w:val="24"/>
+        </w:rPr>
+      </w:pPr>
+      <w:r>
+        <w:rPr>
+          <w:rFonts w:ascii="Goudy Old Style" w:hAnsi="Goudy Old Style" w:cs="Times New Roman"/>
+          <w:sz w:val="24"/>
+          <w:szCs w:val="24"/>
+        </w:rPr>
+        <w:t>measurements within given bin</w:t>
+      </w:r>
+    </w:p>
+    <w:p>
+      <w:pPr>
+        <w:contextualSpacing/>
+        <w:rPr>
+          <w:rFonts w:ascii="Goudy Old Style" w:hAnsi="Goudy Old Style" w:cs="Times New Roman"/>
+          <w:sz w:val="24"/>
+          <w:szCs w:val="24"/>
+        </w:rPr>
+      </w:pPr>
+    </w:p>
+    <w:p>
+      <w:pPr>
+        <w:contextualSpacing/>
+        <w:rPr>
+          <w:rFonts w:ascii="Goudy Old Style" w:hAnsi="Goudy Old Style" w:cs="Times New Roman"/>
+          <w:sz w:val="24"/>
+          <w:szCs w:val="24"/>
+        </w:rPr>
+      </w:pPr>
+    </w:p>
+    <w:p>
+      <w:pPr>
+        <w:contextualSpacing/>
+        <w:rPr>
+          <w:rFonts w:ascii="Goudy Old Style" w:hAnsi="Goudy Old Style" w:cs="Times New Roman"/>
+          <w:sz w:val="24"/>
+          <w:szCs w:val="24"/>
+        </w:rPr>
+      </w:pPr>
+      <w:r>
+        <w:rPr>
+          <w:rFonts w:ascii="Goudy Old Style" w:hAnsi="Goudy Old Style" w:cs="Times New Roman"/>
+          <w:sz w:val="24"/>
+          <w:szCs w:val="24"/>
+        </w:rPr>
+        <w:t>get_</w:t>
+      </w:r>
+      <w:r>
+        <w:rPr>
+          <w:rFonts w:ascii="Goudy Old Style" w:hAnsi="Goudy Old Style" w:cs="Times New Roman"/>
+          <w:sz w:val="24"/>
+          <w:szCs w:val="24"/>
+        </w:rPr>
+        <w:t>allometric_equations</w:t>
+      </w:r>
+      <w:r>
+        <w:rPr>
+          <w:rFonts w:ascii="Goudy Old Style" w:hAnsi="Goudy Old Style" w:cs="Times New Roman"/>
+          <w:sz w:val="24"/>
+          <w:szCs w:val="24"/>
+        </w:rPr>
+        <w:t>(</w:t>
+      </w:r>
+      <w:r>
+        <w:rPr>
+          <w:rFonts w:ascii="Goudy Old Style" w:hAnsi="Goudy Old Style" w:cs="Times New Roman"/>
+          <w:sz w:val="24"/>
+          <w:szCs w:val="24"/>
+        </w:rPr>
+        <w:t xml:space="preserve">specname, level, size, abundance, path, taxo, </w:t>
+      </w:r>
+      <w:r>
+        <w:rPr>
+          <w:rFonts w:ascii="Goudy Old Style" w:hAnsi="Goudy Old Style" w:cs="Times New Roman"/>
+          <w:sz w:val="24"/>
+          <w:szCs w:val="24"/>
+        </w:rPr>
+        <w:t>equation_table, measurement_table</w:t>
+      </w:r>
+      <w:r>
+        <w:rPr>
+          <w:rFonts w:ascii="Goudy Old Style" w:hAnsi="Goudy Old Style" w:cs="Times New Roman"/>
+          <w:sz w:val="24"/>
+          <w:szCs w:val="24"/>
+        </w:rPr>
+        <w:t>)</w:t>
+      </w:r>
+    </w:p>
+    <w:p>
+      <w:pPr>
+        <w:contextualSpacing/>
+        <w:rPr>
+          <w:rFonts w:ascii="Goudy Old Style" w:hAnsi="Goudy Old Style" w:cs="Times New Roman"/>
+          <w:sz w:val="24"/>
+          <w:szCs w:val="24"/>
+        </w:rPr>
+      </w:pPr>
+      <w:r>
+        <w:rPr>
+          <w:rFonts w:ascii="Goudy Old Style" w:hAnsi="Goudy Old Style" w:cs="Times New Roman"/>
+          <w:sz w:val="24"/>
+          <w:szCs w:val="24"/>
+        </w:rPr>
+        <w:sym w:font="Wingdings" w:char="F0E0"/>
+      </w:r>
+      <w:r>
+        <w:rPr>
+          <w:rFonts w:ascii="Goudy Old Style" w:hAnsi="Goudy Old Style" w:cs="Times New Roman"/>
+          <w:sz w:val="24"/>
+          <w:szCs w:val="24"/>
+        </w:rPr>
+        <w:t xml:space="preserve"> look if raw biomass value exists for given measurement, use it if available</w:t>
+      </w:r>
+    </w:p>
+    <w:p>
+      <w:pPr>
+        <w:contextualSpacing/>
+        <w:rPr>
+          <w:rFonts w:ascii="Goudy Old Style" w:hAnsi="Goudy Old Style" w:cs="Times New Roman"/>
+          <w:sz w:val="24"/>
+          <w:szCs w:val="24"/>
+        </w:rPr>
+      </w:pPr>
+      <w:r>
+        <w:rPr>
+          <w:rFonts w:ascii="Goudy Old Style" w:hAnsi="Goudy Old Style" w:cs="Times New Roman"/>
+          <w:sz w:val="24"/>
+          <w:szCs w:val="24"/>
+        </w:rPr>
+        <w:sym w:font="Wingdings" w:char="F0E0"/>
+      </w:r>
+      <w:r>
+        <w:rPr>
+          <w:rFonts w:ascii="Goudy Old Style" w:hAnsi="Goudy Old Style" w:cs="Times New Roman"/>
+          <w:sz w:val="24"/>
+          <w:szCs w:val="24"/>
+        </w:rPr>
+        <w:t xml:space="preserve"> </w:t>
+      </w:r>
+      <w:r>
+        <w:rPr>
+          <w:rFonts w:ascii="Goudy Old Style" w:hAnsi="Goudy Old Style" w:cs="Times New Roman"/>
+          <w:sz w:val="24"/>
+          <w:szCs w:val="24"/>
+        </w:rPr>
+        <w:t>Look for at least one allometric equation in</w:t>
+      </w:r>
+      <w:r>
+        <w:rPr>
+          <w:rFonts w:ascii="Goudy Old Style" w:hAnsi="Goudy Old Style" w:cs="Times New Roman"/>
+          <w:sz w:val="24"/>
+          <w:szCs w:val="24"/>
+        </w:rPr>
+        <w:t xml:space="preserve"> a given grouping in</w:t>
+      </w:r>
+      <w:r>
+        <w:rPr>
+          <w:rFonts w:ascii="Goudy Old Style" w:hAnsi="Goudy Old Style" w:cs="Times New Roman"/>
+          <w:sz w:val="24"/>
+          <w:szCs w:val="24"/>
+        </w:rPr>
+        <w:t xml:space="preserve"> the following order: species to family, traits, suborder to </w:t>
+      </w:r>
+      <w:r>
+        <w:rPr>
+          <w:rFonts w:ascii="Goudy Old Style" w:hAnsi="Goudy Old Style" w:cs="Times New Roman"/>
+          <w:sz w:val="24"/>
+          <w:szCs w:val="24"/>
+        </w:rPr>
+        <w:t>phylum</w:t>
+      </w:r>
+    </w:p>
+    <w:p>
+      <w:pPr>
+        <w:contextualSpacing/>
+        <w:rPr>
+          <w:rFonts w:ascii="Goudy Old Style" w:hAnsi="Goudy Old Style" w:cs="Times New Roman"/>
+          <w:sz w:val="24"/>
+          <w:szCs w:val="24"/>
+        </w:rPr>
+      </w:pPr>
+      <w:r>
+        <w:rPr>
+          <w:rFonts w:ascii="Goudy Old Style" w:hAnsi="Goudy Old Style" w:cs="Times New Roman"/>
+          <w:sz w:val="24"/>
+          <w:szCs w:val="24"/>
+        </w:rPr>
+        <w:sym w:font="Wingdings" w:char="F0E0"/>
+      </w:r>
+      <w:r>
+        <w:rPr>
+          <w:rFonts w:ascii="Goudy Old Style" w:hAnsi="Goudy Old Style" w:cs="Times New Roman"/>
+          <w:sz w:val="24"/>
+          <w:szCs w:val="24"/>
+        </w:rPr>
+        <w:t xml:space="preserve"> </w:t>
+      </w:r>
+      <w:r>
+        <w:rPr>
+          <w:rFonts w:ascii="Goudy Old Style" w:hAnsi="Goudy Old Style" w:cs="Times New Roman"/>
+          <w:sz w:val="24"/>
+          <w:szCs w:val="24"/>
+        </w:rPr>
+        <w:t>Once threshold of at least one allometric equation is met</w:t>
+      </w:r>
+      <w:r>
+        <w:rPr>
+          <w:rFonts w:ascii="Goudy Old Style" w:hAnsi="Goudy Old Style" w:cs="Times New Roman"/>
+          <w:sz w:val="24"/>
+          <w:szCs w:val="24"/>
+        </w:rPr>
+        <w:t>:</w:t>
+      </w:r>
+    </w:p>
+    <w:p>
+      <w:pPr>
+        <w:contextualSpacing/>
+        <w:rPr>
+          <w:rFonts w:ascii="Goudy Old Style" w:hAnsi="Goudy Old Style" w:cs="Times New Roman"/>
+          <w:sz w:val="24"/>
+          <w:szCs w:val="24"/>
+        </w:rPr>
+      </w:pPr>
+      <w:r>
+        <w:rPr>
+          <w:rFonts w:ascii="Goudy Old Style" w:hAnsi="Goudy Old Style" w:cs="Times New Roman"/>
+          <w:sz w:val="24"/>
+          <w:szCs w:val="24"/>
+        </w:rPr>
+        <w:tab/>
+        <w:t>- if there is only one equation, compute value of biomass</w:t>
+      </w:r>
+    </w:p>
+    <w:p>
+      <w:pPr>
+        <w:contextualSpacing/>
+        <w:rPr>
+          <w:rFonts w:ascii="Goudy Old Style" w:hAnsi="Goudy Old Style" w:cs="Times New Roman"/>
+          <w:sz w:val="24"/>
+          <w:szCs w:val="24"/>
+        </w:rPr>
+      </w:pPr>
+      <w:r>
+        <w:rPr>
+          <w:rFonts w:ascii="Goudy Old Style" w:hAnsi="Goudy Old Style" w:cs="Times New Roman"/>
+          <w:sz w:val="24"/>
+          <w:szCs w:val="24"/>
+        </w:rPr>
+        <w:tab/>
+        <w:t>- if there is more than one allometric equation, average the computed values of biomass</w:t>
+      </w:r>
+    </w:p>
+    <w:p>
+      <w:pPr>
+        <w:contextualSpacing/>
+        <w:rPr>
+          <w:rFonts w:ascii="Goudy Old Style" w:hAnsi="Goudy Old Style" w:cs="Times New Roman"/>
+          <w:sz w:val="24"/>
+          <w:szCs w:val="24"/>
+        </w:rPr>
+      </w:pPr>
+    </w:p>
+    <w:p>
+      <w:pPr>
+        <w:contextualSpacing/>
+        <w:rPr>
+          <w:rFonts w:ascii="Goudy Old Style" w:hAnsi="Goudy Old Style" w:cs="Times New Roman"/>
+          <w:sz w:val="24"/>
+          <w:szCs w:val="24"/>
+        </w:rPr>
+      </w:pPr>
+    </w:p>
+    <w:p>
+      <w:pPr>
+        <w:contextualSpacing/>
+        <w:rPr>
+          <w:rFonts w:ascii="Goudy Old Style" w:hAnsi="Goudy Old Style" w:cs="Times New Roman"/>
+          <w:sz w:val="24"/>
+          <w:szCs w:val="24"/>
+        </w:rPr>
+      </w:pPr>
+      <w:r>
+        <w:rPr>
+          <w:rFonts w:ascii="Goudy Old Style" w:hAnsi="Goudy Old Style" w:cs="Times New Roman"/>
+          <w:sz w:val="24"/>
+          <w:szCs w:val="24"/>
+        </w:rPr>
+        <w:t xml:space="preserve">matcher_of_traits(species_name, </w:t>
+      </w:r>
+      <w:r>
+        <w:rPr>
+          <w:rFonts w:ascii="Goudy Old Style" w:hAnsi="Goudy Old Style" w:cs="Times New Roman"/>
+          <w:sz w:val="24"/>
+          <w:szCs w:val="24"/>
+        </w:rPr>
+        <w:t>measurement</w:t>
+      </w:r>
+      <w:r>
+        <w:rPr>
+          <w:rFonts w:ascii="Goudy Old Style" w:hAnsi="Goudy Old Style" w:cs="Times New Roman"/>
+          <w:sz w:val="24"/>
+          <w:szCs w:val="24"/>
+        </w:rPr>
+        <w:t>_table)</w:t>
+      </w:r>
+    </w:p>
+    <w:p>
+      <w:pPr>
+        <w:contextualSpacing/>
+        <w:rPr>
+          <w:rFonts w:ascii="Goudy Old Style" w:hAnsi="Goudy Old Style" w:cs="Times New Roman"/>
+          <w:sz w:val="24"/>
+          <w:szCs w:val="24"/>
+        </w:rPr>
+      </w:pPr>
+      <w:r>
+        <w:rPr>
+          <w:rFonts w:ascii="Goudy Old Style" w:hAnsi="Goudy Old Style" w:cs="Times New Roman"/>
+          <w:sz w:val="24"/>
+          <w:szCs w:val="24"/>
+        </w:rPr>
+        <w:sym w:font="Wingdings" w:char="F0E0"/>
+      </w:r>
+      <w:r>
+        <w:rPr>
+          <w:rFonts w:ascii="Goudy Old Style" w:hAnsi="Goudy Old Style" w:cs="Times New Roman"/>
+          <w:sz w:val="24"/>
+          <w:szCs w:val="24"/>
+        </w:rPr>
+        <w:t xml:space="preserve"> called if grouping in sizest or get_allometric_equations is “traits”, i.e. if threshold of at least three distinct measurements or one allometric equation not met at family level</w:t>
+      </w:r>
+    </w:p>
+    <w:p>
+      <w:pPr>
+        <w:contextualSpacing/>
+        <w:rPr>
+          <w:rFonts w:ascii="Goudy Old Style" w:hAnsi="Goudy Old Style" w:cs="Times New Roman"/>
+          <w:sz w:val="24"/>
+          <w:szCs w:val="24"/>
+        </w:rPr>
+      </w:pPr>
+      <w:r>
+        <w:rPr>
+          <w:rFonts w:ascii="Goudy Old Style" w:hAnsi="Goudy Old Style" w:cs="Times New Roman"/>
+          <w:sz w:val="24"/>
+          <w:szCs w:val="24"/>
+        </w:rPr>
+        <w:sym w:font="Wingdings" w:char="F0E0"/>
+      </w:r>
+      <w:r>
+        <w:rPr>
+          <w:rFonts w:ascii="Goudy Old Style" w:hAnsi="Goudy Old Style" w:cs="Times New Roman"/>
+          <w:sz w:val="24"/>
+          <w:szCs w:val="24"/>
+        </w:rPr>
+        <w:t xml:space="preserve"> </w:t>
+      </w:r>
+      <w:r>
+        <w:rPr>
+          <w:rFonts w:ascii="Goudy Old Style" w:hAnsi="Goudy Old Style" w:cs="Times New Roman"/>
+          <w:sz w:val="24"/>
+          <w:szCs w:val="24"/>
+        </w:rPr>
+        <w:t>Match traits of max</w:t>
+      </w:r>
+      <w:r>
+        <w:rPr>
+          <w:rFonts w:ascii="Goudy Old Style" w:hAnsi="Goudy Old Style" w:cs="Times New Roman"/>
+          <w:sz w:val="24"/>
+          <w:szCs w:val="24"/>
+        </w:rPr>
+        <w:t>imum body</w:t>
+      </w:r>
+      <w:r>
+        <w:rPr>
+          <w:rFonts w:ascii="Goudy Old Style" w:hAnsi="Goudy Old Style" w:cs="Times New Roman"/>
+          <w:sz w:val="24"/>
+          <w:szCs w:val="24"/>
+        </w:rPr>
+        <w:t xml:space="preserve"> size, body shape, locomotion and morphological defense</w:t>
+      </w:r>
+      <w:r>
+        <w:rPr>
+          <w:rFonts w:ascii="Goudy Old Style" w:hAnsi="Goudy Old Style" w:cs="Times New Roman"/>
+          <w:sz w:val="24"/>
+          <w:szCs w:val="24"/>
+        </w:rPr>
+        <w:t xml:space="preserve"> across </w:t>
+      </w:r>
+      <w:r>
+        <w:rPr>
+          <w:rFonts w:ascii="Goudy Old Style" w:hAnsi="Goudy Old Style" w:cs="Times New Roman"/>
+          <w:b/>
+          <w:bCs/>
+          <w:sz w:val="24"/>
+          <w:szCs w:val="24"/>
+        </w:rPr>
+        <w:t>all</w:t>
+      </w:r>
+      <w:r>
+        <w:rPr>
+          <w:rFonts w:ascii="Goudy Old Style" w:hAnsi="Goudy Old Style" w:cs="Times New Roman"/>
+          <w:sz w:val="24"/>
+          <w:szCs w:val="24"/>
+        </w:rPr>
+        <w:t xml:space="preserve"> species in the database</w:t>
+      </w:r>
+      <w:r>
+        <w:rPr>
+          <w:rFonts w:ascii="Goudy Old Style" w:hAnsi="Goudy Old Style" w:cs="Times New Roman"/>
+          <w:sz w:val="24"/>
+          <w:szCs w:val="24"/>
+        </w:rPr>
+        <w:t xml:space="preserve">. Those species with </w:t>
+      </w:r>
+      <w:r>
+        <w:rPr>
+          <w:rFonts w:ascii="Goudy Old Style" w:hAnsi="Goudy Old Style" w:cs="Times New Roman"/>
+          <w:b/>
+          <w:bCs/>
+          <w:sz w:val="24"/>
+          <w:szCs w:val="24"/>
+        </w:rPr>
+        <w:t>+/- 1</w:t>
+      </w:r>
+      <w:r>
+        <w:rPr>
+          <w:rFonts w:ascii="Goudy Old Style" w:hAnsi="Goudy Old Style" w:cs="Times New Roman"/>
+          <w:sz w:val="24"/>
+          <w:szCs w:val="24"/>
+        </w:rPr>
+        <w:t xml:space="preserve"> match are added to a species pool to get </w:t>
+      </w:r>
+      <w:r>
+        <w:rPr>
+          <w:rFonts w:ascii="Goudy Old Style" w:hAnsi="Goudy Old Style" w:cs="Times New Roman"/>
+          <w:sz w:val="24"/>
+          <w:szCs w:val="24"/>
+        </w:rPr>
+        <w:t xml:space="preserve">allometric </w:t>
+      </w:r>
+      <w:r>
+        <w:rPr>
+          <w:rFonts w:ascii="Goudy Old Style" w:hAnsi="Goudy Old Style" w:cs="Times New Roman"/>
+          <w:sz w:val="24"/>
+          <w:szCs w:val="24"/>
+        </w:rPr>
+        <w:t>equations or size estimates</w:t>
+      </w:r>
+      <w:r>
+        <w:rPr>
+          <w:rFonts w:ascii="Goudy Old Style" w:hAnsi="Goudy Old Style" w:cs="Times New Roman"/>
+          <w:sz w:val="24"/>
+          <w:szCs w:val="24"/>
+        </w:rPr>
+        <w:t xml:space="preserve"> (instead of a taxonomic grouping)</w:t>
+      </w:r>
+    </w:p>
+    <w:p>
+      <w:pPr>
+        <w:contextualSpacing/>
+        <w:rPr>
+          <w:rFonts w:ascii="Goudy Old Style" w:hAnsi="Goudy Old Style" w:cs="Times New Roman"/>
+          <w:b/>
+          <w:bCs/>
+          <w:sz w:val="24"/>
+          <w:szCs w:val="24"/>
+        </w:rPr>
+      </w:pPr>
+      <w:r>
+        <w:rPr>
+          <w:rFonts w:ascii="Goudy Old Style" w:hAnsi="Goudy Old Style" w:cs="Times New Roman"/>
+          <w:sz w:val="24"/>
+          <w:szCs w:val="24"/>
+        </w:rPr>
+        <w:sym w:font="Wingdings" w:char="F0E0"/>
+      </w:r>
+      <w:r>
+        <w:rPr>
+          <w:rFonts w:ascii="Goudy Old Style" w:hAnsi="Goudy Old Style" w:cs="Times New Roman"/>
+          <w:sz w:val="24"/>
+          <w:szCs w:val="24"/>
+        </w:rPr>
+        <w:t xml:space="preserve"> Does not proceed if any NA is found in the trait values of the species</w:t>
+      </w:r>
+    </w:p>
+    <w:p>
+      <w:pPr>
+        <w:contextualSpacing/>
+        <w:rPr>
+          <w:rFonts w:ascii="Goudy Old Style" w:hAnsi="Goudy Old Style" w:cs="Times New Roman"/>
+          <w:sz w:val="24"/>
+          <w:szCs w:val="24"/>
+        </w:rPr>
+      </w:pPr>
+    </w:p>
+    <w:p>
+      <w:pPr>
+        <w:contextualSpacing/>
+        <w:rPr>
+          <w:rFonts w:ascii="Goudy Old Style" w:hAnsi="Goudy Old Style" w:cs="Times New Roman"/>
+          <w:sz w:val="24"/>
+          <w:szCs w:val="24"/>
+        </w:rPr>
+      </w:pPr>
+    </w:p>
+    <w:p>
+      <w:pPr>
+        <w:contextualSpacing/>
+        <w:rPr>
+          <w:rFonts w:ascii="Goudy Old Style" w:hAnsi="Goudy Old Style" w:cs="Times New Roman"/>
+          <w:sz w:val="24"/>
+          <w:szCs w:val="24"/>
+        </w:rPr>
+      </w:pPr>
+      <w:r>
+        <w:rPr>
+          <w:rFonts w:ascii="Goudy Old Style" w:hAnsi="Goudy Old Style" w:cs="Times New Roman"/>
+          <w:sz w:val="24"/>
+          <w:szCs w:val="24"/>
+        </w:rPr>
+        <w:t xml:space="preserve">equation_finder(size, row, </w:t>
+      </w:r>
+      <w:r>
+        <w:rPr>
+          <w:rFonts w:ascii="Goudy Old Style" w:hAnsi="Goudy Old Style" w:cs="Times New Roman"/>
+          <w:sz w:val="24"/>
+          <w:szCs w:val="24"/>
+        </w:rPr>
+        <w:t>measurement_tables</w:t>
+      </w:r>
+      <w:r>
+        <w:rPr>
+          <w:rFonts w:ascii="Goudy Old Style" w:hAnsi="Goudy Old Style" w:cs="Times New Roman"/>
+          <w:sz w:val="24"/>
+          <w:szCs w:val="24"/>
+        </w:rPr>
+        <w:t>)</w:t>
+      </w:r>
+    </w:p>
+    <w:p>
+      <w:pPr>
+        <w:contextualSpacing/>
+        <w:rPr>
+          <w:rFonts w:ascii="Goudy Old Style" w:hAnsi="Goudy Old Style" w:cs="Times New Roman"/>
+          <w:sz w:val="24"/>
+          <w:szCs w:val="24"/>
+        </w:rPr>
+      </w:pPr>
+      <w:r>
+        <w:rPr>
+          <w:rFonts w:ascii="Goudy Old Style" w:hAnsi="Goudy Old Style" w:cs="Times New Roman"/>
+          <w:sz w:val="24"/>
+          <w:szCs w:val="24"/>
+        </w:rPr>
+        <w:sym w:font="Wingdings" w:char="F0E0"/>
+      </w:r>
+      <w:r>
+        <w:rPr>
+          <w:rFonts w:ascii="Goudy Old Style" w:hAnsi="Goudy Old Style" w:cs="Times New Roman"/>
+          <w:sz w:val="24"/>
+          <w:szCs w:val="24"/>
+        </w:rPr>
+        <w:t xml:space="preserve"> called when biomass computation happens because some equations are in log10 format</w:t>
+      </w:r>
+      <w:r>
+        <w:rPr>
+          <w:rFonts w:ascii="Goudy Old Style" w:hAnsi="Goudy Old Style" w:cs="Times New Roman"/>
+          <w:sz w:val="24"/>
+          <w:szCs w:val="24"/>
+        </w:rPr>
+        <w:t xml:space="preserve"> (log10(biomass) = slope x log10(size) + intercept)</w:t>
+      </w:r>
+      <w:r>
+        <w:rPr>
+          <w:rFonts w:ascii="Goudy Old Style" w:hAnsi="Goudy Old Style" w:cs="Times New Roman"/>
+          <w:sz w:val="24"/>
+          <w:szCs w:val="24"/>
+        </w:rPr>
+        <w:t>, others in ln format</w:t>
+      </w:r>
+      <w:r>
+        <w:rPr>
+          <w:rFonts w:ascii="Goudy Old Style" w:hAnsi="Goudy Old Style" w:cs="Times New Roman"/>
+          <w:sz w:val="24"/>
+          <w:szCs w:val="24"/>
+        </w:rPr>
+        <w:t xml:space="preserve"> (</w:t>
+      </w:r>
+      <w:r>
+        <w:rPr>
+          <w:rFonts w:ascii="Goudy Old Style" w:hAnsi="Goudy Old Style" w:cs="Times New Roman"/>
+          <w:sz w:val="24"/>
+          <w:szCs w:val="24"/>
+        </w:rPr>
+        <w:t xml:space="preserve">ln(biomass) = </w:t>
+      </w:r>
+      <w:r>
+        <w:rPr>
+          <w:rFonts w:ascii="Goudy Old Style" w:hAnsi="Goudy Old Style" w:cs="Times New Roman"/>
+          <w:sz w:val="24"/>
+          <w:szCs w:val="24"/>
+        </w:rPr>
+        <w:t>slope x ln(size) + ln(intercept))</w:t>
+      </w:r>
+    </w:p>
+    <w:p>
+      <w:pPr>
+        <w:contextualSpacing/>
+        <w:rPr>
+          <w:rFonts w:ascii="Goudy Old Style" w:hAnsi="Goudy Old Style" w:cs="Times New Roman"/>
+          <w:sz w:val="24"/>
+          <w:szCs w:val="24"/>
+        </w:rPr>
+      </w:pPr>
+      <w:r>
+        <w:rPr>
+          <w:rFonts w:ascii="Goudy Old Style" w:hAnsi="Goudy Old Style" w:cs="Times New Roman"/>
+          <w:sz w:val="24"/>
+          <w:szCs w:val="24"/>
+        </w:rPr>
+        <w:sym w:font="Wingdings" w:char="F0E0"/>
+      </w:r>
+      <w:r>
+        <w:rPr>
+          <w:rFonts w:ascii="Goudy Old Style" w:hAnsi="Goudy Old Style" w:cs="Times New Roman"/>
+          <w:sz w:val="24"/>
+          <w:szCs w:val="24"/>
+        </w:rPr>
+        <w:t xml:space="preserve"> has an exception argument, so far used for Acari, because equation used generates weight in micrograms, not milligrams (argument controls the conversion)</w:t>
+      </w:r>
+    </w:p>
+    <w:p>
+      <w:pPr>
+        <w:rPr>
+          <w:rFonts w:ascii="Goudy Old Style" w:hAnsi="Goudy Old Style" w:cs="Times New Roman"/>
+          <w:sz w:val="24"/>
+          <w:szCs w:val="24"/>
+        </w:rPr>
+      </w:pPr>
+      <w:r>
+        <w:rPr>
+          <w:rFonts w:ascii="Goudy Old Style" w:hAnsi="Goudy Old Style" w:cs="Times New Roman"/>
+          <w:sz w:val="24"/>
+          <w:szCs w:val="24"/>
+        </w:rPr>
+        <w:br w:type="page"/>
       </w:r>
       <w:r>
         <w:rPr>
@@ -2479,1496 +3342,6 @@
           <w:sz w:val="28"/>
           <w:szCs w:val="28"/>
         </w:rPr>
-        <w:t>:</w:t>
-      </w:r>
-    </w:p>
-    <w:p>
-      <w:pPr>
-        <w:contextualSpacing/>
-        <w:rPr>
-          <w:rFonts w:ascii="Goudy Old Style" w:hAnsi="Goudy Old Style" w:cs="Times New Roman"/>
-          <w:sz w:val="24"/>
-          <w:szCs w:val="24"/>
-        </w:rPr>
-      </w:pPr>
-    </w:p>
-    <w:p>
-      <w:pPr>
-        <w:contextualSpacing/>
-        <w:rPr>
-          <w:rFonts w:ascii="Goudy Old Style" w:hAnsi="Goudy Old Style" w:cs="Times New Roman"/>
-          <w:sz w:val="24"/>
-          <w:szCs w:val="24"/>
-        </w:rPr>
-      </w:pPr>
-      <w:proofErr w:type="spellStart"/>
-      <w:r>
-        <w:rPr>
-          <w:rFonts w:ascii="Goudy Old Style" w:hAnsi="Goudy Old Style" w:cs="Times New Roman"/>
-          <w:sz w:val="24"/>
-          <w:szCs w:val="24"/>
-        </w:rPr>
-        <w:t>hello_</w:t>
-      </w:r>
-      <w:proofErr w:type="gramStart"/>
-      <w:r>
-        <w:rPr>
-          <w:rFonts w:ascii="Goudy Old Style" w:hAnsi="Goudy Old Style" w:cs="Times New Roman"/>
-          <w:sz w:val="24"/>
-          <w:szCs w:val="24"/>
-        </w:rPr>
-        <w:t>metry</w:t>
-      </w:r>
-      <w:proofErr w:type="spellEnd"/>
-      <w:r>
-        <w:rPr>
-          <w:rFonts w:ascii="Goudy Old Style" w:hAnsi="Goudy Old Style" w:cs="Times New Roman"/>
-          <w:sz w:val="24"/>
-          <w:szCs w:val="24"/>
-        </w:rPr>
-        <w:t>(</w:t>
-      </w:r>
-      <w:proofErr w:type="spellStart"/>
-      <w:proofErr w:type="gramEnd"/>
-      <w:r>
-        <w:rPr>
-          <w:rFonts w:ascii="Goudy Old Style" w:hAnsi="Goudy Old Style" w:cs="Times New Roman"/>
-          <w:sz w:val="24"/>
-          <w:szCs w:val="24"/>
-        </w:rPr>
-        <w:t>equation_table</w:t>
-      </w:r>
-      <w:proofErr w:type="spellEnd"/>
-      <w:r>
-        <w:rPr>
-          <w:rFonts w:ascii="Goudy Old Style" w:hAnsi="Goudy Old Style" w:cs="Times New Roman"/>
-          <w:sz w:val="24"/>
-          <w:szCs w:val="24"/>
-        </w:rPr>
-        <w:t xml:space="preserve">, </w:t>
-      </w:r>
-      <w:proofErr w:type="spellStart"/>
-      <w:r>
-        <w:rPr>
-          <w:rFonts w:ascii="Goudy Old Style" w:hAnsi="Goudy Old Style" w:cs="Times New Roman"/>
-          <w:sz w:val="24"/>
-          <w:szCs w:val="24"/>
-        </w:rPr>
-        <w:t>measurement_table</w:t>
-      </w:r>
-      <w:proofErr w:type="spellEnd"/>
-      <w:r>
-        <w:rPr>
-          <w:rFonts w:ascii="Goudy Old Style" w:hAnsi="Goudy Old Style" w:cs="Times New Roman"/>
-          <w:sz w:val="24"/>
-          <w:szCs w:val="24"/>
-        </w:rPr>
-        <w:t xml:space="preserve">, </w:t>
-      </w:r>
-      <w:proofErr w:type="spellStart"/>
-      <w:r>
-        <w:rPr>
-          <w:rFonts w:ascii="Goudy Old Style" w:hAnsi="Goudy Old Style" w:cs="Times New Roman"/>
-          <w:sz w:val="24"/>
-          <w:szCs w:val="24"/>
-        </w:rPr>
-        <w:t>data_table</w:t>
-      </w:r>
-      <w:proofErr w:type="spellEnd"/>
-      <w:r>
-        <w:rPr>
-          <w:rFonts w:ascii="Goudy Old Style" w:hAnsi="Goudy Old Style" w:cs="Times New Roman"/>
-          <w:sz w:val="24"/>
-          <w:szCs w:val="24"/>
-        </w:rPr>
-        <w:t>, print</w:t>
-      </w:r>
-      <w:r>
-        <w:rPr>
-          <w:rFonts w:ascii="Goudy Old Style" w:hAnsi="Goudy Old Style" w:cs="Times New Roman"/>
-          <w:sz w:val="24"/>
-          <w:szCs w:val="24"/>
-        </w:rPr>
-        <w:t>)</w:t>
-      </w:r>
-    </w:p>
-    <w:p>
-      <w:pPr>
-        <w:contextualSpacing/>
-        <w:rPr>
-          <w:rFonts w:ascii="Goudy Old Style" w:hAnsi="Goudy Old Style" w:cs="Times New Roman"/>
-          <w:b/>
-          <w:bCs/>
-          <w:sz w:val="28"/>
-          <w:szCs w:val="28"/>
-        </w:rPr>
-      </w:pPr>
-      <w:r>
-        <w:rPr>
-          <w:rFonts w:ascii="Goudy Old Style" w:hAnsi="Goudy Old Style" w:cs="Times New Roman"/>
-          <w:sz w:val="24"/>
-          <w:szCs w:val="24"/>
-        </w:rPr>
-        <w:sym w:font="Wingdings" w:char="F0E0"/>
-      </w:r>
-      <w:r>
-        <w:rPr>
-          <w:rFonts w:ascii="Goudy Old Style" w:hAnsi="Goudy Old Style" w:cs="Times New Roman"/>
-          <w:sz w:val="24"/>
-          <w:szCs w:val="24"/>
-        </w:rPr>
-        <w:t xml:space="preserve"> wrapper function, returns</w:t>
-      </w:r>
-      <w:r>
-        <w:rPr>
-          <w:rFonts w:ascii="Goudy Old Style" w:hAnsi="Goudy Old Style" w:cs="Times New Roman"/>
-          <w:sz w:val="24"/>
-          <w:szCs w:val="24"/>
-        </w:rPr>
-        <w:t xml:space="preserve"> initial data table with two extra columns:</w:t>
-      </w:r>
-      <w:r>
-        <w:rPr>
-          <w:rFonts w:ascii="Goudy Old Style" w:hAnsi="Goudy Old Style" w:cs="Times New Roman"/>
-          <w:sz w:val="24"/>
-          <w:szCs w:val="24"/>
-        </w:rPr>
-        <w:t xml:space="preserve"> total biomass from given species, size and abundance</w:t>
-      </w:r>
-      <w:r>
-        <w:rPr>
-          <w:rFonts w:ascii="Goudy Old Style" w:hAnsi="Goudy Old Style" w:cs="Times New Roman"/>
-          <w:sz w:val="24"/>
-          <w:szCs w:val="24"/>
-        </w:rPr>
-        <w:t>, as well as path taken through the function</w:t>
-      </w:r>
-    </w:p>
-    <w:p>
-      <w:pPr>
-        <w:contextualSpacing/>
-        <w:rPr>
-          <w:rFonts w:ascii="Goudy Old Style" w:hAnsi="Goudy Old Style" w:cs="Times New Roman"/>
-          <w:sz w:val="24"/>
-          <w:szCs w:val="24"/>
-        </w:rPr>
-      </w:pPr>
-    </w:p>
-    <w:p>
-      <w:pPr>
-        <w:contextualSpacing/>
-        <w:rPr>
-          <w:rFonts w:ascii="Goudy Old Style" w:hAnsi="Goudy Old Style" w:cs="Times New Roman"/>
-          <w:sz w:val="24"/>
-          <w:szCs w:val="24"/>
-        </w:rPr>
-      </w:pPr>
-    </w:p>
-    <w:p>
-      <w:pPr>
-        <w:contextualSpacing/>
-        <w:rPr>
-          <w:rFonts w:ascii="Goudy Old Style" w:hAnsi="Goudy Old Style" w:cs="Times New Roman"/>
-          <w:sz w:val="24"/>
-          <w:szCs w:val="24"/>
-        </w:rPr>
-      </w:pPr>
-      <w:proofErr w:type="spellStart"/>
-      <w:proofErr w:type="gramStart"/>
-      <w:r>
-        <w:rPr>
-          <w:rFonts w:ascii="Goudy Old Style" w:hAnsi="Goudy Old Style" w:cs="Times New Roman"/>
-          <w:sz w:val="24"/>
-          <w:szCs w:val="24"/>
-        </w:rPr>
-        <w:t>sizest</w:t>
-      </w:r>
-      <w:proofErr w:type="spellEnd"/>
-      <w:r>
-        <w:rPr>
-          <w:rFonts w:ascii="Goudy Old Style" w:hAnsi="Goudy Old Style" w:cs="Times New Roman"/>
-          <w:sz w:val="24"/>
-          <w:szCs w:val="24"/>
-        </w:rPr>
-        <w:t>(</w:t>
-      </w:r>
-      <w:proofErr w:type="spellStart"/>
-      <w:proofErr w:type="gramEnd"/>
-      <w:r>
-        <w:rPr>
-          <w:rFonts w:ascii="Goudy Old Style" w:hAnsi="Goudy Old Style" w:cs="Times New Roman"/>
-          <w:sz w:val="24"/>
-          <w:szCs w:val="24"/>
-        </w:rPr>
-        <w:t>specname</w:t>
-      </w:r>
-      <w:proofErr w:type="spellEnd"/>
-      <w:r>
-        <w:rPr>
-          <w:rFonts w:ascii="Goudy Old Style" w:hAnsi="Goudy Old Style" w:cs="Times New Roman"/>
-          <w:sz w:val="24"/>
-          <w:szCs w:val="24"/>
-        </w:rPr>
-        <w:t xml:space="preserve">, size, level, path, </w:t>
-      </w:r>
-      <w:proofErr w:type="spellStart"/>
-      <w:r>
-        <w:rPr>
-          <w:rFonts w:ascii="Goudy Old Style" w:hAnsi="Goudy Old Style" w:cs="Times New Roman"/>
-          <w:sz w:val="24"/>
-          <w:szCs w:val="24"/>
-        </w:rPr>
-        <w:t>taxo</w:t>
-      </w:r>
-      <w:proofErr w:type="spellEnd"/>
-      <w:r>
-        <w:rPr>
-          <w:rFonts w:ascii="Goudy Old Style" w:hAnsi="Goudy Old Style" w:cs="Times New Roman"/>
-          <w:sz w:val="24"/>
-          <w:szCs w:val="24"/>
-        </w:rPr>
-        <w:t xml:space="preserve">, </w:t>
-      </w:r>
-      <w:proofErr w:type="spellStart"/>
-      <w:r>
-        <w:rPr>
-          <w:rFonts w:ascii="Goudy Old Style" w:hAnsi="Goudy Old Style" w:cs="Times New Roman"/>
-          <w:sz w:val="24"/>
-          <w:szCs w:val="24"/>
-        </w:rPr>
-        <w:t>equation_table</w:t>
-      </w:r>
-      <w:proofErr w:type="spellEnd"/>
-      <w:r>
-        <w:rPr>
-          <w:rFonts w:ascii="Goudy Old Style" w:hAnsi="Goudy Old Style" w:cs="Times New Roman"/>
-          <w:sz w:val="24"/>
-          <w:szCs w:val="24"/>
-        </w:rPr>
-        <w:t xml:space="preserve">, </w:t>
-      </w:r>
-      <w:proofErr w:type="spellStart"/>
-      <w:r>
-        <w:rPr>
-          <w:rFonts w:ascii="Goudy Old Style" w:hAnsi="Goudy Old Style" w:cs="Times New Roman"/>
-          <w:sz w:val="24"/>
-          <w:szCs w:val="24"/>
-        </w:rPr>
-        <w:t>measurement_table</w:t>
-      </w:r>
-      <w:proofErr w:type="spellEnd"/>
-      <w:r>
-        <w:rPr>
-          <w:rFonts w:ascii="Goudy Old Style" w:hAnsi="Goudy Old Style" w:cs="Times New Roman"/>
-          <w:sz w:val="24"/>
-          <w:szCs w:val="24"/>
-        </w:rPr>
-        <w:t xml:space="preserve">, </w:t>
-      </w:r>
-      <w:proofErr w:type="spellStart"/>
-      <w:r>
-        <w:rPr>
-          <w:rFonts w:ascii="Goudy Old Style" w:hAnsi="Goudy Old Style" w:cs="Times New Roman"/>
-          <w:sz w:val="24"/>
-          <w:szCs w:val="24"/>
-        </w:rPr>
-        <w:t>data_table</w:t>
-      </w:r>
-      <w:proofErr w:type="spellEnd"/>
-      <w:r>
-        <w:rPr>
-          <w:rFonts w:ascii="Goudy Old Style" w:hAnsi="Goudy Old Style" w:cs="Times New Roman"/>
-          <w:sz w:val="24"/>
-          <w:szCs w:val="24"/>
-        </w:rPr>
-        <w:t>)</w:t>
-      </w:r>
-    </w:p>
-    <w:p>
-      <w:pPr>
-        <w:contextualSpacing/>
-        <w:rPr>
-          <w:rFonts w:ascii="Goudy Old Style" w:hAnsi="Goudy Old Style" w:cs="Times New Roman"/>
-          <w:sz w:val="24"/>
-          <w:szCs w:val="24"/>
-        </w:rPr>
-      </w:pPr>
-      <w:r>
-        <w:rPr>
-          <w:rFonts w:ascii="Goudy Old Style" w:hAnsi="Goudy Old Style" w:cs="Times New Roman"/>
-          <w:sz w:val="24"/>
-          <w:szCs w:val="24"/>
-        </w:rPr>
-        <w:sym w:font="Wingdings" w:char="F0E0"/>
-      </w:r>
-      <w:r>
-        <w:rPr>
-          <w:rFonts w:ascii="Goudy Old Style" w:hAnsi="Goudy Old Style" w:cs="Times New Roman"/>
-          <w:sz w:val="24"/>
-          <w:szCs w:val="24"/>
-        </w:rPr>
-        <w:t xml:space="preserve"> returns size estimate</w:t>
-      </w:r>
-      <w:r>
-        <w:rPr>
-          <w:rFonts w:ascii="Goudy Old Style" w:hAnsi="Goudy Old Style" w:cs="Times New Roman"/>
-          <w:sz w:val="24"/>
-          <w:szCs w:val="24"/>
-        </w:rPr>
-        <w:t xml:space="preserve"> based on taxonomic approach or trait approach</w:t>
-      </w:r>
-    </w:p>
-    <w:p>
-      <w:pPr>
-        <w:contextualSpacing/>
-        <w:rPr>
-          <w:rFonts w:ascii="Goudy Old Style" w:hAnsi="Goudy Old Style" w:cs="Times New Roman"/>
-          <w:sz w:val="24"/>
-          <w:szCs w:val="24"/>
-        </w:rPr>
-      </w:pPr>
-      <w:r>
-        <w:rPr>
-          <w:rFonts w:ascii="Goudy Old Style" w:hAnsi="Goudy Old Style" w:cs="Times New Roman"/>
-          <w:sz w:val="24"/>
-          <w:szCs w:val="24"/>
-        </w:rPr>
-        <w:sym w:font="Wingdings" w:char="F0E0"/>
-      </w:r>
-      <w:r>
-        <w:rPr>
-          <w:rFonts w:ascii="Goudy Old Style" w:hAnsi="Goudy Old Style" w:cs="Times New Roman"/>
-          <w:sz w:val="24"/>
-          <w:szCs w:val="24"/>
-        </w:rPr>
-        <w:t xml:space="preserve"> </w:t>
-      </w:r>
-      <w:r>
-        <w:rPr>
-          <w:rFonts w:ascii="Goudy Old Style" w:hAnsi="Goudy Old Style" w:cs="Times New Roman"/>
-          <w:sz w:val="24"/>
-          <w:szCs w:val="24"/>
-        </w:rPr>
-        <w:t xml:space="preserve">Collect abundance/size distribution from species in </w:t>
-      </w:r>
-      <w:r>
-        <w:rPr>
-          <w:rFonts w:ascii="Goudy Old Style" w:hAnsi="Goudy Old Style" w:cs="Times New Roman"/>
-          <w:b/>
-          <w:bCs/>
-          <w:sz w:val="24"/>
-          <w:szCs w:val="24"/>
-        </w:rPr>
-        <w:t xml:space="preserve">both </w:t>
-      </w:r>
-      <w:r>
-        <w:rPr>
-          <w:rFonts w:ascii="Goudy Old Style" w:hAnsi="Goudy Old Style" w:cs="Times New Roman"/>
-          <w:sz w:val="24"/>
-          <w:szCs w:val="24"/>
-        </w:rPr>
-        <w:t>measurement</w:t>
-      </w:r>
-      <w:r>
-        <w:rPr>
-          <w:rFonts w:ascii="Goudy Old Style" w:hAnsi="Goudy Old Style" w:cs="Times New Roman"/>
-          <w:sz w:val="24"/>
-          <w:szCs w:val="24"/>
-        </w:rPr>
-        <w:t xml:space="preserve"> and data tables. Look for at least three distinct numeric measurements in</w:t>
-      </w:r>
-      <w:r>
-        <w:rPr>
-          <w:rFonts w:ascii="Goudy Old Style" w:hAnsi="Goudy Old Style" w:cs="Times New Roman"/>
-          <w:sz w:val="24"/>
-          <w:szCs w:val="24"/>
-        </w:rPr>
-        <w:t xml:space="preserve"> a given grouping in</w:t>
-      </w:r>
-      <w:r>
-        <w:rPr>
-          <w:rFonts w:ascii="Goudy Old Style" w:hAnsi="Goudy Old Style" w:cs="Times New Roman"/>
-          <w:sz w:val="24"/>
-          <w:szCs w:val="24"/>
-        </w:rPr>
-        <w:t xml:space="preserve"> the following order: species to family, traits, suborder to </w:t>
-      </w:r>
-      <w:r>
-        <w:rPr>
-          <w:rFonts w:ascii="Goudy Old Style" w:hAnsi="Goudy Old Style" w:cs="Times New Roman"/>
-          <w:sz w:val="24"/>
-          <w:szCs w:val="24"/>
-        </w:rPr>
-        <w:t>phylum</w:t>
-      </w:r>
-      <w:r>
-        <w:rPr>
-          <w:rFonts w:ascii="Goudy Old Style" w:hAnsi="Goudy Old Style" w:cs="Times New Roman"/>
-          <w:sz w:val="24"/>
-          <w:szCs w:val="24"/>
-        </w:rPr>
-        <w:t>.</w:t>
-      </w:r>
-    </w:p>
-    <w:p>
-      <w:pPr>
-        <w:contextualSpacing/>
-        <w:rPr>
-          <w:rFonts w:ascii="Goudy Old Style" w:hAnsi="Goudy Old Style" w:cs="Times New Roman"/>
-          <w:sz w:val="24"/>
-          <w:szCs w:val="24"/>
-        </w:rPr>
-      </w:pPr>
-      <w:r>
-        <w:rPr>
-          <w:rFonts w:ascii="Goudy Old Style" w:hAnsi="Goudy Old Style" w:cs="Times New Roman"/>
-          <w:sz w:val="24"/>
-          <w:szCs w:val="24"/>
-        </w:rPr>
-        <w:sym w:font="Wingdings" w:char="F0E0"/>
-      </w:r>
-      <w:r>
-        <w:rPr>
-          <w:rFonts w:ascii="Goudy Old Style" w:hAnsi="Goudy Old Style" w:cs="Times New Roman"/>
-          <w:sz w:val="24"/>
-          <w:szCs w:val="24"/>
-        </w:rPr>
-        <w:t xml:space="preserve"> </w:t>
-      </w:r>
-      <w:r>
-        <w:rPr>
-          <w:rFonts w:ascii="Goudy Old Style" w:hAnsi="Goudy Old Style" w:cs="Times New Roman"/>
-          <w:sz w:val="24"/>
-          <w:szCs w:val="24"/>
-        </w:rPr>
-        <w:t>Once threshold of at least three distinct numeric measurements is met</w:t>
-      </w:r>
-      <w:r>
-        <w:rPr>
-          <w:rFonts w:ascii="Goudy Old Style" w:hAnsi="Goudy Old Style" w:cs="Times New Roman"/>
-          <w:sz w:val="24"/>
-          <w:szCs w:val="24"/>
-        </w:rPr>
-        <w:t>:</w:t>
-      </w:r>
-    </w:p>
-    <w:p>
-      <w:pPr>
-        <w:contextualSpacing/>
-        <w:rPr>
-          <w:rFonts w:ascii="Goudy Old Style" w:hAnsi="Goudy Old Style" w:cs="Times New Roman"/>
-          <w:sz w:val="24"/>
-          <w:szCs w:val="24"/>
-        </w:rPr>
-      </w:pPr>
-      <w:r>
-        <w:rPr>
-          <w:rFonts w:ascii="Goudy Old Style" w:hAnsi="Goudy Old Style" w:cs="Times New Roman"/>
-          <w:sz w:val="24"/>
-          <w:szCs w:val="24"/>
-        </w:rPr>
-        <w:tab/>
-        <w:t xml:space="preserve">- if </w:t>
-      </w:r>
-      <w:r>
-        <w:rPr>
-          <w:rFonts w:ascii="Goudy Old Style" w:hAnsi="Goudy Old Style" w:cs="Times New Roman"/>
-          <w:sz w:val="24"/>
-          <w:szCs w:val="24"/>
-        </w:rPr>
-        <w:t>size category “unknown”</w:t>
-      </w:r>
-      <w:r>
-        <w:rPr>
-          <w:rFonts w:ascii="Goudy Old Style" w:hAnsi="Goudy Old Style" w:cs="Times New Roman"/>
-          <w:sz w:val="24"/>
-          <w:szCs w:val="24"/>
-        </w:rPr>
-        <w:t>, r</w:t>
-      </w:r>
-      <w:r>
-        <w:rPr>
-          <w:rFonts w:ascii="Goudy Old Style" w:hAnsi="Goudy Old Style" w:cs="Times New Roman"/>
-          <w:sz w:val="24"/>
-          <w:szCs w:val="24"/>
-        </w:rPr>
-        <w:t xml:space="preserve">eturn weighted average of all available measurements </w:t>
-      </w:r>
-    </w:p>
-    <w:p>
-      <w:pPr>
-        <w:contextualSpacing/>
-        <w:rPr>
-          <w:rFonts w:ascii="Goudy Old Style" w:hAnsi="Goudy Old Style" w:cs="Times New Roman"/>
-          <w:sz w:val="24"/>
-          <w:szCs w:val="24"/>
-        </w:rPr>
-      </w:pPr>
-      <w:r>
-        <w:rPr>
-          <w:rFonts w:ascii="Goudy Old Style" w:hAnsi="Goudy Old Style" w:cs="Times New Roman"/>
-          <w:sz w:val="24"/>
-          <w:szCs w:val="24"/>
-        </w:rPr>
-        <w:tab/>
-        <w:t xml:space="preserve">- if </w:t>
-      </w:r>
-      <w:r>
-        <w:rPr>
-          <w:rFonts w:ascii="Goudy Old Style" w:hAnsi="Goudy Old Style" w:cs="Times New Roman"/>
-          <w:sz w:val="24"/>
-          <w:szCs w:val="24"/>
-        </w:rPr>
-        <w:t>size category one of S, M, L</w:t>
-      </w:r>
-      <w:r>
-        <w:rPr>
-          <w:rFonts w:ascii="Goudy Old Style" w:hAnsi="Goudy Old Style" w:cs="Times New Roman"/>
-          <w:sz w:val="24"/>
-          <w:szCs w:val="24"/>
-        </w:rPr>
-        <w:t>, d</w:t>
-      </w:r>
-      <w:r>
-        <w:rPr>
-          <w:rFonts w:ascii="Goudy Old Style" w:hAnsi="Goudy Old Style" w:cs="Times New Roman"/>
-          <w:sz w:val="24"/>
-          <w:szCs w:val="24"/>
-        </w:rPr>
-        <w:t>ivide measurements into three bins</w:t>
-      </w:r>
-      <w:r>
-        <w:rPr>
-          <w:rFonts w:ascii="Goudy Old Style" w:hAnsi="Goudy Old Style" w:cs="Times New Roman"/>
-          <w:sz w:val="24"/>
-          <w:szCs w:val="24"/>
-        </w:rPr>
-        <w:t xml:space="preserve"> of unique </w:t>
-      </w:r>
-    </w:p>
-    <w:p>
-      <w:pPr>
-        <w:ind w:left="720" w:firstLine="120"/>
-        <w:contextualSpacing/>
-        <w:rPr>
-          <w:rFonts w:ascii="Goudy Old Style" w:hAnsi="Goudy Old Style" w:cs="Times New Roman"/>
-          <w:sz w:val="24"/>
-          <w:szCs w:val="24"/>
-        </w:rPr>
-      </w:pPr>
-      <w:r>
-        <w:rPr>
-          <w:rFonts w:ascii="Goudy Old Style" w:hAnsi="Goudy Old Style" w:cs="Times New Roman"/>
-          <w:sz w:val="24"/>
-          <w:szCs w:val="24"/>
-        </w:rPr>
-        <w:t>measurement values</w:t>
-      </w:r>
-      <w:r>
-        <w:rPr>
-          <w:rFonts w:ascii="Goudy Old Style" w:hAnsi="Goudy Old Style" w:cs="Times New Roman"/>
-          <w:sz w:val="24"/>
-          <w:szCs w:val="24"/>
-        </w:rPr>
-        <w:t>, if bins not equal, larger bins for S and L</w:t>
-      </w:r>
-      <w:r>
-        <w:rPr>
-          <w:rFonts w:ascii="Goudy Old Style" w:hAnsi="Goudy Old Style" w:cs="Times New Roman"/>
-          <w:sz w:val="24"/>
-          <w:szCs w:val="24"/>
-        </w:rPr>
-        <w:t xml:space="preserve">. </w:t>
-      </w:r>
-      <w:r>
-        <w:rPr>
-          <w:rFonts w:ascii="Goudy Old Style" w:hAnsi="Goudy Old Style" w:cs="Times New Roman"/>
-          <w:sz w:val="24"/>
-          <w:szCs w:val="24"/>
-        </w:rPr>
-        <w:t xml:space="preserve">Return average of </w:t>
-      </w:r>
-      <w:r>
-        <w:rPr>
-          <w:rFonts w:ascii="Goudy Old Style" w:hAnsi="Goudy Old Style" w:cs="Times New Roman"/>
-          <w:sz w:val="24"/>
-          <w:szCs w:val="24"/>
-        </w:rPr>
-        <w:t xml:space="preserve">    </w:t>
-      </w:r>
-    </w:p>
-    <w:p>
-      <w:pPr>
-        <w:ind w:left="720" w:firstLine="120"/>
-        <w:contextualSpacing/>
-        <w:rPr>
-          <w:rFonts w:ascii="Goudy Old Style" w:hAnsi="Goudy Old Style" w:cs="Times New Roman"/>
-          <w:sz w:val="24"/>
-          <w:szCs w:val="24"/>
-        </w:rPr>
-      </w:pPr>
-      <w:r>
-        <w:rPr>
-          <w:rFonts w:ascii="Goudy Old Style" w:hAnsi="Goudy Old Style" w:cs="Times New Roman"/>
-          <w:sz w:val="24"/>
-          <w:szCs w:val="24"/>
-        </w:rPr>
-        <w:t>measurements within given bin</w:t>
-      </w:r>
-    </w:p>
-    <w:p>
-      <w:pPr>
-        <w:contextualSpacing/>
-        <w:rPr>
-          <w:rFonts w:ascii="Goudy Old Style" w:hAnsi="Goudy Old Style" w:cs="Times New Roman"/>
-          <w:sz w:val="24"/>
-          <w:szCs w:val="24"/>
-        </w:rPr>
-      </w:pPr>
-    </w:p>
-    <w:p>
-      <w:pPr>
-        <w:contextualSpacing/>
-        <w:rPr>
-          <w:rFonts w:ascii="Goudy Old Style" w:hAnsi="Goudy Old Style" w:cs="Times New Roman"/>
-          <w:sz w:val="24"/>
-          <w:szCs w:val="24"/>
-        </w:rPr>
-      </w:pPr>
-    </w:p>
-    <w:p>
-      <w:pPr>
-        <w:contextualSpacing/>
-        <w:rPr>
-          <w:rFonts w:ascii="Goudy Old Style" w:hAnsi="Goudy Old Style" w:cs="Times New Roman"/>
-          <w:sz w:val="24"/>
-          <w:szCs w:val="24"/>
-        </w:rPr>
-      </w:pPr>
-      <w:proofErr w:type="spellStart"/>
-      <w:r>
-        <w:rPr>
-          <w:rFonts w:ascii="Goudy Old Style" w:hAnsi="Goudy Old Style" w:cs="Times New Roman"/>
-          <w:sz w:val="24"/>
-          <w:szCs w:val="24"/>
-        </w:rPr>
-        <w:t>get_</w:t>
-      </w:r>
-      <w:r>
-        <w:rPr>
-          <w:rFonts w:ascii="Goudy Old Style" w:hAnsi="Goudy Old Style" w:cs="Times New Roman"/>
-          <w:sz w:val="24"/>
-          <w:szCs w:val="24"/>
-        </w:rPr>
-        <w:t>allometric_</w:t>
-      </w:r>
-      <w:proofErr w:type="gramStart"/>
-      <w:r>
-        <w:rPr>
-          <w:rFonts w:ascii="Goudy Old Style" w:hAnsi="Goudy Old Style" w:cs="Times New Roman"/>
-          <w:sz w:val="24"/>
-          <w:szCs w:val="24"/>
-        </w:rPr>
-        <w:t>equations</w:t>
-      </w:r>
-      <w:proofErr w:type="spellEnd"/>
-      <w:r>
-        <w:rPr>
-          <w:rFonts w:ascii="Goudy Old Style" w:hAnsi="Goudy Old Style" w:cs="Times New Roman"/>
-          <w:sz w:val="24"/>
-          <w:szCs w:val="24"/>
-        </w:rPr>
-        <w:t>(</w:t>
-      </w:r>
-      <w:proofErr w:type="spellStart"/>
-      <w:proofErr w:type="gramEnd"/>
-      <w:r>
-        <w:rPr>
-          <w:rFonts w:ascii="Goudy Old Style" w:hAnsi="Goudy Old Style" w:cs="Times New Roman"/>
-          <w:sz w:val="24"/>
-          <w:szCs w:val="24"/>
-        </w:rPr>
-        <w:t>specname</w:t>
-      </w:r>
-      <w:proofErr w:type="spellEnd"/>
-      <w:r>
-        <w:rPr>
-          <w:rFonts w:ascii="Goudy Old Style" w:hAnsi="Goudy Old Style" w:cs="Times New Roman"/>
-          <w:sz w:val="24"/>
-          <w:szCs w:val="24"/>
-        </w:rPr>
-        <w:t xml:space="preserve">, level, size, abundance, path, </w:t>
-      </w:r>
-      <w:proofErr w:type="spellStart"/>
-      <w:r>
-        <w:rPr>
-          <w:rFonts w:ascii="Goudy Old Style" w:hAnsi="Goudy Old Style" w:cs="Times New Roman"/>
-          <w:sz w:val="24"/>
-          <w:szCs w:val="24"/>
-        </w:rPr>
-        <w:t>taxo</w:t>
-      </w:r>
-      <w:proofErr w:type="spellEnd"/>
-      <w:r>
-        <w:rPr>
-          <w:rFonts w:ascii="Goudy Old Style" w:hAnsi="Goudy Old Style" w:cs="Times New Roman"/>
-          <w:sz w:val="24"/>
-          <w:szCs w:val="24"/>
-        </w:rPr>
-        <w:t xml:space="preserve">, </w:t>
-      </w:r>
-      <w:proofErr w:type="spellStart"/>
-      <w:r>
-        <w:rPr>
-          <w:rFonts w:ascii="Goudy Old Style" w:hAnsi="Goudy Old Style" w:cs="Times New Roman"/>
-          <w:sz w:val="24"/>
-          <w:szCs w:val="24"/>
-        </w:rPr>
-        <w:t>equation_table</w:t>
-      </w:r>
-      <w:proofErr w:type="spellEnd"/>
-      <w:r>
-        <w:rPr>
-          <w:rFonts w:ascii="Goudy Old Style" w:hAnsi="Goudy Old Style" w:cs="Times New Roman"/>
-          <w:sz w:val="24"/>
-          <w:szCs w:val="24"/>
-        </w:rPr>
-        <w:t xml:space="preserve">, </w:t>
-      </w:r>
-      <w:proofErr w:type="spellStart"/>
-      <w:r>
-        <w:rPr>
-          <w:rFonts w:ascii="Goudy Old Style" w:hAnsi="Goudy Old Style" w:cs="Times New Roman"/>
-          <w:sz w:val="24"/>
-          <w:szCs w:val="24"/>
-        </w:rPr>
-        <w:t>measurement_table</w:t>
-      </w:r>
-      <w:proofErr w:type="spellEnd"/>
-      <w:r>
-        <w:rPr>
-          <w:rFonts w:ascii="Goudy Old Style" w:hAnsi="Goudy Old Style" w:cs="Times New Roman"/>
-          <w:sz w:val="24"/>
-          <w:szCs w:val="24"/>
-        </w:rPr>
-        <w:t>)</w:t>
-      </w:r>
-    </w:p>
-    <w:p>
-      <w:pPr>
-        <w:contextualSpacing/>
-        <w:rPr>
-          <w:rFonts w:ascii="Goudy Old Style" w:hAnsi="Goudy Old Style" w:cs="Times New Roman"/>
-          <w:sz w:val="24"/>
-          <w:szCs w:val="24"/>
-        </w:rPr>
-      </w:pPr>
-      <w:r>
-        <w:rPr>
-          <w:rFonts w:ascii="Goudy Old Style" w:hAnsi="Goudy Old Style" w:cs="Times New Roman"/>
-          <w:sz w:val="24"/>
-          <w:szCs w:val="24"/>
-        </w:rPr>
-        <w:sym w:font="Wingdings" w:char="F0E0"/>
-      </w:r>
-      <w:r>
-        <w:rPr>
-          <w:rFonts w:ascii="Goudy Old Style" w:hAnsi="Goudy Old Style" w:cs="Times New Roman"/>
-          <w:sz w:val="24"/>
-          <w:szCs w:val="24"/>
-        </w:rPr>
-        <w:t xml:space="preserve"> look if raw biomass value exists for given measurement, use it if available</w:t>
-      </w:r>
-    </w:p>
-    <w:p>
-      <w:pPr>
-        <w:contextualSpacing/>
-        <w:rPr>
-          <w:rFonts w:ascii="Goudy Old Style" w:hAnsi="Goudy Old Style" w:cs="Times New Roman"/>
-          <w:sz w:val="24"/>
-          <w:szCs w:val="24"/>
-        </w:rPr>
-      </w:pPr>
-      <w:r>
-        <w:rPr>
-          <w:rFonts w:ascii="Goudy Old Style" w:hAnsi="Goudy Old Style" w:cs="Times New Roman"/>
-          <w:sz w:val="24"/>
-          <w:szCs w:val="24"/>
-        </w:rPr>
-        <w:sym w:font="Wingdings" w:char="F0E0"/>
-      </w:r>
-      <w:r>
-        <w:rPr>
-          <w:rFonts w:ascii="Goudy Old Style" w:hAnsi="Goudy Old Style" w:cs="Times New Roman"/>
-          <w:sz w:val="24"/>
-          <w:szCs w:val="24"/>
-        </w:rPr>
-        <w:t xml:space="preserve"> </w:t>
-      </w:r>
-      <w:r>
-        <w:rPr>
-          <w:rFonts w:ascii="Goudy Old Style" w:hAnsi="Goudy Old Style" w:cs="Times New Roman"/>
-          <w:sz w:val="24"/>
-          <w:szCs w:val="24"/>
-        </w:rPr>
-        <w:t>Look for at least one allometric equation in</w:t>
-      </w:r>
-      <w:r>
-        <w:rPr>
-          <w:rFonts w:ascii="Goudy Old Style" w:hAnsi="Goudy Old Style" w:cs="Times New Roman"/>
-          <w:sz w:val="24"/>
-          <w:szCs w:val="24"/>
-        </w:rPr>
-        <w:t xml:space="preserve"> a given grouping in</w:t>
-      </w:r>
-      <w:r>
-        <w:rPr>
-          <w:rFonts w:ascii="Goudy Old Style" w:hAnsi="Goudy Old Style" w:cs="Times New Roman"/>
-          <w:sz w:val="24"/>
-          <w:szCs w:val="24"/>
-        </w:rPr>
-        <w:t xml:space="preserve"> the following order: species to family, traits, suborder to </w:t>
-      </w:r>
-      <w:r>
-        <w:rPr>
-          <w:rFonts w:ascii="Goudy Old Style" w:hAnsi="Goudy Old Style" w:cs="Times New Roman"/>
-          <w:sz w:val="24"/>
-          <w:szCs w:val="24"/>
-        </w:rPr>
-        <w:t>phylum</w:t>
-      </w:r>
-    </w:p>
-    <w:p>
-      <w:pPr>
-        <w:contextualSpacing/>
-        <w:rPr>
-          <w:rFonts w:ascii="Goudy Old Style" w:hAnsi="Goudy Old Style" w:cs="Times New Roman"/>
-          <w:sz w:val="24"/>
-          <w:szCs w:val="24"/>
-        </w:rPr>
-      </w:pPr>
-      <w:r>
-        <w:rPr>
-          <w:rFonts w:ascii="Goudy Old Style" w:hAnsi="Goudy Old Style" w:cs="Times New Roman"/>
-          <w:sz w:val="24"/>
-          <w:szCs w:val="24"/>
-        </w:rPr>
-        <w:sym w:font="Wingdings" w:char="F0E0"/>
-      </w:r>
-      <w:r>
-        <w:rPr>
-          <w:rFonts w:ascii="Goudy Old Style" w:hAnsi="Goudy Old Style" w:cs="Times New Roman"/>
-          <w:sz w:val="24"/>
-          <w:szCs w:val="24"/>
-        </w:rPr>
-        <w:t xml:space="preserve"> </w:t>
-      </w:r>
-      <w:r>
-        <w:rPr>
-          <w:rFonts w:ascii="Goudy Old Style" w:hAnsi="Goudy Old Style" w:cs="Times New Roman"/>
-          <w:sz w:val="24"/>
-          <w:szCs w:val="24"/>
-        </w:rPr>
-        <w:t>Once threshold of at least one allometric equation is met</w:t>
-      </w:r>
-      <w:r>
-        <w:rPr>
-          <w:rFonts w:ascii="Goudy Old Style" w:hAnsi="Goudy Old Style" w:cs="Times New Roman"/>
-          <w:sz w:val="24"/>
-          <w:szCs w:val="24"/>
-        </w:rPr>
-        <w:t>:</w:t>
-      </w:r>
-    </w:p>
-    <w:p>
-      <w:pPr>
-        <w:contextualSpacing/>
-        <w:rPr>
-          <w:rFonts w:ascii="Goudy Old Style" w:hAnsi="Goudy Old Style" w:cs="Times New Roman"/>
-          <w:sz w:val="24"/>
-          <w:szCs w:val="24"/>
-        </w:rPr>
-      </w:pPr>
-      <w:r>
-        <w:rPr>
-          <w:rFonts w:ascii="Goudy Old Style" w:hAnsi="Goudy Old Style" w:cs="Times New Roman"/>
-          <w:sz w:val="24"/>
-          <w:szCs w:val="24"/>
-        </w:rPr>
-        <w:tab/>
-        <w:t>- if there is only one equation, compute value of biomass</w:t>
-      </w:r>
-    </w:p>
-    <w:p>
-      <w:pPr>
-        <w:contextualSpacing/>
-        <w:rPr>
-          <w:rFonts w:ascii="Goudy Old Style" w:hAnsi="Goudy Old Style" w:cs="Times New Roman"/>
-          <w:sz w:val="24"/>
-          <w:szCs w:val="24"/>
-        </w:rPr>
-      </w:pPr>
-      <w:r>
-        <w:rPr>
-          <w:rFonts w:ascii="Goudy Old Style" w:hAnsi="Goudy Old Style" w:cs="Times New Roman"/>
-          <w:sz w:val="24"/>
-          <w:szCs w:val="24"/>
-        </w:rPr>
-        <w:tab/>
-        <w:t>- if there is more than one allometric equation, average the computed values of biomass</w:t>
-      </w:r>
-    </w:p>
-    <w:p>
-      <w:pPr>
-        <w:contextualSpacing/>
-        <w:rPr>
-          <w:rFonts w:ascii="Goudy Old Style" w:hAnsi="Goudy Old Style" w:cs="Times New Roman"/>
-          <w:sz w:val="24"/>
-          <w:szCs w:val="24"/>
-        </w:rPr>
-      </w:pPr>
-    </w:p>
-    <w:p>
-      <w:pPr>
-        <w:contextualSpacing/>
-        <w:rPr>
-          <w:rFonts w:ascii="Goudy Old Style" w:hAnsi="Goudy Old Style" w:cs="Times New Roman"/>
-          <w:sz w:val="24"/>
-          <w:szCs w:val="24"/>
-        </w:rPr>
-      </w:pPr>
-    </w:p>
-    <w:p>
-      <w:pPr>
-        <w:contextualSpacing/>
-        <w:rPr>
-          <w:rFonts w:ascii="Goudy Old Style" w:hAnsi="Goudy Old Style" w:cs="Times New Roman"/>
-          <w:sz w:val="24"/>
-          <w:szCs w:val="24"/>
-        </w:rPr>
-      </w:pPr>
-      <w:proofErr w:type="spellStart"/>
-      <w:r>
-        <w:rPr>
-          <w:rFonts w:ascii="Goudy Old Style" w:hAnsi="Goudy Old Style" w:cs="Times New Roman"/>
-          <w:sz w:val="24"/>
-          <w:szCs w:val="24"/>
-        </w:rPr>
-        <w:t>matcher_of_</w:t>
-      </w:r>
-      <w:proofErr w:type="gramStart"/>
-      <w:r>
-        <w:rPr>
-          <w:rFonts w:ascii="Goudy Old Style" w:hAnsi="Goudy Old Style" w:cs="Times New Roman"/>
-          <w:sz w:val="24"/>
-          <w:szCs w:val="24"/>
-        </w:rPr>
-        <w:t>traits</w:t>
-      </w:r>
-      <w:proofErr w:type="spellEnd"/>
-      <w:r>
-        <w:rPr>
-          <w:rFonts w:ascii="Goudy Old Style" w:hAnsi="Goudy Old Style" w:cs="Times New Roman"/>
-          <w:sz w:val="24"/>
-          <w:szCs w:val="24"/>
-        </w:rPr>
-        <w:t>(</w:t>
-      </w:r>
-      <w:proofErr w:type="spellStart"/>
-      <w:proofErr w:type="gramEnd"/>
-      <w:r>
-        <w:rPr>
-          <w:rFonts w:ascii="Goudy Old Style" w:hAnsi="Goudy Old Style" w:cs="Times New Roman"/>
-          <w:sz w:val="24"/>
-          <w:szCs w:val="24"/>
-        </w:rPr>
-        <w:t>species_name</w:t>
-      </w:r>
-      <w:proofErr w:type="spellEnd"/>
-      <w:r>
-        <w:rPr>
-          <w:rFonts w:ascii="Goudy Old Style" w:hAnsi="Goudy Old Style" w:cs="Times New Roman"/>
-          <w:sz w:val="24"/>
-          <w:szCs w:val="24"/>
-        </w:rPr>
-        <w:t xml:space="preserve">, </w:t>
-      </w:r>
-      <w:proofErr w:type="spellStart"/>
-      <w:r>
-        <w:rPr>
-          <w:rFonts w:ascii="Goudy Old Style" w:hAnsi="Goudy Old Style" w:cs="Times New Roman"/>
-          <w:sz w:val="24"/>
-          <w:szCs w:val="24"/>
-        </w:rPr>
-        <w:t>measurement</w:t>
-      </w:r>
-      <w:r>
-        <w:rPr>
-          <w:rFonts w:ascii="Goudy Old Style" w:hAnsi="Goudy Old Style" w:cs="Times New Roman"/>
-          <w:sz w:val="24"/>
-          <w:szCs w:val="24"/>
-        </w:rPr>
-        <w:t>_table</w:t>
-      </w:r>
-      <w:proofErr w:type="spellEnd"/>
-      <w:r>
-        <w:rPr>
-          <w:rFonts w:ascii="Goudy Old Style" w:hAnsi="Goudy Old Style" w:cs="Times New Roman"/>
-          <w:sz w:val="24"/>
-          <w:szCs w:val="24"/>
-        </w:rPr>
-        <w:t>)</w:t>
-      </w:r>
-    </w:p>
-    <w:p>
-      <w:pPr>
-        <w:contextualSpacing/>
-        <w:rPr>
-          <w:rFonts w:ascii="Goudy Old Style" w:hAnsi="Goudy Old Style" w:cs="Times New Roman"/>
-          <w:sz w:val="24"/>
-          <w:szCs w:val="24"/>
-        </w:rPr>
-      </w:pPr>
-      <w:r>
-        <w:rPr>
-          <w:rFonts w:ascii="Goudy Old Style" w:hAnsi="Goudy Old Style" w:cs="Times New Roman"/>
-          <w:sz w:val="24"/>
-          <w:szCs w:val="24"/>
-        </w:rPr>
-        <w:sym w:font="Wingdings" w:char="F0E0"/>
-      </w:r>
-      <w:r>
-        <w:rPr>
-          <w:rFonts w:ascii="Goudy Old Style" w:hAnsi="Goudy Old Style" w:cs="Times New Roman"/>
-          <w:sz w:val="24"/>
-          <w:szCs w:val="24"/>
-        </w:rPr>
-        <w:t xml:space="preserve"> called if grouping in </w:t>
-      </w:r>
-      <w:proofErr w:type="spellStart"/>
-      <w:r>
-        <w:rPr>
-          <w:rFonts w:ascii="Goudy Old Style" w:hAnsi="Goudy Old Style" w:cs="Times New Roman"/>
-          <w:sz w:val="24"/>
-          <w:szCs w:val="24"/>
-        </w:rPr>
-        <w:t>sizest</w:t>
-      </w:r>
-      <w:proofErr w:type="spellEnd"/>
-      <w:r>
-        <w:rPr>
-          <w:rFonts w:ascii="Goudy Old Style" w:hAnsi="Goudy Old Style" w:cs="Times New Roman"/>
-          <w:sz w:val="24"/>
-          <w:szCs w:val="24"/>
-        </w:rPr>
-        <w:t xml:space="preserve"> or </w:t>
-      </w:r>
-      <w:proofErr w:type="spellStart"/>
-      <w:r>
-        <w:rPr>
-          <w:rFonts w:ascii="Goudy Old Style" w:hAnsi="Goudy Old Style" w:cs="Times New Roman"/>
-          <w:sz w:val="24"/>
-          <w:szCs w:val="24"/>
-        </w:rPr>
-        <w:t>get_allometric_equations</w:t>
-      </w:r>
-      <w:proofErr w:type="spellEnd"/>
-      <w:r>
-        <w:rPr>
-          <w:rFonts w:ascii="Goudy Old Style" w:hAnsi="Goudy Old Style" w:cs="Times New Roman"/>
-          <w:sz w:val="24"/>
-          <w:szCs w:val="24"/>
-        </w:rPr>
-        <w:t xml:space="preserve"> is “traits”, i.e. if threshold of at least three distinct measurements or one allometric equation not met at family level</w:t>
-      </w:r>
-    </w:p>
-    <w:p>
-      <w:pPr>
-        <w:contextualSpacing/>
-        <w:rPr>
-          <w:rFonts w:ascii="Goudy Old Style" w:hAnsi="Goudy Old Style" w:cs="Times New Roman"/>
-          <w:sz w:val="24"/>
-          <w:szCs w:val="24"/>
-        </w:rPr>
-      </w:pPr>
-      <w:r>
-        <w:rPr>
-          <w:rFonts w:ascii="Goudy Old Style" w:hAnsi="Goudy Old Style" w:cs="Times New Roman"/>
-          <w:sz w:val="24"/>
-          <w:szCs w:val="24"/>
-        </w:rPr>
-        <w:sym w:font="Wingdings" w:char="F0E0"/>
-      </w:r>
-      <w:r>
-        <w:rPr>
-          <w:rFonts w:ascii="Goudy Old Style" w:hAnsi="Goudy Old Style" w:cs="Times New Roman"/>
-          <w:sz w:val="24"/>
-          <w:szCs w:val="24"/>
-        </w:rPr>
-        <w:t xml:space="preserve"> </w:t>
-      </w:r>
-      <w:r>
-        <w:rPr>
-          <w:rFonts w:ascii="Goudy Old Style" w:hAnsi="Goudy Old Style" w:cs="Times New Roman"/>
-          <w:sz w:val="24"/>
-          <w:szCs w:val="24"/>
-        </w:rPr>
-        <w:t>Match traits of max</w:t>
-      </w:r>
-      <w:r>
-        <w:rPr>
-          <w:rFonts w:ascii="Goudy Old Style" w:hAnsi="Goudy Old Style" w:cs="Times New Roman"/>
-          <w:sz w:val="24"/>
-          <w:szCs w:val="24"/>
-        </w:rPr>
-        <w:t>imum body</w:t>
-      </w:r>
-      <w:r>
-        <w:rPr>
-          <w:rFonts w:ascii="Goudy Old Style" w:hAnsi="Goudy Old Style" w:cs="Times New Roman"/>
-          <w:sz w:val="24"/>
-          <w:szCs w:val="24"/>
-        </w:rPr>
-        <w:t xml:space="preserve"> size, body shape, locomotion and morphological defense</w:t>
-      </w:r>
-      <w:r>
-        <w:rPr>
-          <w:rFonts w:ascii="Goudy Old Style" w:hAnsi="Goudy Old Style" w:cs="Times New Roman"/>
-          <w:sz w:val="24"/>
-          <w:szCs w:val="24"/>
-        </w:rPr>
-        <w:t xml:space="preserve"> across </w:t>
-      </w:r>
-      <w:r>
-        <w:rPr>
-          <w:rFonts w:ascii="Goudy Old Style" w:hAnsi="Goudy Old Style" w:cs="Times New Roman"/>
-          <w:b/>
-          <w:bCs/>
-          <w:sz w:val="24"/>
-          <w:szCs w:val="24"/>
-        </w:rPr>
-        <w:t>all</w:t>
-      </w:r>
-      <w:r>
-        <w:rPr>
-          <w:rFonts w:ascii="Goudy Old Style" w:hAnsi="Goudy Old Style" w:cs="Times New Roman"/>
-          <w:sz w:val="24"/>
-          <w:szCs w:val="24"/>
-        </w:rPr>
-        <w:t xml:space="preserve"> species in the database</w:t>
-      </w:r>
-      <w:r>
-        <w:rPr>
-          <w:rFonts w:ascii="Goudy Old Style" w:hAnsi="Goudy Old Style" w:cs="Times New Roman"/>
-          <w:sz w:val="24"/>
-          <w:szCs w:val="24"/>
-        </w:rPr>
-        <w:t xml:space="preserve">. Those species with </w:t>
-      </w:r>
-      <w:r>
-        <w:rPr>
-          <w:rFonts w:ascii="Goudy Old Style" w:hAnsi="Goudy Old Style" w:cs="Times New Roman"/>
-          <w:b/>
-          <w:bCs/>
-          <w:sz w:val="24"/>
-          <w:szCs w:val="24"/>
-        </w:rPr>
-        <w:t>+/- 1</w:t>
-      </w:r>
-      <w:r>
-        <w:rPr>
-          <w:rFonts w:ascii="Goudy Old Style" w:hAnsi="Goudy Old Style" w:cs="Times New Roman"/>
-          <w:sz w:val="24"/>
-          <w:szCs w:val="24"/>
-        </w:rPr>
-        <w:t xml:space="preserve"> match </w:t>
-      </w:r>
-      <w:proofErr w:type="gramStart"/>
-      <w:r>
-        <w:rPr>
-          <w:rFonts w:ascii="Goudy Old Style" w:hAnsi="Goudy Old Style" w:cs="Times New Roman"/>
-          <w:sz w:val="24"/>
-          <w:szCs w:val="24"/>
-        </w:rPr>
-        <w:t>are</w:t>
-      </w:r>
-      <w:proofErr w:type="gramEnd"/>
-      <w:r>
-        <w:rPr>
-          <w:rFonts w:ascii="Goudy Old Style" w:hAnsi="Goudy Old Style" w:cs="Times New Roman"/>
-          <w:sz w:val="24"/>
-          <w:szCs w:val="24"/>
-        </w:rPr>
-        <w:t xml:space="preserve"> added to a species pool to get </w:t>
-      </w:r>
-      <w:r>
-        <w:rPr>
-          <w:rFonts w:ascii="Goudy Old Style" w:hAnsi="Goudy Old Style" w:cs="Times New Roman"/>
-          <w:sz w:val="24"/>
-          <w:szCs w:val="24"/>
-        </w:rPr>
-        <w:t xml:space="preserve">allometric </w:t>
-      </w:r>
-      <w:r>
-        <w:rPr>
-          <w:rFonts w:ascii="Goudy Old Style" w:hAnsi="Goudy Old Style" w:cs="Times New Roman"/>
-          <w:sz w:val="24"/>
-          <w:szCs w:val="24"/>
-        </w:rPr>
-        <w:t>equations or size estimates</w:t>
-      </w:r>
-      <w:r>
-        <w:rPr>
-          <w:rFonts w:ascii="Goudy Old Style" w:hAnsi="Goudy Old Style" w:cs="Times New Roman"/>
-          <w:sz w:val="24"/>
-          <w:szCs w:val="24"/>
-        </w:rPr>
-        <w:t xml:space="preserve"> (instead of a taxonomic grouping)</w:t>
-      </w:r>
-    </w:p>
-    <w:p>
-      <w:pPr>
-        <w:contextualSpacing/>
-        <w:rPr>
-          <w:rFonts w:ascii="Goudy Old Style" w:hAnsi="Goudy Old Style" w:cs="Times New Roman"/>
-          <w:b/>
-          <w:bCs/>
-          <w:sz w:val="24"/>
-          <w:szCs w:val="24"/>
-        </w:rPr>
-      </w:pPr>
-      <w:r>
-        <w:rPr>
-          <w:rFonts w:ascii="Goudy Old Style" w:hAnsi="Goudy Old Style" w:cs="Times New Roman"/>
-          <w:sz w:val="24"/>
-          <w:szCs w:val="24"/>
-        </w:rPr>
-        <w:sym w:font="Wingdings" w:char="F0E0"/>
-      </w:r>
-      <w:r>
-        <w:rPr>
-          <w:rFonts w:ascii="Goudy Old Style" w:hAnsi="Goudy Old Style" w:cs="Times New Roman"/>
-          <w:sz w:val="24"/>
-          <w:szCs w:val="24"/>
-        </w:rPr>
-        <w:t xml:space="preserve"> Does not proceed if any NA is found in the trait values of the species</w:t>
-      </w:r>
-    </w:p>
-    <w:p>
-      <w:pPr>
-        <w:contextualSpacing/>
-        <w:rPr>
-          <w:rFonts w:ascii="Goudy Old Style" w:hAnsi="Goudy Old Style" w:cs="Times New Roman"/>
-          <w:sz w:val="24"/>
-          <w:szCs w:val="24"/>
-        </w:rPr>
-      </w:pPr>
-    </w:p>
-    <w:p>
-      <w:pPr>
-        <w:contextualSpacing/>
-        <w:rPr>
-          <w:rFonts w:ascii="Goudy Old Style" w:hAnsi="Goudy Old Style" w:cs="Times New Roman"/>
-          <w:sz w:val="24"/>
-          <w:szCs w:val="24"/>
-        </w:rPr>
-      </w:pPr>
-      <w:bookmarkStart w:id="0" w:name="_GoBack"/>
-      <w:bookmarkEnd w:id="0"/>
-    </w:p>
-    <w:p>
-      <w:pPr>
-        <w:contextualSpacing/>
-        <w:rPr>
-          <w:rFonts w:ascii="Goudy Old Style" w:hAnsi="Goudy Old Style" w:cs="Times New Roman"/>
-          <w:sz w:val="24"/>
-          <w:szCs w:val="24"/>
-        </w:rPr>
-      </w:pPr>
-      <w:proofErr w:type="spellStart"/>
-      <w:r>
-        <w:rPr>
-          <w:rFonts w:ascii="Goudy Old Style" w:hAnsi="Goudy Old Style" w:cs="Times New Roman"/>
-          <w:sz w:val="24"/>
-          <w:szCs w:val="24"/>
-        </w:rPr>
-        <w:t>equation_</w:t>
-      </w:r>
-      <w:proofErr w:type="gramStart"/>
-      <w:r>
-        <w:rPr>
-          <w:rFonts w:ascii="Goudy Old Style" w:hAnsi="Goudy Old Style" w:cs="Times New Roman"/>
-          <w:sz w:val="24"/>
-          <w:szCs w:val="24"/>
-        </w:rPr>
-        <w:t>finder</w:t>
-      </w:r>
-      <w:proofErr w:type="spellEnd"/>
-      <w:r>
-        <w:rPr>
-          <w:rFonts w:ascii="Goudy Old Style" w:hAnsi="Goudy Old Style" w:cs="Times New Roman"/>
-          <w:sz w:val="24"/>
-          <w:szCs w:val="24"/>
-        </w:rPr>
-        <w:t>(</w:t>
-      </w:r>
-      <w:proofErr w:type="gramEnd"/>
-      <w:r>
-        <w:rPr>
-          <w:rFonts w:ascii="Goudy Old Style" w:hAnsi="Goudy Old Style" w:cs="Times New Roman"/>
-          <w:sz w:val="24"/>
-          <w:szCs w:val="24"/>
-        </w:rPr>
-        <w:t xml:space="preserve">size, row, </w:t>
-      </w:r>
-      <w:proofErr w:type="spellStart"/>
-      <w:r>
-        <w:rPr>
-          <w:rFonts w:ascii="Goudy Old Style" w:hAnsi="Goudy Old Style" w:cs="Times New Roman"/>
-          <w:sz w:val="24"/>
-          <w:szCs w:val="24"/>
-        </w:rPr>
-        <w:t>measurement_tables</w:t>
-      </w:r>
-      <w:proofErr w:type="spellEnd"/>
-      <w:r>
-        <w:rPr>
-          <w:rFonts w:ascii="Goudy Old Style" w:hAnsi="Goudy Old Style" w:cs="Times New Roman"/>
-          <w:sz w:val="24"/>
-          <w:szCs w:val="24"/>
-        </w:rPr>
-        <w:t>)</w:t>
-      </w:r>
-    </w:p>
-    <w:p>
-      <w:pPr>
-        <w:contextualSpacing/>
-        <w:rPr>
-          <w:rFonts w:ascii="Goudy Old Style" w:hAnsi="Goudy Old Style" w:cs="Times New Roman"/>
-          <w:sz w:val="24"/>
-          <w:szCs w:val="24"/>
-        </w:rPr>
-      </w:pPr>
-      <w:r>
-        <w:rPr>
-          <w:rFonts w:ascii="Goudy Old Style" w:hAnsi="Goudy Old Style" w:cs="Times New Roman"/>
-          <w:sz w:val="24"/>
-          <w:szCs w:val="24"/>
-        </w:rPr>
-        <w:sym w:font="Wingdings" w:char="F0E0"/>
-      </w:r>
-      <w:r>
-        <w:rPr>
-          <w:rFonts w:ascii="Goudy Old Style" w:hAnsi="Goudy Old Style" w:cs="Times New Roman"/>
-          <w:sz w:val="24"/>
-          <w:szCs w:val="24"/>
-        </w:rPr>
-        <w:t xml:space="preserve"> called when biomass computation happens because some equations are in log10 format</w:t>
-      </w:r>
-      <w:r>
-        <w:rPr>
-          <w:rFonts w:ascii="Goudy Old Style" w:hAnsi="Goudy Old Style" w:cs="Times New Roman"/>
-          <w:sz w:val="24"/>
-          <w:szCs w:val="24"/>
-        </w:rPr>
-        <w:t xml:space="preserve"> (log10(biomass) = slope x log10(size) + intercept)</w:t>
-      </w:r>
-      <w:r>
-        <w:rPr>
-          <w:rFonts w:ascii="Goudy Old Style" w:hAnsi="Goudy Old Style" w:cs="Times New Roman"/>
-          <w:sz w:val="24"/>
-          <w:szCs w:val="24"/>
-        </w:rPr>
-        <w:t>, others in ln format</w:t>
-      </w:r>
-      <w:r>
-        <w:rPr>
-          <w:rFonts w:ascii="Goudy Old Style" w:hAnsi="Goudy Old Style" w:cs="Times New Roman"/>
-          <w:sz w:val="24"/>
-          <w:szCs w:val="24"/>
-        </w:rPr>
-        <w:t xml:space="preserve"> (</w:t>
-      </w:r>
-      <w:r>
-        <w:rPr>
-          <w:rFonts w:ascii="Goudy Old Style" w:hAnsi="Goudy Old Style" w:cs="Times New Roman"/>
-          <w:sz w:val="24"/>
-          <w:szCs w:val="24"/>
-        </w:rPr>
-        <w:t xml:space="preserve">ln(biomass) = </w:t>
-      </w:r>
-      <w:r>
-        <w:rPr>
-          <w:rFonts w:ascii="Goudy Old Style" w:hAnsi="Goudy Old Style" w:cs="Times New Roman"/>
-          <w:sz w:val="24"/>
-          <w:szCs w:val="24"/>
-        </w:rPr>
-        <w:t>slope x ln(size) + ln(intercept))</w:t>
-      </w:r>
-    </w:p>
-    <w:p>
-      <w:pPr>
-        <w:contextualSpacing/>
-        <w:rPr>
-          <w:rFonts w:ascii="Goudy Old Style" w:hAnsi="Goudy Old Style" w:cs="Times New Roman"/>
-          <w:sz w:val="24"/>
-          <w:szCs w:val="24"/>
-        </w:rPr>
-      </w:pPr>
-      <w:r>
-        <w:rPr>
-          <w:rFonts w:ascii="Goudy Old Style" w:hAnsi="Goudy Old Style" w:cs="Times New Roman"/>
-          <w:sz w:val="24"/>
-          <w:szCs w:val="24"/>
-        </w:rPr>
-        <w:sym w:font="Wingdings" w:char="F0E0"/>
-      </w:r>
-      <w:r>
-        <w:rPr>
-          <w:rFonts w:ascii="Goudy Old Style" w:hAnsi="Goudy Old Style" w:cs="Times New Roman"/>
-          <w:sz w:val="24"/>
-          <w:szCs w:val="24"/>
-        </w:rPr>
-        <w:t xml:space="preserve"> has an exception argument, so far used for Acari, because equation used generates weight in micrograms, not milligrams (argument controls the conversion)</w:t>
-      </w:r>
-    </w:p>
-    <w:p>
-      <w:pPr>
-        <w:rPr>
-          <w:rFonts w:ascii="Goudy Old Style" w:hAnsi="Goudy Old Style" w:cs="Times New Roman"/>
-          <w:sz w:val="24"/>
-          <w:szCs w:val="24"/>
-        </w:rPr>
-      </w:pPr>
-      <w:r>
-        <w:rPr>
-          <w:rFonts w:ascii="Goudy Old Style" w:hAnsi="Goudy Old Style" w:cs="Times New Roman"/>
-          <w:sz w:val="24"/>
-          <w:szCs w:val="24"/>
-        </w:rPr>
-        <w:lastRenderedPageBreak/>
-        <w:br w:type="page"/>
-      </w:r>
-    </w:p>
-    <w:p>
-      <w:pPr>
-        <w:contextualSpacing/>
-        <w:rPr>
-          <w:rFonts w:ascii="Goudy Old Style" w:hAnsi="Goudy Old Style" w:cs="Times New Roman"/>
-          <w:b/>
-          <w:bCs/>
-          <w:sz w:val="28"/>
-          <w:szCs w:val="28"/>
-        </w:rPr>
-      </w:pPr>
-      <w:r>
-        <w:rPr>
-          <w:rFonts w:ascii="Goudy Old Style" w:hAnsi="Goudy Old Style" w:cs="Times New Roman"/>
-          <w:b/>
-          <w:bCs/>
-          <w:sz w:val="28"/>
-          <w:szCs w:val="28"/>
-        </w:rPr>
         <w:lastRenderedPageBreak/>
         <w:t>Path nomenclature:</w:t>
       </w:r>
@@ -4016,80 +3389,44 @@
           <w:sz w:val="24"/>
           <w:szCs w:val="24"/>
         </w:rPr>
+        <w:t>- “null_biomass”: if abundance was 0</w:t>
+      </w:r>
+    </w:p>
+    <w:p>
+      <w:pPr>
+        <w:contextualSpacing/>
+        <w:rPr>
+          <w:rFonts w:ascii="Goudy Old Style" w:hAnsi="Goudy Old Style" w:cs="Times New Roman"/>
+          <w:sz w:val="24"/>
+          <w:szCs w:val="24"/>
+        </w:rPr>
+      </w:pPr>
+      <w:r>
+        <w:rPr>
+          <w:rFonts w:ascii="Goudy Old Style" w:hAnsi="Goudy Old Style" w:cs="Times New Roman"/>
+          <w:sz w:val="24"/>
+          <w:szCs w:val="24"/>
+        </w:rPr>
+        <w:t>- “_size_failed”: if there was not enough close relatives or species with matching traits to compute size</w:t>
+      </w:r>
+    </w:p>
+    <w:p>
+      <w:pPr>
+        <w:contextualSpacing/>
+        <w:rPr>
+          <w:rFonts w:ascii="Goudy Old Style" w:hAnsi="Goudy Old Style" w:cs="Times New Roman"/>
+          <w:sz w:val="24"/>
+          <w:szCs w:val="24"/>
+        </w:rPr>
+      </w:pPr>
+      <w:r>
+        <w:rPr>
+          <w:rFonts w:ascii="Goudy Old Style" w:hAnsi="Goudy Old Style" w:cs="Times New Roman"/>
+          <w:sz w:val="24"/>
+          <w:szCs w:val="24"/>
+        </w:rPr>
         <w:t>- “</w:t>
       </w:r>
-      <w:proofErr w:type="spellStart"/>
-      <w:r>
-        <w:rPr>
-          <w:rFonts w:ascii="Goudy Old Style" w:hAnsi="Goudy Old Style" w:cs="Times New Roman"/>
-          <w:sz w:val="24"/>
-          <w:szCs w:val="24"/>
-        </w:rPr>
-        <w:t>null_biomass</w:t>
-      </w:r>
-      <w:proofErr w:type="spellEnd"/>
-      <w:r>
-        <w:rPr>
-          <w:rFonts w:ascii="Goudy Old Style" w:hAnsi="Goudy Old Style" w:cs="Times New Roman"/>
-          <w:sz w:val="24"/>
-          <w:szCs w:val="24"/>
-        </w:rPr>
-        <w:t>”: if abundance was 0</w:t>
-      </w:r>
-    </w:p>
-    <w:p>
-      <w:pPr>
-        <w:contextualSpacing/>
-        <w:rPr>
-          <w:rFonts w:ascii="Goudy Old Style" w:hAnsi="Goudy Old Style" w:cs="Times New Roman"/>
-          <w:sz w:val="24"/>
-          <w:szCs w:val="24"/>
-        </w:rPr>
-      </w:pPr>
-      <w:r>
-        <w:rPr>
-          <w:rFonts w:ascii="Goudy Old Style" w:hAnsi="Goudy Old Style" w:cs="Times New Roman"/>
-          <w:sz w:val="24"/>
-          <w:szCs w:val="24"/>
-        </w:rPr>
-        <w:t>- “_</w:t>
-      </w:r>
-      <w:proofErr w:type="spellStart"/>
-      <w:r>
-        <w:rPr>
-          <w:rFonts w:ascii="Goudy Old Style" w:hAnsi="Goudy Old Style" w:cs="Times New Roman"/>
-          <w:sz w:val="24"/>
-          <w:szCs w:val="24"/>
-        </w:rPr>
-        <w:t>size_failed</w:t>
-      </w:r>
-      <w:proofErr w:type="spellEnd"/>
-      <w:r>
-        <w:rPr>
-          <w:rFonts w:ascii="Goudy Old Style" w:hAnsi="Goudy Old Style" w:cs="Times New Roman"/>
-          <w:sz w:val="24"/>
-          <w:szCs w:val="24"/>
-        </w:rPr>
-        <w:t>”: if there was not enough close relatives or species with matching traits to compute size</w:t>
-      </w:r>
-    </w:p>
-    <w:p>
-      <w:pPr>
-        <w:contextualSpacing/>
-        <w:rPr>
-          <w:rFonts w:ascii="Goudy Old Style" w:hAnsi="Goudy Old Style" w:cs="Times New Roman"/>
-          <w:sz w:val="24"/>
-          <w:szCs w:val="24"/>
-        </w:rPr>
-      </w:pPr>
-      <w:r>
-        <w:rPr>
-          <w:rFonts w:ascii="Goudy Old Style" w:hAnsi="Goudy Old Style" w:cs="Times New Roman"/>
-          <w:sz w:val="24"/>
-          <w:szCs w:val="24"/>
-        </w:rPr>
-        <w:t>- “</w:t>
-      </w:r>
       <w:r>
         <w:rPr>
           <w:rFonts w:ascii="Goudy Old Style" w:hAnsi="Goudy Old Style" w:cs="Times New Roman"/>
@@ -4104,7 +3441,39 @@
           <w:sz w:val="24"/>
           <w:szCs w:val="24"/>
         </w:rPr>
-        <w:t>”: if there was a raw (direct) measurement for that particular species-size combination</w:t>
+        <w:t>_dry/wet</w:t>
+      </w:r>
+      <w:r>
+        <w:rPr>
+          <w:rFonts w:ascii="Goudy Old Style" w:hAnsi="Goudy Old Style" w:cs="Times New Roman"/>
+          <w:sz w:val="24"/>
+          <w:szCs w:val="24"/>
+        </w:rPr>
+        <w:t>”: if there was a raw (direc</w:t>
+      </w:r>
+      <w:r>
+        <w:rPr>
+          <w:rFonts w:ascii="Goudy Old Style" w:hAnsi="Goudy Old Style" w:cs="Times New Roman"/>
+          <w:sz w:val="24"/>
+          <w:szCs w:val="24"/>
+        </w:rPr>
+        <w:t>t</w:t>
+      </w:r>
+      <w:r>
+        <w:rPr>
+          <w:rFonts w:ascii="Goudy Old Style" w:hAnsi="Goudy Old Style" w:cs="Times New Roman"/>
+          <w:sz w:val="24"/>
+          <w:szCs w:val="24"/>
+        </w:rPr>
+        <w:t>) measurement for that particular species-size combination</w:t>
+      </w:r>
+      <w:r>
+        <w:rPr>
+          <w:rFonts w:ascii="Goudy Old Style" w:hAnsi="Goudy Old Style" w:cs="Times New Roman"/>
+          <w:sz w:val="24"/>
+          <w:szCs w:val="24"/>
+        </w:rPr>
+        <w:t>, and whether that measurement is dry or wet biomass</w:t>
       </w:r>
     </w:p>
     <w:p>
@@ -4150,81 +3519,25 @@
           <w:sz w:val="24"/>
           <w:szCs w:val="24"/>
         </w:rPr>
-        <w:t>- if the species goes through estimation of size (</w:t>
-      </w:r>
-      <w:proofErr w:type="spellStart"/>
-      <w:proofErr w:type="gramStart"/>
-      <w:r>
-        <w:rPr>
-          <w:rFonts w:ascii="Goudy Old Style" w:hAnsi="Goudy Old Style" w:cs="Times New Roman"/>
-          <w:sz w:val="24"/>
-          <w:szCs w:val="24"/>
-        </w:rPr>
-        <w:t>sizest</w:t>
-      </w:r>
-      <w:proofErr w:type="spellEnd"/>
-      <w:r>
-        <w:rPr>
-          <w:rFonts w:ascii="Goudy Old Style" w:hAnsi="Goudy Old Style" w:cs="Times New Roman"/>
-          <w:sz w:val="24"/>
-          <w:szCs w:val="24"/>
-        </w:rPr>
-        <w:t>(</w:t>
-      </w:r>
-      <w:proofErr w:type="gramEnd"/>
-      <w:r>
-        <w:rPr>
-          <w:rFonts w:ascii="Goudy Old Style" w:hAnsi="Goudy Old Style" w:cs="Times New Roman"/>
-          <w:sz w:val="24"/>
-          <w:szCs w:val="24"/>
-        </w:rPr>
-        <w:t xml:space="preserve">)): </w:t>
-      </w:r>
-    </w:p>
-    <w:p>
-      <w:pPr>
-        <w:contextualSpacing/>
-        <w:rPr>
-          <w:rFonts w:ascii="Goudy Old Style" w:hAnsi="Goudy Old Style" w:cs="Times New Roman"/>
-          <w:sz w:val="24"/>
-          <w:szCs w:val="24"/>
-        </w:rPr>
-      </w:pPr>
-      <w:r>
-        <w:rPr>
-          <w:rFonts w:ascii="Goudy Old Style" w:hAnsi="Goudy Old Style" w:cs="Times New Roman"/>
-          <w:sz w:val="24"/>
-          <w:szCs w:val="24"/>
-        </w:rPr>
-        <w:t xml:space="preserve">estimation </w:t>
-      </w:r>
-      <w:proofErr w:type="spellStart"/>
-      <w:proofErr w:type="gramStart"/>
-      <w:r>
-        <w:rPr>
-          <w:rFonts w:ascii="Goudy Old Style" w:hAnsi="Goudy Old Style" w:cs="Times New Roman"/>
-          <w:sz w:val="24"/>
-          <w:szCs w:val="24"/>
-        </w:rPr>
-        <w:t>kind:level</w:t>
-      </w:r>
-      <w:proofErr w:type="gramEnd"/>
-      <w:r>
-        <w:rPr>
-          <w:rFonts w:ascii="Goudy Old Style" w:hAnsi="Goudy Old Style" w:cs="Times New Roman"/>
-          <w:sz w:val="24"/>
-          <w:szCs w:val="24"/>
-        </w:rPr>
-        <w:t>_number</w:t>
-      </w:r>
-      <w:proofErr w:type="spellEnd"/>
-      <w:r>
-        <w:rPr>
-          <w:rFonts w:ascii="Goudy Old Style" w:hAnsi="Goudy Old Style" w:cs="Times New Roman"/>
-          <w:sz w:val="24"/>
-          <w:szCs w:val="24"/>
-        </w:rPr>
-        <w:t xml:space="preserve"> of measurements</w:t>
+        <w:t xml:space="preserve">- if the species goes through estimation of size (sizest()): </w:t>
+      </w:r>
+    </w:p>
+    <w:p>
+      <w:pPr>
+        <w:contextualSpacing/>
+        <w:rPr>
+          <w:rFonts w:ascii="Goudy Old Style" w:hAnsi="Goudy Old Style" w:cs="Times New Roman"/>
+          <w:sz w:val="24"/>
+          <w:szCs w:val="24"/>
+        </w:rPr>
+      </w:pPr>
+      <w:r>
+        <w:rPr>
+          <w:rFonts w:ascii="Goudy Old Style" w:hAnsi="Goudy Old Style" w:cs="Times New Roman"/>
+          <w:sz w:val="24"/>
+          <w:szCs w:val="24"/>
+        </w:rPr>
+        <w:t>estimation kind:level_number of measurements</w:t>
       </w:r>
     </w:p>
     <w:p>
@@ -4244,23 +3557,13 @@
         </w:rPr>
         <w:t>e.g.: _</w:t>
       </w:r>
-      <w:proofErr w:type="gramStart"/>
-      <w:r>
-        <w:rPr>
-          <w:rFonts w:ascii="Goudy Old Style" w:hAnsi="Goudy Old Style" w:cs="Times New Roman"/>
-          <w:sz w:val="24"/>
-          <w:szCs w:val="24"/>
-        </w:rPr>
-        <w:t>WA:genus</w:t>
-      </w:r>
-      <w:proofErr w:type="gramEnd"/>
-      <w:r>
-        <w:rPr>
-          <w:rFonts w:ascii="Goudy Old Style" w:hAnsi="Goudy Old Style" w:cs="Times New Roman"/>
-          <w:sz w:val="24"/>
-          <w:szCs w:val="24"/>
-        </w:rPr>
-        <w:t>_5</w:t>
+      <w:r>
+        <w:rPr>
+          <w:rFonts w:ascii="Goudy Old Style" w:hAnsi="Goudy Old Style" w:cs="Times New Roman"/>
+          <w:sz w:val="24"/>
+          <w:szCs w:val="24"/>
+        </w:rPr>
+        <w:t>WA:genus_5</w:t>
       </w:r>
       <w:r>
         <w:rPr>
@@ -4318,99 +3621,33 @@
           <w:sz w:val="24"/>
           <w:szCs w:val="24"/>
         </w:rPr>
-        <w:t>- if the allometric equations are used (</w:t>
-      </w:r>
-      <w:proofErr w:type="spellStart"/>
-      <w:r>
-        <w:rPr>
-          <w:rFonts w:ascii="Goudy Old Style" w:hAnsi="Goudy Old Style" w:cs="Times New Roman"/>
-          <w:sz w:val="24"/>
-          <w:szCs w:val="24"/>
-        </w:rPr>
-        <w:t>get_</w:t>
-      </w:r>
-      <w:proofErr w:type="gramStart"/>
-      <w:r>
-        <w:rPr>
-          <w:rFonts w:ascii="Goudy Old Style" w:hAnsi="Goudy Old Style" w:cs="Times New Roman"/>
-          <w:sz w:val="24"/>
-          <w:szCs w:val="24"/>
-        </w:rPr>
-        <w:t>biomass</w:t>
-      </w:r>
-      <w:proofErr w:type="spellEnd"/>
-      <w:r>
-        <w:rPr>
-          <w:rFonts w:ascii="Goudy Old Style" w:hAnsi="Goudy Old Style" w:cs="Times New Roman"/>
-          <w:sz w:val="24"/>
-          <w:szCs w:val="24"/>
-        </w:rPr>
-        <w:t>(</w:t>
-      </w:r>
-      <w:proofErr w:type="gramEnd"/>
-      <w:r>
-        <w:rPr>
-          <w:rFonts w:ascii="Goudy Old Style" w:hAnsi="Goudy Old Style" w:cs="Times New Roman"/>
-          <w:sz w:val="24"/>
-          <w:szCs w:val="24"/>
-        </w:rPr>
-        <w:t xml:space="preserve">)): </w:t>
-      </w:r>
-    </w:p>
-    <w:p>
-      <w:pPr>
-        <w:contextualSpacing/>
-        <w:rPr>
-          <w:rFonts w:ascii="Goudy Old Style" w:hAnsi="Goudy Old Style" w:cs="Times New Roman"/>
-          <w:sz w:val="24"/>
-          <w:szCs w:val="24"/>
-        </w:rPr>
-      </w:pPr>
-      <w:r>
-        <w:rPr>
-          <w:rFonts w:ascii="Goudy Old Style" w:hAnsi="Goudy Old Style" w:cs="Times New Roman"/>
-          <w:sz w:val="24"/>
-          <w:szCs w:val="24"/>
-        </w:rPr>
-        <w:t xml:space="preserve">biomass </w:t>
-      </w:r>
-      <w:proofErr w:type="spellStart"/>
-      <w:proofErr w:type="gramStart"/>
-      <w:r>
-        <w:rPr>
-          <w:rFonts w:ascii="Goudy Old Style" w:hAnsi="Goudy Old Style" w:cs="Times New Roman"/>
-          <w:sz w:val="24"/>
-          <w:szCs w:val="24"/>
-        </w:rPr>
-        <w:t>estimation:taxonomic</w:t>
-      </w:r>
-      <w:proofErr w:type="spellEnd"/>
-      <w:proofErr w:type="gramEnd"/>
-      <w:r>
-        <w:rPr>
-          <w:rFonts w:ascii="Goudy Old Style" w:hAnsi="Goudy Old Style" w:cs="Times New Roman"/>
-          <w:sz w:val="24"/>
-          <w:szCs w:val="24"/>
-        </w:rPr>
-        <w:t xml:space="preserve"> level of </w:t>
-      </w:r>
-      <w:proofErr w:type="spellStart"/>
-      <w:r>
-        <w:rPr>
-          <w:rFonts w:ascii="Goudy Old Style" w:hAnsi="Goudy Old Style" w:cs="Times New Roman"/>
-          <w:sz w:val="24"/>
-          <w:szCs w:val="24"/>
-        </w:rPr>
-        <w:t>inference_number</w:t>
-      </w:r>
-      <w:proofErr w:type="spellEnd"/>
-      <w:r>
-        <w:rPr>
-          <w:rFonts w:ascii="Goudy Old Style" w:hAnsi="Goudy Old Style" w:cs="Times New Roman"/>
-          <w:sz w:val="24"/>
-          <w:szCs w:val="24"/>
-        </w:rPr>
-        <w:t xml:space="preserve"> of equations</w:t>
+        <w:t xml:space="preserve">- if the allometric equations are used (get_biomass()): </w:t>
+      </w:r>
+    </w:p>
+    <w:p>
+      <w:pPr>
+        <w:contextualSpacing/>
+        <w:rPr>
+          <w:rFonts w:ascii="Goudy Old Style" w:hAnsi="Goudy Old Style" w:cs="Times New Roman"/>
+          <w:sz w:val="24"/>
+          <w:szCs w:val="24"/>
+        </w:rPr>
+      </w:pPr>
+      <w:r>
+        <w:rPr>
+          <w:rFonts w:ascii="Goudy Old Style" w:hAnsi="Goudy Old Style" w:cs="Times New Roman"/>
+          <w:sz w:val="24"/>
+          <w:szCs w:val="24"/>
+        </w:rPr>
+        <w:t>biomass estimation:taxonomic level of inference_number of equations</w:t>
+      </w:r>
+      <w:r>
+        <w:rPr>
+          <w:rFonts w:ascii="Goudy Old Style" w:hAnsi="Goudy Old Style" w:cs="Times New Roman"/>
+          <w:sz w:val="24"/>
+          <w:szCs w:val="24"/>
+        </w:rPr>
+        <w:t>_dry/wet</w:t>
       </w:r>
     </w:p>
     <w:p>
@@ -4436,41 +3673,103 @@
           <w:sz w:val="24"/>
           <w:szCs w:val="24"/>
         </w:rPr>
+        <w:t>_BM:bwg_name_1</w:t>
+      </w:r>
+      <w:r>
+        <w:rPr>
+          <w:rFonts w:ascii="Goudy Old Style" w:hAnsi="Goudy Old Style" w:cs="Times New Roman"/>
+          <w:sz w:val="24"/>
+          <w:szCs w:val="24"/>
+        </w:rPr>
+        <w:t>_wet</w:t>
+      </w:r>
+      <w:r>
+        <w:rPr>
+          <w:rFonts w:ascii="Goudy Old Style" w:hAnsi="Goudy Old Style" w:cs="Times New Roman"/>
+          <w:sz w:val="24"/>
+          <w:szCs w:val="24"/>
+        </w:rPr>
+        <w:t xml:space="preserve"> (one equation</w:t>
+      </w:r>
+      <w:r>
+        <w:rPr>
+          <w:rFonts w:ascii="Goudy Old Style" w:hAnsi="Goudy Old Style" w:cs="Times New Roman"/>
+          <w:sz w:val="24"/>
+          <w:szCs w:val="24"/>
+        </w:rPr>
+        <w:t xml:space="preserve"> from wet biomass</w:t>
+      </w:r>
+      <w:r>
+        <w:rPr>
+          <w:rFonts w:ascii="Goudy Old Style" w:hAnsi="Goudy Old Style" w:cs="Times New Roman"/>
+          <w:sz w:val="24"/>
+          <w:szCs w:val="24"/>
+        </w:rPr>
+        <w:t xml:space="preserve"> at the species level), </w:t>
+      </w:r>
+      <w:r>
+        <w:rPr>
+          <w:rFonts w:ascii="Goudy Old Style" w:hAnsi="Goudy Old Style" w:cs="Times New Roman"/>
+          <w:sz w:val="24"/>
+          <w:szCs w:val="24"/>
+        </w:rPr>
+        <w:t>_BM:</w:t>
+      </w:r>
+      <w:r>
+        <w:rPr>
+          <w:rFonts w:ascii="Goudy Old Style" w:hAnsi="Goudy Old Style" w:cs="Times New Roman"/>
+          <w:sz w:val="24"/>
+          <w:szCs w:val="24"/>
+        </w:rPr>
+        <w:t>subclass</w:t>
+      </w:r>
+      <w:r>
+        <w:rPr>
+          <w:rFonts w:ascii="Goudy Old Style" w:hAnsi="Goudy Old Style" w:cs="Times New Roman"/>
+          <w:sz w:val="24"/>
+          <w:szCs w:val="24"/>
+        </w:rPr>
         <w:t>_</w:t>
       </w:r>
-      <w:proofErr w:type="gramStart"/>
-      <w:r>
-        <w:rPr>
-          <w:rFonts w:ascii="Goudy Old Style" w:hAnsi="Goudy Old Style" w:cs="Times New Roman"/>
-          <w:sz w:val="24"/>
-          <w:szCs w:val="24"/>
-        </w:rPr>
-        <w:t>BM:bwg</w:t>
-      </w:r>
-      <w:proofErr w:type="gramEnd"/>
-      <w:r>
-        <w:rPr>
-          <w:rFonts w:ascii="Goudy Old Style" w:hAnsi="Goudy Old Style" w:cs="Times New Roman"/>
-          <w:sz w:val="24"/>
-          <w:szCs w:val="24"/>
-        </w:rPr>
-        <w:t>_name_1</w:t>
-      </w:r>
-      <w:r>
-        <w:rPr>
-          <w:rFonts w:ascii="Goudy Old Style" w:hAnsi="Goudy Old Style" w:cs="Times New Roman"/>
-          <w:sz w:val="24"/>
-          <w:szCs w:val="24"/>
-        </w:rPr>
-        <w:t xml:space="preserve"> (one equation at the species level), </w:t>
-      </w:r>
-      <w:r>
-        <w:rPr>
-          <w:rFonts w:ascii="Goudy Old Style" w:hAnsi="Goudy Old Style" w:cs="Times New Roman"/>
-          <w:sz w:val="24"/>
-          <w:szCs w:val="24"/>
-        </w:rPr>
-        <w:t>_BM:</w:t>
+      <w:r>
+        <w:rPr>
+          <w:rFonts w:ascii="Goudy Old Style" w:hAnsi="Goudy Old Style" w:cs="Times New Roman"/>
+          <w:sz w:val="24"/>
+          <w:szCs w:val="24"/>
+        </w:rPr>
+        <w:t>5</w:t>
+      </w:r>
+      <w:r>
+        <w:rPr>
+          <w:rFonts w:ascii="Goudy Old Style" w:hAnsi="Goudy Old Style" w:cs="Times New Roman"/>
+          <w:sz w:val="24"/>
+          <w:szCs w:val="24"/>
+        </w:rPr>
+        <w:t xml:space="preserve">_dry </w:t>
+      </w:r>
+      <w:r>
+        <w:rPr>
+          <w:rFonts w:ascii="Goudy Old Style" w:hAnsi="Goudy Old Style" w:cs="Times New Roman"/>
+          <w:sz w:val="24"/>
+          <w:szCs w:val="24"/>
+        </w:rPr>
+        <w:t>(five equation</w:t>
+      </w:r>
+      <w:r>
+        <w:rPr>
+          <w:rFonts w:ascii="Goudy Old Style" w:hAnsi="Goudy Old Style" w:cs="Times New Roman"/>
+          <w:sz w:val="24"/>
+          <w:szCs w:val="24"/>
+        </w:rPr>
+        <w:t xml:space="preserve"> from dry biomass </w:t>
+      </w:r>
+      <w:r>
+        <w:rPr>
+          <w:rFonts w:ascii="Goudy Old Style" w:hAnsi="Goudy Old Style" w:cs="Times New Roman"/>
+          <w:sz w:val="24"/>
+          <w:szCs w:val="24"/>
+        </w:rPr>
+        <w:t xml:space="preserve">s at the </w:t>
       </w:r>
       <w:r>
         <w:rPr>
@@ -4486,30 +3785,6 @@
           <w:sz w:val="24"/>
           <w:szCs w:val="24"/>
         </w:rPr>
-        <w:t>_</w:t>
-      </w:r>
-      <w:r>
-        <w:rPr>
-          <w:rFonts w:ascii="Goudy Old Style" w:hAnsi="Goudy Old Style" w:cs="Times New Roman"/>
-          <w:sz w:val="24"/>
-          <w:szCs w:val="24"/>
-        </w:rPr>
-        <w:t xml:space="preserve">5 (five equations at the </w:t>
-      </w:r>
-      <w:r>
-        <w:rPr>
-          <w:rFonts w:ascii="Goudy Old Style" w:hAnsi="Goudy Old Style" w:cs="Times New Roman"/>
-          <w:sz w:val="24"/>
-          <w:szCs w:val="24"/>
-        </w:rPr>
-        <w:t>subclass</w:t>
-      </w:r>
-      <w:r>
-        <w:rPr>
-          <w:rFonts w:ascii="Goudy Old Style" w:hAnsi="Goudy Old Style" w:cs="Times New Roman"/>
-          <w:sz w:val="24"/>
-          <w:szCs w:val="24"/>
-        </w:rPr>
         <w:t xml:space="preserve"> level)</w:t>
       </w:r>
     </w:p>
@@ -4540,23 +3815,21 @@
         </w:rPr>
         <w:t>If a species went through both size estimation and biomass estimations, the path will be composite, e.g. _</w:t>
       </w:r>
-      <w:proofErr w:type="gramStart"/>
-      <w:r>
-        <w:rPr>
-          <w:rFonts w:ascii="Goudy Old Style" w:hAnsi="Goudy Old Style" w:cs="Times New Roman"/>
-          <w:sz w:val="24"/>
-          <w:szCs w:val="24"/>
-        </w:rPr>
-        <w:t>WA:genus</w:t>
-      </w:r>
-      <w:proofErr w:type="gramEnd"/>
-      <w:r>
-        <w:rPr>
-          <w:rFonts w:ascii="Goudy Old Style" w:hAnsi="Goudy Old Style" w:cs="Times New Roman"/>
-          <w:sz w:val="24"/>
-          <w:szCs w:val="24"/>
-        </w:rPr>
-        <w:t>_5_BM:bwg_name_1</w:t>
+      <w:r>
+        <w:rPr>
+          <w:rFonts w:ascii="Goudy Old Style" w:hAnsi="Goudy Old Style" w:cs="Times New Roman"/>
+          <w:sz w:val="24"/>
+          <w:szCs w:val="24"/>
+        </w:rPr>
+        <w:t>WA:genus_5_BM:bwg_name_1</w:t>
+      </w:r>
+      <w:r>
+        <w:rPr>
+          <w:rFonts w:ascii="Goudy Old Style" w:hAnsi="Goudy Old Style" w:cs="Times New Roman"/>
+          <w:sz w:val="24"/>
+          <w:szCs w:val="24"/>
+        </w:rPr>
+        <w:t>_wet</w:t>
       </w:r>
     </w:p>
     <w:sectPr>
@@ -4570,7 +3843,7 @@
 </file>
 
 <file path=word/endnotes.xml><?xml version="1.0" encoding="utf-8"?>
-<w:endnotes xmlns:wpc="http://schemas.microsoft.com/office/word/2010/wordprocessingCanvas" xmlns:cx="http://schemas.microsoft.com/office/drawing/2014/chartex" xmlns:cx1="http://schemas.microsoft.com/office/drawing/2015/9/8/chartex" xmlns:cx2="http://schemas.microsoft.com/office/drawing/2015/10/21/chartex" xmlns:cx3="http://schemas.microsoft.com/office/drawing/2016/5/9/chartex" xmlns:cx4="http://schemas.microsoft.com/office/drawing/2016/5/10/chartex" xmlns:cx5="http://schemas.microsoft.com/office/drawing/2016/5/11/chartex" xmlns:cx6="http://schemas.microsoft.com/office/drawing/2016/5/12/chartex" xmlns:cx7="http://schemas.microsoft.com/office/drawing/2016/5/13/chartex" xmlns:cx8="http://schemas.microsoft.com/office/drawing/2016/5/14/chartex" xmlns:mc="http://schemas.openxmlformats.org/markup-compatibility/2006" xmlns:aink="http://schemas.microsoft.com/office/drawing/2016/ink" xmlns:am3d="http://schemas.microsoft.com/office/drawing/2017/model3d" xmlns:o="urn:schemas-microsoft-com:office:office" xmlns:r="http://schemas.openxmlformats.org/officeDocument/2006/relationships" xmlns:m="http://schemas.openxmlformats.org/officeDocument/2006/math" xmlns:v="urn:schemas-microsoft-com:vml" xmlns:wp14="http://schemas.microsoft.com/office/word/2010/wordprocessingDrawing" xmlns:wp="http://schemas.openxmlformats.org/drawingml/2006/wordprocessingDrawing" xmlns:w10="urn:schemas-microsoft-com:office:word" xmlns:w="http://schemas.openxmlformats.org/wordprocessingml/2006/main" xmlns:w14="http://schemas.microsoft.com/office/word/2010/wordml" xmlns:w15="http://schemas.microsoft.com/office/word/2012/wordml" xmlns:w16cid="http://schemas.microsoft.com/office/word/2016/wordml/cid" xmlns:w16se="http://schemas.microsoft.com/office/word/2015/wordml/symex" xmlns:wpg="http://schemas.microsoft.com/office/word/2010/wordprocessingGroup" xmlns:wpi="http://schemas.microsoft.com/office/word/2010/wordprocessingInk" xmlns:wne="http://schemas.microsoft.com/office/word/2006/wordml" xmlns:wps="http://schemas.microsoft.com/office/word/2010/wordprocessingShape" mc:Ignorable="w14 w15 w16se w16cid wp14">
+<w:endnotes xmlns:wpc="http://schemas.microsoft.com/office/word/2010/wordprocessingCanvas" xmlns:cx="http://schemas.microsoft.com/office/drawing/2014/chartex" xmlns:cx1="http://schemas.microsoft.com/office/drawing/2015/9/8/chartex" xmlns:cx2="http://schemas.microsoft.com/office/drawing/2015/10/21/chartex" xmlns:cx3="http://schemas.microsoft.com/office/drawing/2016/5/9/chartex" xmlns:cx4="http://schemas.microsoft.com/office/drawing/2016/5/10/chartex" xmlns:cx5="http://schemas.microsoft.com/office/drawing/2016/5/11/chartex" xmlns:cx6="http://schemas.microsoft.com/office/drawing/2016/5/12/chartex" xmlns:cx7="http://schemas.microsoft.com/office/drawing/2016/5/13/chartex" xmlns:cx8="http://schemas.microsoft.com/office/drawing/2016/5/14/chartex" xmlns:mc="http://schemas.openxmlformats.org/markup-compatibility/2006" xmlns:aink="http://schemas.microsoft.com/office/drawing/2016/ink" xmlns:am3d="http://schemas.microsoft.com/office/drawing/2017/model3d" xmlns:o="urn:schemas-microsoft-com:office:office" xmlns:r="http://schemas.openxmlformats.org/officeDocument/2006/relationships" xmlns:m="http://schemas.openxmlformats.org/officeDocument/2006/math" xmlns:v="urn:schemas-microsoft-com:vml" xmlns:wp14="http://schemas.microsoft.com/office/word/2010/wordprocessingDrawing" xmlns:wp="http://schemas.openxmlformats.org/drawingml/2006/wordprocessingDrawing" xmlns:w10="urn:schemas-microsoft-com:office:word" xmlns:w="http://schemas.openxmlformats.org/wordprocessingml/2006/main" xmlns:w14="http://schemas.microsoft.com/office/word/2010/wordml" xmlns:w15="http://schemas.microsoft.com/office/word/2012/wordml" xmlns:w16cex="http://schemas.microsoft.com/office/word/2018/wordml/cex" xmlns:w16cid="http://schemas.microsoft.com/office/word/2016/wordml/cid" xmlns:w16="http://schemas.microsoft.com/office/word/2018/wordml" xmlns:w16se="http://schemas.microsoft.com/office/word/2015/wordml/symex" xmlns:wpg="http://schemas.microsoft.com/office/word/2010/wordprocessingGroup" xmlns:wpi="http://schemas.microsoft.com/office/word/2010/wordprocessingInk" xmlns:wne="http://schemas.microsoft.com/office/word/2006/wordml" xmlns:wps="http://schemas.microsoft.com/office/word/2010/wordprocessingShape" mc:Ignorable="w14 w15 w16se w16cid w16 w16cex wp14">
   <w:endnote w:type="separator" w:id="-1">
     <w:p>
       <w:pPr>
@@ -4595,7 +3868,7 @@
 </file>
 
 <file path=word/footnotes.xml><?xml version="1.0" encoding="utf-8"?>
-<w:footnotes xmlns:wpc="http://schemas.microsoft.com/office/word/2010/wordprocessingCanvas" xmlns:cx="http://schemas.microsoft.com/office/drawing/2014/chartex" xmlns:cx1="http://schemas.microsoft.com/office/drawing/2015/9/8/chartex" xmlns:cx2="http://schemas.microsoft.com/office/drawing/2015/10/21/chartex" xmlns:cx3="http://schemas.microsoft.com/office/drawing/2016/5/9/chartex" xmlns:cx4="http://schemas.microsoft.com/office/drawing/2016/5/10/chartex" xmlns:cx5="http://schemas.microsoft.com/office/drawing/2016/5/11/chartex" xmlns:cx6="http://schemas.microsoft.com/office/drawing/2016/5/12/chartex" xmlns:cx7="http://schemas.microsoft.com/office/drawing/2016/5/13/chartex" xmlns:cx8="http://schemas.microsoft.com/office/drawing/2016/5/14/chartex" xmlns:mc="http://schemas.openxmlformats.org/markup-compatibility/2006" xmlns:aink="http://schemas.microsoft.com/office/drawing/2016/ink" xmlns:am3d="http://schemas.microsoft.com/office/drawing/2017/model3d" xmlns:o="urn:schemas-microsoft-com:office:office" xmlns:r="http://schemas.openxmlformats.org/officeDocument/2006/relationships" xmlns:m="http://schemas.openxmlformats.org/officeDocument/2006/math" xmlns:v="urn:schemas-microsoft-com:vml" xmlns:wp14="http://schemas.microsoft.com/office/word/2010/wordprocessingDrawing" xmlns:wp="http://schemas.openxmlformats.org/drawingml/2006/wordprocessingDrawing" xmlns:w10="urn:schemas-microsoft-com:office:word" xmlns:w="http://schemas.openxmlformats.org/wordprocessingml/2006/main" xmlns:w14="http://schemas.microsoft.com/office/word/2010/wordml" xmlns:w15="http://schemas.microsoft.com/office/word/2012/wordml" xmlns:w16cid="http://schemas.microsoft.com/office/word/2016/wordml/cid" xmlns:w16se="http://schemas.microsoft.com/office/word/2015/wordml/symex" xmlns:wpg="http://schemas.microsoft.com/office/word/2010/wordprocessingGroup" xmlns:wpi="http://schemas.microsoft.com/office/word/2010/wordprocessingInk" xmlns:wne="http://schemas.microsoft.com/office/word/2006/wordml" xmlns:wps="http://schemas.microsoft.com/office/word/2010/wordprocessingShape" mc:Ignorable="w14 w15 w16se w16cid wp14">
+<w:footnotes xmlns:wpc="http://schemas.microsoft.com/office/word/2010/wordprocessingCanvas" xmlns:cx="http://schemas.microsoft.com/office/drawing/2014/chartex" xmlns:cx1="http://schemas.microsoft.com/office/drawing/2015/9/8/chartex" xmlns:cx2="http://schemas.microsoft.com/office/drawing/2015/10/21/chartex" xmlns:cx3="http://schemas.microsoft.com/office/drawing/2016/5/9/chartex" xmlns:cx4="http://schemas.microsoft.com/office/drawing/2016/5/10/chartex" xmlns:cx5="http://schemas.microsoft.com/office/drawing/2016/5/11/chartex" xmlns:cx6="http://schemas.microsoft.com/office/drawing/2016/5/12/chartex" xmlns:cx7="http://schemas.microsoft.com/office/drawing/2016/5/13/chartex" xmlns:cx8="http://schemas.microsoft.com/office/drawing/2016/5/14/chartex" xmlns:mc="http://schemas.openxmlformats.org/markup-compatibility/2006" xmlns:aink="http://schemas.microsoft.com/office/drawing/2016/ink" xmlns:am3d="http://schemas.microsoft.com/office/drawing/2017/model3d" xmlns:o="urn:schemas-microsoft-com:office:office" xmlns:r="http://schemas.openxmlformats.org/officeDocument/2006/relationships" xmlns:m="http://schemas.openxmlformats.org/officeDocument/2006/math" xmlns:v="urn:schemas-microsoft-com:vml" xmlns:wp14="http://schemas.microsoft.com/office/word/2010/wordprocessingDrawing" xmlns:wp="http://schemas.openxmlformats.org/drawingml/2006/wordprocessingDrawing" xmlns:w10="urn:schemas-microsoft-com:office:word" xmlns:w="http://schemas.openxmlformats.org/wordprocessingml/2006/main" xmlns:w14="http://schemas.microsoft.com/office/word/2010/wordml" xmlns:w15="http://schemas.microsoft.com/office/word/2012/wordml" xmlns:w16cex="http://schemas.microsoft.com/office/word/2018/wordml/cex" xmlns:w16cid="http://schemas.microsoft.com/office/word/2016/wordml/cid" xmlns:w16="http://schemas.microsoft.com/office/word/2018/wordml" xmlns:w16se="http://schemas.microsoft.com/office/word/2015/wordml/symex" xmlns:wpg="http://schemas.microsoft.com/office/word/2010/wordprocessingGroup" xmlns:wpi="http://schemas.microsoft.com/office/word/2010/wordprocessingInk" xmlns:wne="http://schemas.microsoft.com/office/word/2006/wordml" xmlns:wps="http://schemas.microsoft.com/office/word/2010/wordprocessingShape" mc:Ignorable="w14 w15 w16se w16cid w16 w16cex wp14">
   <w:footnote w:type="separator" w:id="-1">
     <w:p>
       <w:pPr>
@@ -4620,7 +3893,7 @@
 </file>
 
 <file path=word/styles.xml><?xml version="1.0" encoding="utf-8"?>
-<w:styles xmlns:mc="http://schemas.openxmlformats.org/markup-compatibility/2006" xmlns:r="http://schemas.openxmlformats.org/officeDocument/2006/relationships" xmlns:w="http://schemas.openxmlformats.org/wordprocessingml/2006/main" xmlns:w14="http://schemas.microsoft.com/office/word/2010/wordml" xmlns:w15="http://schemas.microsoft.com/office/word/2012/wordml" xmlns:w16cid="http://schemas.microsoft.com/office/word/2016/wordml/cid" xmlns:w16se="http://schemas.microsoft.com/office/word/2015/wordml/symex" mc:Ignorable="w14 w15 w16se w16cid">
+<w:styles xmlns:mc="http://schemas.openxmlformats.org/markup-compatibility/2006" xmlns:r="http://schemas.openxmlformats.org/officeDocument/2006/relationships" xmlns:w="http://schemas.openxmlformats.org/wordprocessingml/2006/main" xmlns:w14="http://schemas.microsoft.com/office/word/2010/wordml" xmlns:w15="http://schemas.microsoft.com/office/word/2012/wordml" xmlns:w16cex="http://schemas.microsoft.com/office/word/2018/wordml/cex" xmlns:w16cid="http://schemas.microsoft.com/office/word/2016/wordml/cid" xmlns:w16="http://schemas.microsoft.com/office/word/2018/wordml" xmlns:w16se="http://schemas.microsoft.com/office/word/2015/wordml/symex" mc:Ignorable="w14 w15 w16se w16cid w16 w16cex">
   <w:docDefaults>
     <w:rPrDefault>
       <w:rPr>
@@ -5021,6 +4294,7 @@
   <w:style w:type="character" w:default="1" w:styleId="DefaultParagraphFont">
     <w:name w:val="Default Paragraph Font"/>
     <w:uiPriority w:val="1"/>
+    <w:semiHidden/>
     <w:unhideWhenUsed/>
   </w:style>
   <w:style w:type="table" w:default="1" w:styleId="TableNormal">

</xml_diff>

<commit_message>
small fixes after lab meeting
</commit_message>
<xml_diff>
--- a/allometry_flowchart.docx
+++ b/allometry_flowchart.docx
@@ -108,14 +108,37 @@
                             <w:pPr>
                               <w:jc w:val="center"/>
                             </w:pPr>
-                            <w:r>
-                              <w:t>hello_metry(</w:t>
-                            </w:r>
-                            <w:r>
-                              <w:t>equation_table, measurement_table</w:t>
-                            </w:r>
-                            <w:r>
-                              <w:t>, data_table)</w:t>
+                            <w:proofErr w:type="spellStart"/>
+                            <w:r>
+                              <w:t>hello_metry</w:t>
+                            </w:r>
+                            <w:proofErr w:type="spellEnd"/>
+                            <w:r>
+                              <w:t>(</w:t>
+                            </w:r>
+                            <w:proofErr w:type="spellStart"/>
+                            <w:r>
+                              <w:t>equation_table</w:t>
+                            </w:r>
+                            <w:proofErr w:type="spellEnd"/>
+                            <w:r>
+                              <w:t xml:space="preserve">, </w:t>
+                            </w:r>
+                            <w:proofErr w:type="spellStart"/>
+                            <w:r>
+                              <w:t>measurement_table</w:t>
+                            </w:r>
+                            <w:proofErr w:type="spellEnd"/>
+                            <w:r>
+                              <w:t xml:space="preserve">, </w:t>
+                            </w:r>
+                            <w:proofErr w:type="spellStart"/>
+                            <w:r>
+                              <w:t>data_table</w:t>
+                            </w:r>
+                            <w:proofErr w:type="spellEnd"/>
+                            <w:r>
+                              <w:t>)</w:t>
                             </w:r>
                           </w:p>
                           <w:p/>
@@ -149,14 +172,37 @@
                       <w:pPr>
                         <w:jc w:val="center"/>
                       </w:pPr>
-                      <w:r>
-                        <w:t>hello_metry(</w:t>
-                      </w:r>
-                      <w:r>
-                        <w:t>equation_table, measurement_table</w:t>
-                      </w:r>
-                      <w:r>
-                        <w:t>, data_table)</w:t>
+                      <w:proofErr w:type="spellStart"/>
+                      <w:r>
+                        <w:t>hello_metry</w:t>
+                      </w:r>
+                      <w:proofErr w:type="spellEnd"/>
+                      <w:r>
+                        <w:t>(</w:t>
+                      </w:r>
+                      <w:proofErr w:type="spellStart"/>
+                      <w:r>
+                        <w:t>equation_table</w:t>
+                      </w:r>
+                      <w:proofErr w:type="spellEnd"/>
+                      <w:r>
+                        <w:t xml:space="preserve">, </w:t>
+                      </w:r>
+                      <w:proofErr w:type="spellStart"/>
+                      <w:r>
+                        <w:t>measurement_table</w:t>
+                      </w:r>
+                      <w:proofErr w:type="spellEnd"/>
+                      <w:r>
+                        <w:t xml:space="preserve">, </w:t>
+                      </w:r>
+                      <w:proofErr w:type="spellStart"/>
+                      <w:r>
+                        <w:t>data_table</w:t>
+                      </w:r>
+                      <w:proofErr w:type="spellEnd"/>
+                      <w:r>
+                        <w:t>)</w:t>
                       </w:r>
                     </w:p>
                     <w:p/>
@@ -432,8 +478,13 @@
                             <w:pPr>
                               <w:contextualSpacing/>
                             </w:pPr>
-                            <w:r>
-                              <w:t xml:space="preserve">equation_finder(size, row, </w:t>
+                            <w:proofErr w:type="spellStart"/>
+                            <w:r>
+                              <w:t>equation_finder</w:t>
+                            </w:r>
+                            <w:proofErr w:type="spellEnd"/>
+                            <w:r>
+                              <w:t xml:space="preserve">(size, row, </w:t>
                             </w:r>
                             <w:r>
                               <w:t>measurement_</w:t>
@@ -476,8 +527,13 @@
                       <w:pPr>
                         <w:contextualSpacing/>
                       </w:pPr>
-                      <w:r>
-                        <w:t xml:space="preserve">equation_finder(size, row, </w:t>
+                      <w:proofErr w:type="spellStart"/>
+                      <w:r>
+                        <w:t>equation_finder</w:t>
+                      </w:r>
+                      <w:proofErr w:type="spellEnd"/>
+                      <w:r>
+                        <w:t xml:space="preserve">(size, row, </w:t>
                       </w:r>
                       <w:r>
                         <w:t>measurement_</w:t>
@@ -1126,18 +1182,49 @@
                             <w:pPr>
                               <w:jc w:val="center"/>
                             </w:pPr>
-                            <w:r>
-                              <w:t xml:space="preserve">get_allometric_equations </w:t>
-                            </w:r>
-                            <w:r>
-                              <w:t xml:space="preserve">(species_name, taxonomic_level, size, abundance, </w:t>
+                            <w:proofErr w:type="spellStart"/>
+                            <w:r>
+                              <w:t>get_allometric_equations</w:t>
+                            </w:r>
+                            <w:proofErr w:type="spellEnd"/>
+                            <w:r>
+                              <w:t xml:space="preserve"> </w:t>
+                            </w:r>
+                            <w:r>
+                              <w:t>(</w:t>
+                            </w:r>
+                            <w:proofErr w:type="spellStart"/>
+                            <w:r>
+                              <w:t>species_name</w:t>
+                            </w:r>
+                            <w:proofErr w:type="spellEnd"/>
+                            <w:r>
+                              <w:t xml:space="preserve">, </w:t>
+                            </w:r>
+                            <w:proofErr w:type="spellStart"/>
+                            <w:r>
+                              <w:t>taxonomic_level</w:t>
+                            </w:r>
+                            <w:proofErr w:type="spellEnd"/>
+                            <w:r>
+                              <w:t xml:space="preserve">, size, abundance, </w:t>
                             </w:r>
                             <w:r>
                               <w:t xml:space="preserve"> path, </w:t>
                             </w:r>
-                            <w:r>
-                              <w:t>equation_table, measurement_table</w:t>
-                            </w:r>
+                            <w:proofErr w:type="spellStart"/>
+                            <w:r>
+                              <w:t>equation_table</w:t>
+                            </w:r>
+                            <w:proofErr w:type="spellEnd"/>
+                            <w:r>
+                              <w:t xml:space="preserve">, </w:t>
+                            </w:r>
+                            <w:proofErr w:type="spellStart"/>
+                            <w:r>
+                              <w:t>measurement_table</w:t>
+                            </w:r>
+                            <w:proofErr w:type="spellEnd"/>
                             <w:r>
                               <w:t>)</w:t>
                             </w:r>
@@ -1169,18 +1256,49 @@
                       <w:pPr>
                         <w:jc w:val="center"/>
                       </w:pPr>
-                      <w:r>
-                        <w:t xml:space="preserve">get_allometric_equations </w:t>
-                      </w:r>
-                      <w:r>
-                        <w:t xml:space="preserve">(species_name, taxonomic_level, size, abundance, </w:t>
+                      <w:proofErr w:type="spellStart"/>
+                      <w:r>
+                        <w:t>get_allometric_equations</w:t>
+                      </w:r>
+                      <w:proofErr w:type="spellEnd"/>
+                      <w:r>
+                        <w:t xml:space="preserve"> </w:t>
+                      </w:r>
+                      <w:r>
+                        <w:t>(</w:t>
+                      </w:r>
+                      <w:proofErr w:type="spellStart"/>
+                      <w:r>
+                        <w:t>species_name</w:t>
+                      </w:r>
+                      <w:proofErr w:type="spellEnd"/>
+                      <w:r>
+                        <w:t xml:space="preserve">, </w:t>
+                      </w:r>
+                      <w:proofErr w:type="spellStart"/>
+                      <w:r>
+                        <w:t>taxonomic_level</w:t>
+                      </w:r>
+                      <w:proofErr w:type="spellEnd"/>
+                      <w:r>
+                        <w:t xml:space="preserve">, size, abundance, </w:t>
                       </w:r>
                       <w:r>
                         <w:t xml:space="preserve"> path, </w:t>
                       </w:r>
-                      <w:r>
-                        <w:t>equation_table, measurement_table</w:t>
-                      </w:r>
+                      <w:proofErr w:type="spellStart"/>
+                      <w:r>
+                        <w:t>equation_table</w:t>
+                      </w:r>
+                      <w:proofErr w:type="spellEnd"/>
+                      <w:r>
+                        <w:t xml:space="preserve">, </w:t>
+                      </w:r>
+                      <w:proofErr w:type="spellStart"/>
+                      <w:r>
+                        <w:t>measurement_table</w:t>
+                      </w:r>
+                      <w:proofErr w:type="spellEnd"/>
                       <w:r>
                         <w:t>)</w:t>
                       </w:r>
@@ -1343,17 +1461,48 @@
                             <w:pPr>
                               <w:jc w:val="center"/>
                             </w:pPr>
-                            <w:r>
-                              <w:t xml:space="preserve">sizest(species_name, size, </w:t>
+                            <w:proofErr w:type="spellStart"/>
+                            <w:r>
+                              <w:t>sizest</w:t>
+                            </w:r>
+                            <w:proofErr w:type="spellEnd"/>
+                            <w:r>
+                              <w:t>(</w:t>
+                            </w:r>
+                            <w:proofErr w:type="spellStart"/>
+                            <w:r>
+                              <w:t>species_name</w:t>
+                            </w:r>
+                            <w:proofErr w:type="spellEnd"/>
+                            <w:r>
+                              <w:t xml:space="preserve">, size, </w:t>
                             </w:r>
                             <w:r>
                               <w:t xml:space="preserve">path, </w:t>
                             </w:r>
-                            <w:r>
-                              <w:t>equation_table, measurement_table</w:t>
-                            </w:r>
-                            <w:r>
-                              <w:t>, data_table)</w:t>
+                            <w:proofErr w:type="spellStart"/>
+                            <w:r>
+                              <w:t>equation_table</w:t>
+                            </w:r>
+                            <w:proofErr w:type="spellEnd"/>
+                            <w:r>
+                              <w:t xml:space="preserve">, </w:t>
+                            </w:r>
+                            <w:proofErr w:type="spellStart"/>
+                            <w:r>
+                              <w:t>measurement_table</w:t>
+                            </w:r>
+                            <w:proofErr w:type="spellEnd"/>
+                            <w:r>
+                              <w:t xml:space="preserve">, </w:t>
+                            </w:r>
+                            <w:proofErr w:type="spellStart"/>
+                            <w:r>
+                              <w:t>data_table</w:t>
+                            </w:r>
+                            <w:proofErr w:type="spellEnd"/>
+                            <w:r>
+                              <w:t>)</w:t>
                             </w:r>
                           </w:p>
                           <w:p/>
@@ -1383,17 +1532,48 @@
                       <w:pPr>
                         <w:jc w:val="center"/>
                       </w:pPr>
-                      <w:r>
-                        <w:t xml:space="preserve">sizest(species_name, size, </w:t>
+                      <w:proofErr w:type="spellStart"/>
+                      <w:r>
+                        <w:t>sizest</w:t>
+                      </w:r>
+                      <w:proofErr w:type="spellEnd"/>
+                      <w:r>
+                        <w:t>(</w:t>
+                      </w:r>
+                      <w:proofErr w:type="spellStart"/>
+                      <w:r>
+                        <w:t>species_name</w:t>
+                      </w:r>
+                      <w:proofErr w:type="spellEnd"/>
+                      <w:r>
+                        <w:t xml:space="preserve">, size, </w:t>
                       </w:r>
                       <w:r>
                         <w:t xml:space="preserve">path, </w:t>
                       </w:r>
-                      <w:r>
-                        <w:t>equation_table, measurement_table</w:t>
-                      </w:r>
-                      <w:r>
-                        <w:t>, data_table)</w:t>
+                      <w:proofErr w:type="spellStart"/>
+                      <w:r>
+                        <w:t>equation_table</w:t>
+                      </w:r>
+                      <w:proofErr w:type="spellEnd"/>
+                      <w:r>
+                        <w:t xml:space="preserve">, </w:t>
+                      </w:r>
+                      <w:proofErr w:type="spellStart"/>
+                      <w:r>
+                        <w:t>measurement_table</w:t>
+                      </w:r>
+                      <w:proofErr w:type="spellEnd"/>
+                      <w:r>
+                        <w:t xml:space="preserve">, </w:t>
+                      </w:r>
+                      <w:proofErr w:type="spellStart"/>
+                      <w:r>
+                        <w:t>data_table</w:t>
+                      </w:r>
+                      <w:proofErr w:type="spellEnd"/>
+                      <w:r>
+                        <w:t>)</w:t>
                       </w:r>
                     </w:p>
                     <w:p/>
@@ -1498,10 +1678,8 @@
         <w:contextualSpacing/>
         <w:rPr>
           <w:rFonts w:ascii="Goudy Old Style" w:hAnsi="Goudy Old Style" w:cs="Times New Roman"/>
-          <w:b/>
-          <w:bCs/>
-          <w:sz w:val="28"/>
-          <w:szCs w:val="28"/>
+          <w:sz w:val="24"/>
+          <w:szCs w:val="24"/>
         </w:rPr>
       </w:pPr>
       <w:r>
@@ -1558,12 +1736,27 @@
                       <wps:txbx>
                         <w:txbxContent>
                           <w:p>
-                            <w:r>
-                              <w:t xml:space="preserve">matcher_of_traits(species_name, </w:t>
-                            </w:r>
+                            <w:proofErr w:type="spellStart"/>
+                            <w:r>
+                              <w:t>matcher_of_traits</w:t>
+                            </w:r>
+                            <w:proofErr w:type="spellEnd"/>
+                            <w:r>
+                              <w:t>(</w:t>
+                            </w:r>
+                            <w:proofErr w:type="spellStart"/>
+                            <w:r>
+                              <w:t>species_name</w:t>
+                            </w:r>
+                            <w:proofErr w:type="spellEnd"/>
+                            <w:r>
+                              <w:t xml:space="preserve">, </w:t>
+                            </w:r>
+                            <w:proofErr w:type="spellStart"/>
                             <w:r>
                               <w:t>measurement_table</w:t>
                             </w:r>
+                            <w:proofErr w:type="spellEnd"/>
                             <w:r>
                               <w:t>)</w:t>
                             </w:r>
@@ -1591,12 +1784,27 @@
                 <v:textbox>
                   <w:txbxContent>
                     <w:p>
-                      <w:r>
-                        <w:t xml:space="preserve">matcher_of_traits(species_name, </w:t>
-                      </w:r>
+                      <w:proofErr w:type="spellStart"/>
+                      <w:r>
+                        <w:t>matcher_of_traits</w:t>
+                      </w:r>
+                      <w:proofErr w:type="spellEnd"/>
+                      <w:r>
+                        <w:t>(</w:t>
+                      </w:r>
+                      <w:proofErr w:type="spellStart"/>
+                      <w:r>
+                        <w:t>species_name</w:t>
+                      </w:r>
+                      <w:proofErr w:type="spellEnd"/>
+                      <w:r>
+                        <w:t xml:space="preserve">, </w:t>
+                      </w:r>
+                      <w:proofErr w:type="spellStart"/>
                       <w:r>
                         <w:t>measurement_table</w:t>
                       </w:r>
+                      <w:proofErr w:type="spellEnd"/>
                       <w:r>
                         <w:t>)</w:t>
                       </w:r>
@@ -2128,67 +2336,6 @@
         </w:rPr>
         <w:br w:type="page"/>
       </w:r>
-      <w:r>
-        <w:rPr>
-          <w:rFonts w:ascii="Goudy Old Style" w:hAnsi="Goudy Old Style" w:cs="Times New Roman"/>
-          <w:b/>
-          <w:bCs/>
-          <w:sz w:val="28"/>
-          <w:szCs w:val="28"/>
-        </w:rPr>
-        <w:lastRenderedPageBreak/>
-        <w:t>Four</w:t>
-      </w:r>
-      <w:r>
-        <w:rPr>
-          <w:rFonts w:ascii="Goudy Old Style" w:hAnsi="Goudy Old Style" w:cs="Times New Roman"/>
-          <w:b/>
-          <w:bCs/>
-          <w:sz w:val="28"/>
-          <w:szCs w:val="28"/>
-        </w:rPr>
-        <w:t xml:space="preserve"> functions</w:t>
-      </w:r>
-      <w:r>
-        <w:rPr>
-          <w:rFonts w:ascii="Goudy Old Style" w:hAnsi="Goudy Old Style" w:cs="Times New Roman"/>
-          <w:b/>
-          <w:bCs/>
-          <w:sz w:val="28"/>
-          <w:szCs w:val="28"/>
-        </w:rPr>
-        <w:t xml:space="preserve"> (</w:t>
-      </w:r>
-      <w:r>
-        <w:rPr>
-          <w:rFonts w:ascii="Goudy Old Style" w:hAnsi="Goudy Old Style" w:cs="Times New Roman"/>
-          <w:b/>
-          <w:bCs/>
-          <w:sz w:val="28"/>
-          <w:szCs w:val="28"/>
-        </w:rPr>
-        <w:t>R_code/</w:t>
-      </w:r>
-      <w:r>
-        <w:rPr>
-          <w:rFonts w:ascii="Goudy Old Style" w:hAnsi="Goudy Old Style" w:cs="Times New Roman"/>
-          <w:b/>
-          <w:bCs/>
-          <w:sz w:val="28"/>
-          <w:szCs w:val="28"/>
-        </w:rPr>
-        <w:t>functions.R)</w:t>
-      </w:r>
-      <w:r>
-        <w:rPr>
-          <w:rFonts w:ascii="Goudy Old Style" w:hAnsi="Goudy Old Style" w:cs="Times New Roman"/>
-          <w:b/>
-          <w:bCs/>
-          <w:sz w:val="28"/>
-          <w:szCs w:val="28"/>
-        </w:rPr>
-        <w:t>:</w:t>
-      </w:r>
     </w:p>
     <w:p>
       <w:pPr>
@@ -2199,1638 +2346,6 @@
           <w:szCs w:val="24"/>
         </w:rPr>
       </w:pPr>
-    </w:p>
-    <w:p>
-      <w:pPr>
-        <w:contextualSpacing/>
-        <w:rPr>
-          <w:rFonts w:ascii="Goudy Old Style" w:hAnsi="Goudy Old Style" w:cs="Times New Roman"/>
-          <w:sz w:val="24"/>
-          <w:szCs w:val="24"/>
-        </w:rPr>
-      </w:pPr>
-      <w:r>
-        <w:rPr>
-          <w:rFonts w:ascii="Goudy Old Style" w:hAnsi="Goudy Old Style" w:cs="Times New Roman"/>
-          <w:sz w:val="24"/>
-          <w:szCs w:val="24"/>
-        </w:rPr>
-        <w:t>hello_metry(</w:t>
-      </w:r>
-      <w:r>
-        <w:rPr>
-          <w:rFonts w:ascii="Goudy Old Style" w:hAnsi="Goudy Old Style" w:cs="Times New Roman"/>
-          <w:sz w:val="24"/>
-          <w:szCs w:val="24"/>
-        </w:rPr>
-        <w:t>equation_table, measurement_table</w:t>
-      </w:r>
-      <w:r>
-        <w:rPr>
-          <w:rFonts w:ascii="Goudy Old Style" w:hAnsi="Goudy Old Style" w:cs="Times New Roman"/>
-          <w:sz w:val="24"/>
-          <w:szCs w:val="24"/>
-        </w:rPr>
-        <w:t>, data_table, print</w:t>
-      </w:r>
-      <w:r>
-        <w:rPr>
-          <w:rFonts w:ascii="Goudy Old Style" w:hAnsi="Goudy Old Style" w:cs="Times New Roman"/>
-          <w:sz w:val="24"/>
-          <w:szCs w:val="24"/>
-        </w:rPr>
-        <w:t>)</w:t>
-      </w:r>
-    </w:p>
-    <w:p>
-      <w:pPr>
-        <w:contextualSpacing/>
-        <w:rPr>
-          <w:rFonts w:ascii="Goudy Old Style" w:hAnsi="Goudy Old Style" w:cs="Times New Roman"/>
-          <w:b/>
-          <w:bCs/>
-          <w:sz w:val="28"/>
-          <w:szCs w:val="28"/>
-        </w:rPr>
-      </w:pPr>
-      <w:r>
-        <w:rPr>
-          <w:rFonts w:ascii="Goudy Old Style" w:hAnsi="Goudy Old Style" w:cs="Times New Roman"/>
-          <w:sz w:val="24"/>
-          <w:szCs w:val="24"/>
-        </w:rPr>
-        <w:sym w:font="Wingdings" w:char="F0E0"/>
-      </w:r>
-      <w:r>
-        <w:rPr>
-          <w:rFonts w:ascii="Goudy Old Style" w:hAnsi="Goudy Old Style" w:cs="Times New Roman"/>
-          <w:sz w:val="24"/>
-          <w:szCs w:val="24"/>
-        </w:rPr>
-        <w:t xml:space="preserve"> wrapper function, returns</w:t>
-      </w:r>
-      <w:r>
-        <w:rPr>
-          <w:rFonts w:ascii="Goudy Old Style" w:hAnsi="Goudy Old Style" w:cs="Times New Roman"/>
-          <w:sz w:val="24"/>
-          <w:szCs w:val="24"/>
-        </w:rPr>
-        <w:t xml:space="preserve"> initial data table with two extra columns:</w:t>
-      </w:r>
-      <w:r>
-        <w:rPr>
-          <w:rFonts w:ascii="Goudy Old Style" w:hAnsi="Goudy Old Style" w:cs="Times New Roman"/>
-          <w:sz w:val="24"/>
-          <w:szCs w:val="24"/>
-        </w:rPr>
-        <w:t xml:space="preserve"> total biomass from given species, size and abundance</w:t>
-      </w:r>
-      <w:r>
-        <w:rPr>
-          <w:rFonts w:ascii="Goudy Old Style" w:hAnsi="Goudy Old Style" w:cs="Times New Roman"/>
-          <w:sz w:val="24"/>
-          <w:szCs w:val="24"/>
-        </w:rPr>
-        <w:t>, as well as path taken through the function</w:t>
-      </w:r>
-    </w:p>
-    <w:p>
-      <w:pPr>
-        <w:contextualSpacing/>
-        <w:rPr>
-          <w:rFonts w:ascii="Goudy Old Style" w:hAnsi="Goudy Old Style" w:cs="Times New Roman"/>
-          <w:sz w:val="24"/>
-          <w:szCs w:val="24"/>
-        </w:rPr>
-      </w:pPr>
-    </w:p>
-    <w:p>
-      <w:pPr>
-        <w:contextualSpacing/>
-        <w:rPr>
-          <w:rFonts w:ascii="Goudy Old Style" w:hAnsi="Goudy Old Style" w:cs="Times New Roman"/>
-          <w:sz w:val="24"/>
-          <w:szCs w:val="24"/>
-        </w:rPr>
-      </w:pPr>
-    </w:p>
-    <w:p>
-      <w:pPr>
-        <w:contextualSpacing/>
-        <w:rPr>
-          <w:rFonts w:ascii="Goudy Old Style" w:hAnsi="Goudy Old Style" w:cs="Times New Roman"/>
-          <w:sz w:val="24"/>
-          <w:szCs w:val="24"/>
-        </w:rPr>
-      </w:pPr>
-      <w:r>
-        <w:rPr>
-          <w:rFonts w:ascii="Goudy Old Style" w:hAnsi="Goudy Old Style" w:cs="Times New Roman"/>
-          <w:sz w:val="24"/>
-          <w:szCs w:val="24"/>
-        </w:rPr>
-        <w:t>sizest(</w:t>
-      </w:r>
-      <w:r>
-        <w:rPr>
-          <w:rFonts w:ascii="Goudy Old Style" w:hAnsi="Goudy Old Style" w:cs="Times New Roman"/>
-          <w:sz w:val="24"/>
-          <w:szCs w:val="24"/>
-        </w:rPr>
-        <w:t xml:space="preserve">specname, size, level, path, taxo, </w:t>
-      </w:r>
-      <w:r>
-        <w:rPr>
-          <w:rFonts w:ascii="Goudy Old Style" w:hAnsi="Goudy Old Style" w:cs="Times New Roman"/>
-          <w:sz w:val="24"/>
-          <w:szCs w:val="24"/>
-        </w:rPr>
-        <w:t>equation_table, measurement_table</w:t>
-      </w:r>
-      <w:r>
-        <w:rPr>
-          <w:rFonts w:ascii="Goudy Old Style" w:hAnsi="Goudy Old Style" w:cs="Times New Roman"/>
-          <w:sz w:val="24"/>
-          <w:szCs w:val="24"/>
-        </w:rPr>
-        <w:t>, data_table</w:t>
-      </w:r>
-      <w:r>
-        <w:rPr>
-          <w:rFonts w:ascii="Goudy Old Style" w:hAnsi="Goudy Old Style" w:cs="Times New Roman"/>
-          <w:sz w:val="24"/>
-          <w:szCs w:val="24"/>
-        </w:rPr>
-        <w:t>)</w:t>
-      </w:r>
-    </w:p>
-    <w:p>
-      <w:pPr>
-        <w:contextualSpacing/>
-        <w:rPr>
-          <w:rFonts w:ascii="Goudy Old Style" w:hAnsi="Goudy Old Style" w:cs="Times New Roman"/>
-          <w:sz w:val="24"/>
-          <w:szCs w:val="24"/>
-        </w:rPr>
-      </w:pPr>
-      <w:r>
-        <w:rPr>
-          <w:rFonts w:ascii="Goudy Old Style" w:hAnsi="Goudy Old Style" w:cs="Times New Roman"/>
-          <w:sz w:val="24"/>
-          <w:szCs w:val="24"/>
-        </w:rPr>
-        <w:sym w:font="Wingdings" w:char="F0E0"/>
-      </w:r>
-      <w:r>
-        <w:rPr>
-          <w:rFonts w:ascii="Goudy Old Style" w:hAnsi="Goudy Old Style" w:cs="Times New Roman"/>
-          <w:sz w:val="24"/>
-          <w:szCs w:val="24"/>
-        </w:rPr>
-        <w:t xml:space="preserve"> returns size estimate</w:t>
-      </w:r>
-      <w:r>
-        <w:rPr>
-          <w:rFonts w:ascii="Goudy Old Style" w:hAnsi="Goudy Old Style" w:cs="Times New Roman"/>
-          <w:sz w:val="24"/>
-          <w:szCs w:val="24"/>
-        </w:rPr>
-        <w:t xml:space="preserve"> based on taxonomic approach or trait approach</w:t>
-      </w:r>
-    </w:p>
-    <w:p>
-      <w:pPr>
-        <w:contextualSpacing/>
-        <w:rPr>
-          <w:rFonts w:ascii="Goudy Old Style" w:hAnsi="Goudy Old Style" w:cs="Times New Roman"/>
-          <w:sz w:val="24"/>
-          <w:szCs w:val="24"/>
-        </w:rPr>
-      </w:pPr>
-      <w:r>
-        <w:rPr>
-          <w:rFonts w:ascii="Goudy Old Style" w:hAnsi="Goudy Old Style" w:cs="Times New Roman"/>
-          <w:sz w:val="24"/>
-          <w:szCs w:val="24"/>
-        </w:rPr>
-        <w:sym w:font="Wingdings" w:char="F0E0"/>
-      </w:r>
-      <w:r>
-        <w:rPr>
-          <w:rFonts w:ascii="Goudy Old Style" w:hAnsi="Goudy Old Style" w:cs="Times New Roman"/>
-          <w:sz w:val="24"/>
-          <w:szCs w:val="24"/>
-        </w:rPr>
-        <w:t xml:space="preserve"> </w:t>
-      </w:r>
-      <w:r>
-        <w:rPr>
-          <w:rFonts w:ascii="Goudy Old Style" w:hAnsi="Goudy Old Style" w:cs="Times New Roman"/>
-          <w:sz w:val="24"/>
-          <w:szCs w:val="24"/>
-        </w:rPr>
-        <w:t xml:space="preserve">Collect abundance/size distribution from species in </w:t>
-      </w:r>
-      <w:r>
-        <w:rPr>
-          <w:rFonts w:ascii="Goudy Old Style" w:hAnsi="Goudy Old Style" w:cs="Times New Roman"/>
-          <w:b/>
-          <w:bCs/>
-          <w:sz w:val="24"/>
-          <w:szCs w:val="24"/>
-        </w:rPr>
-        <w:t xml:space="preserve">both </w:t>
-      </w:r>
-      <w:r>
-        <w:rPr>
-          <w:rFonts w:ascii="Goudy Old Style" w:hAnsi="Goudy Old Style" w:cs="Times New Roman"/>
-          <w:sz w:val="24"/>
-          <w:szCs w:val="24"/>
-        </w:rPr>
-        <w:t>measurement</w:t>
-      </w:r>
-      <w:r>
-        <w:rPr>
-          <w:rFonts w:ascii="Goudy Old Style" w:hAnsi="Goudy Old Style" w:cs="Times New Roman"/>
-          <w:sz w:val="24"/>
-          <w:szCs w:val="24"/>
-        </w:rPr>
-        <w:t xml:space="preserve"> and data tables. Look for at least three distinct numeric measurements in</w:t>
-      </w:r>
-      <w:r>
-        <w:rPr>
-          <w:rFonts w:ascii="Goudy Old Style" w:hAnsi="Goudy Old Style" w:cs="Times New Roman"/>
-          <w:sz w:val="24"/>
-          <w:szCs w:val="24"/>
-        </w:rPr>
-        <w:t xml:space="preserve"> a given grouping in</w:t>
-      </w:r>
-      <w:r>
-        <w:rPr>
-          <w:rFonts w:ascii="Goudy Old Style" w:hAnsi="Goudy Old Style" w:cs="Times New Roman"/>
-          <w:sz w:val="24"/>
-          <w:szCs w:val="24"/>
-        </w:rPr>
-        <w:t xml:space="preserve"> the following order: species to family, traits, suborder to </w:t>
-      </w:r>
-      <w:r>
-        <w:rPr>
-          <w:rFonts w:ascii="Goudy Old Style" w:hAnsi="Goudy Old Style" w:cs="Times New Roman"/>
-          <w:sz w:val="24"/>
-          <w:szCs w:val="24"/>
-        </w:rPr>
-        <w:t>phylum</w:t>
-      </w:r>
-      <w:r>
-        <w:rPr>
-          <w:rFonts w:ascii="Goudy Old Style" w:hAnsi="Goudy Old Style" w:cs="Times New Roman"/>
-          <w:sz w:val="24"/>
-          <w:szCs w:val="24"/>
-        </w:rPr>
-        <w:t>.</w:t>
-      </w:r>
-    </w:p>
-    <w:p>
-      <w:pPr>
-        <w:contextualSpacing/>
-        <w:rPr>
-          <w:rFonts w:ascii="Goudy Old Style" w:hAnsi="Goudy Old Style" w:cs="Times New Roman"/>
-          <w:sz w:val="24"/>
-          <w:szCs w:val="24"/>
-        </w:rPr>
-      </w:pPr>
-      <w:r>
-        <w:rPr>
-          <w:rFonts w:ascii="Goudy Old Style" w:hAnsi="Goudy Old Style" w:cs="Times New Roman"/>
-          <w:sz w:val="24"/>
-          <w:szCs w:val="24"/>
-        </w:rPr>
-        <w:sym w:font="Wingdings" w:char="F0E0"/>
-      </w:r>
-      <w:r>
-        <w:rPr>
-          <w:rFonts w:ascii="Goudy Old Style" w:hAnsi="Goudy Old Style" w:cs="Times New Roman"/>
-          <w:sz w:val="24"/>
-          <w:szCs w:val="24"/>
-        </w:rPr>
-        <w:t xml:space="preserve"> </w:t>
-      </w:r>
-      <w:r>
-        <w:rPr>
-          <w:rFonts w:ascii="Goudy Old Style" w:hAnsi="Goudy Old Style" w:cs="Times New Roman"/>
-          <w:sz w:val="24"/>
-          <w:szCs w:val="24"/>
-        </w:rPr>
-        <w:t>Once threshold of at least three distinct numeric measurements is met</w:t>
-      </w:r>
-      <w:r>
-        <w:rPr>
-          <w:rFonts w:ascii="Goudy Old Style" w:hAnsi="Goudy Old Style" w:cs="Times New Roman"/>
-          <w:sz w:val="24"/>
-          <w:szCs w:val="24"/>
-        </w:rPr>
-        <w:t>:</w:t>
-      </w:r>
-    </w:p>
-    <w:p>
-      <w:pPr>
-        <w:contextualSpacing/>
-        <w:rPr>
-          <w:rFonts w:ascii="Goudy Old Style" w:hAnsi="Goudy Old Style" w:cs="Times New Roman"/>
-          <w:sz w:val="24"/>
-          <w:szCs w:val="24"/>
-        </w:rPr>
-      </w:pPr>
-      <w:r>
-        <w:rPr>
-          <w:rFonts w:ascii="Goudy Old Style" w:hAnsi="Goudy Old Style" w:cs="Times New Roman"/>
-          <w:sz w:val="24"/>
-          <w:szCs w:val="24"/>
-        </w:rPr>
-        <w:tab/>
-        <w:t xml:space="preserve">- if </w:t>
-      </w:r>
-      <w:r>
-        <w:rPr>
-          <w:rFonts w:ascii="Goudy Old Style" w:hAnsi="Goudy Old Style" w:cs="Times New Roman"/>
-          <w:sz w:val="24"/>
-          <w:szCs w:val="24"/>
-        </w:rPr>
-        <w:t>size category “unknown”</w:t>
-      </w:r>
-      <w:r>
-        <w:rPr>
-          <w:rFonts w:ascii="Goudy Old Style" w:hAnsi="Goudy Old Style" w:cs="Times New Roman"/>
-          <w:sz w:val="24"/>
-          <w:szCs w:val="24"/>
-        </w:rPr>
-        <w:t>, r</w:t>
-      </w:r>
-      <w:r>
-        <w:rPr>
-          <w:rFonts w:ascii="Goudy Old Style" w:hAnsi="Goudy Old Style" w:cs="Times New Roman"/>
-          <w:sz w:val="24"/>
-          <w:szCs w:val="24"/>
-        </w:rPr>
-        <w:t xml:space="preserve">eturn weighted average of all available measurements </w:t>
-      </w:r>
-    </w:p>
-    <w:p>
-      <w:pPr>
-        <w:contextualSpacing/>
-        <w:rPr>
-          <w:rFonts w:ascii="Goudy Old Style" w:hAnsi="Goudy Old Style" w:cs="Times New Roman"/>
-          <w:sz w:val="24"/>
-          <w:szCs w:val="24"/>
-        </w:rPr>
-      </w:pPr>
-      <w:r>
-        <w:rPr>
-          <w:rFonts w:ascii="Goudy Old Style" w:hAnsi="Goudy Old Style" w:cs="Times New Roman"/>
-          <w:sz w:val="24"/>
-          <w:szCs w:val="24"/>
-        </w:rPr>
-        <w:tab/>
-        <w:t xml:space="preserve">- if </w:t>
-      </w:r>
-      <w:r>
-        <w:rPr>
-          <w:rFonts w:ascii="Goudy Old Style" w:hAnsi="Goudy Old Style" w:cs="Times New Roman"/>
-          <w:sz w:val="24"/>
-          <w:szCs w:val="24"/>
-        </w:rPr>
-        <w:t>size category one of S, M, L</w:t>
-      </w:r>
-      <w:r>
-        <w:rPr>
-          <w:rFonts w:ascii="Goudy Old Style" w:hAnsi="Goudy Old Style" w:cs="Times New Roman"/>
-          <w:sz w:val="24"/>
-          <w:szCs w:val="24"/>
-        </w:rPr>
-        <w:t>, d</w:t>
-      </w:r>
-      <w:r>
-        <w:rPr>
-          <w:rFonts w:ascii="Goudy Old Style" w:hAnsi="Goudy Old Style" w:cs="Times New Roman"/>
-          <w:sz w:val="24"/>
-          <w:szCs w:val="24"/>
-        </w:rPr>
-        <w:t>ivide measurements into three bins</w:t>
-      </w:r>
-      <w:r>
-        <w:rPr>
-          <w:rFonts w:ascii="Goudy Old Style" w:hAnsi="Goudy Old Style" w:cs="Times New Roman"/>
-          <w:sz w:val="24"/>
-          <w:szCs w:val="24"/>
-        </w:rPr>
-        <w:t xml:space="preserve"> of unique </w:t>
-      </w:r>
-    </w:p>
-    <w:p>
-      <w:pPr>
-        <w:ind w:left="720" w:firstLine="120"/>
-        <w:contextualSpacing/>
-        <w:rPr>
-          <w:rFonts w:ascii="Goudy Old Style" w:hAnsi="Goudy Old Style" w:cs="Times New Roman"/>
-          <w:sz w:val="24"/>
-          <w:szCs w:val="24"/>
-        </w:rPr>
-      </w:pPr>
-      <w:r>
-        <w:rPr>
-          <w:rFonts w:ascii="Goudy Old Style" w:hAnsi="Goudy Old Style" w:cs="Times New Roman"/>
-          <w:sz w:val="24"/>
-          <w:szCs w:val="24"/>
-        </w:rPr>
-        <w:t>measurement values</w:t>
-      </w:r>
-      <w:r>
-        <w:rPr>
-          <w:rFonts w:ascii="Goudy Old Style" w:hAnsi="Goudy Old Style" w:cs="Times New Roman"/>
-          <w:sz w:val="24"/>
-          <w:szCs w:val="24"/>
-        </w:rPr>
-        <w:t>, if bins not equal, larger bins for S and L</w:t>
-      </w:r>
-      <w:r>
-        <w:rPr>
-          <w:rFonts w:ascii="Goudy Old Style" w:hAnsi="Goudy Old Style" w:cs="Times New Roman"/>
-          <w:sz w:val="24"/>
-          <w:szCs w:val="24"/>
-        </w:rPr>
-        <w:t xml:space="preserve">. </w:t>
-      </w:r>
-      <w:r>
-        <w:rPr>
-          <w:rFonts w:ascii="Goudy Old Style" w:hAnsi="Goudy Old Style" w:cs="Times New Roman"/>
-          <w:sz w:val="24"/>
-          <w:szCs w:val="24"/>
-        </w:rPr>
-        <w:t xml:space="preserve">Return average of </w:t>
-      </w:r>
-      <w:r>
-        <w:rPr>
-          <w:rFonts w:ascii="Goudy Old Style" w:hAnsi="Goudy Old Style" w:cs="Times New Roman"/>
-          <w:sz w:val="24"/>
-          <w:szCs w:val="24"/>
-        </w:rPr>
-        <w:t xml:space="preserve">    </w:t>
-      </w:r>
-    </w:p>
-    <w:p>
-      <w:pPr>
-        <w:ind w:left="720" w:firstLine="120"/>
-        <w:contextualSpacing/>
-        <w:rPr>
-          <w:rFonts w:ascii="Goudy Old Style" w:hAnsi="Goudy Old Style" w:cs="Times New Roman"/>
-          <w:sz w:val="24"/>
-          <w:szCs w:val="24"/>
-        </w:rPr>
-      </w:pPr>
-      <w:r>
-        <w:rPr>
-          <w:rFonts w:ascii="Goudy Old Style" w:hAnsi="Goudy Old Style" w:cs="Times New Roman"/>
-          <w:sz w:val="24"/>
-          <w:szCs w:val="24"/>
-        </w:rPr>
-        <w:t>measurements within given bin</w:t>
-      </w:r>
-    </w:p>
-    <w:p>
-      <w:pPr>
-        <w:contextualSpacing/>
-        <w:rPr>
-          <w:rFonts w:ascii="Goudy Old Style" w:hAnsi="Goudy Old Style" w:cs="Times New Roman"/>
-          <w:sz w:val="24"/>
-          <w:szCs w:val="24"/>
-        </w:rPr>
-      </w:pPr>
-    </w:p>
-    <w:p>
-      <w:pPr>
-        <w:contextualSpacing/>
-        <w:rPr>
-          <w:rFonts w:ascii="Goudy Old Style" w:hAnsi="Goudy Old Style" w:cs="Times New Roman"/>
-          <w:sz w:val="24"/>
-          <w:szCs w:val="24"/>
-        </w:rPr>
-      </w:pPr>
-    </w:p>
-    <w:p>
-      <w:pPr>
-        <w:contextualSpacing/>
-        <w:rPr>
-          <w:rFonts w:ascii="Goudy Old Style" w:hAnsi="Goudy Old Style" w:cs="Times New Roman"/>
-          <w:sz w:val="24"/>
-          <w:szCs w:val="24"/>
-        </w:rPr>
-      </w:pPr>
-      <w:r>
-        <w:rPr>
-          <w:rFonts w:ascii="Goudy Old Style" w:hAnsi="Goudy Old Style" w:cs="Times New Roman"/>
-          <w:sz w:val="24"/>
-          <w:szCs w:val="24"/>
-        </w:rPr>
-        <w:t>get_</w:t>
-      </w:r>
-      <w:r>
-        <w:rPr>
-          <w:rFonts w:ascii="Goudy Old Style" w:hAnsi="Goudy Old Style" w:cs="Times New Roman"/>
-          <w:sz w:val="24"/>
-          <w:szCs w:val="24"/>
-        </w:rPr>
-        <w:t>allometric_equations</w:t>
-      </w:r>
-      <w:r>
-        <w:rPr>
-          <w:rFonts w:ascii="Goudy Old Style" w:hAnsi="Goudy Old Style" w:cs="Times New Roman"/>
-          <w:sz w:val="24"/>
-          <w:szCs w:val="24"/>
-        </w:rPr>
-        <w:t>(</w:t>
-      </w:r>
-      <w:r>
-        <w:rPr>
-          <w:rFonts w:ascii="Goudy Old Style" w:hAnsi="Goudy Old Style" w:cs="Times New Roman"/>
-          <w:sz w:val="24"/>
-          <w:szCs w:val="24"/>
-        </w:rPr>
-        <w:t xml:space="preserve">specname, level, size, abundance, path, taxo, </w:t>
-      </w:r>
-      <w:r>
-        <w:rPr>
-          <w:rFonts w:ascii="Goudy Old Style" w:hAnsi="Goudy Old Style" w:cs="Times New Roman"/>
-          <w:sz w:val="24"/>
-          <w:szCs w:val="24"/>
-        </w:rPr>
-        <w:t>equation_table, measurement_table</w:t>
-      </w:r>
-      <w:r>
-        <w:rPr>
-          <w:rFonts w:ascii="Goudy Old Style" w:hAnsi="Goudy Old Style" w:cs="Times New Roman"/>
-          <w:sz w:val="24"/>
-          <w:szCs w:val="24"/>
-        </w:rPr>
-        <w:t>)</w:t>
-      </w:r>
-    </w:p>
-    <w:p>
-      <w:pPr>
-        <w:contextualSpacing/>
-        <w:rPr>
-          <w:rFonts w:ascii="Goudy Old Style" w:hAnsi="Goudy Old Style" w:cs="Times New Roman"/>
-          <w:sz w:val="24"/>
-          <w:szCs w:val="24"/>
-        </w:rPr>
-      </w:pPr>
-      <w:r>
-        <w:rPr>
-          <w:rFonts w:ascii="Goudy Old Style" w:hAnsi="Goudy Old Style" w:cs="Times New Roman"/>
-          <w:sz w:val="24"/>
-          <w:szCs w:val="24"/>
-        </w:rPr>
-        <w:sym w:font="Wingdings" w:char="F0E0"/>
-      </w:r>
-      <w:r>
-        <w:rPr>
-          <w:rFonts w:ascii="Goudy Old Style" w:hAnsi="Goudy Old Style" w:cs="Times New Roman"/>
-          <w:sz w:val="24"/>
-          <w:szCs w:val="24"/>
-        </w:rPr>
-        <w:t xml:space="preserve"> look if raw biomass value exists for given measurement, use it if available</w:t>
-      </w:r>
-    </w:p>
-    <w:p>
-      <w:pPr>
-        <w:contextualSpacing/>
-        <w:rPr>
-          <w:rFonts w:ascii="Goudy Old Style" w:hAnsi="Goudy Old Style" w:cs="Times New Roman"/>
-          <w:sz w:val="24"/>
-          <w:szCs w:val="24"/>
-        </w:rPr>
-      </w:pPr>
-      <w:r>
-        <w:rPr>
-          <w:rFonts w:ascii="Goudy Old Style" w:hAnsi="Goudy Old Style" w:cs="Times New Roman"/>
-          <w:sz w:val="24"/>
-          <w:szCs w:val="24"/>
-        </w:rPr>
-        <w:sym w:font="Wingdings" w:char="F0E0"/>
-      </w:r>
-      <w:r>
-        <w:rPr>
-          <w:rFonts w:ascii="Goudy Old Style" w:hAnsi="Goudy Old Style" w:cs="Times New Roman"/>
-          <w:sz w:val="24"/>
-          <w:szCs w:val="24"/>
-        </w:rPr>
-        <w:t xml:space="preserve"> </w:t>
-      </w:r>
-      <w:r>
-        <w:rPr>
-          <w:rFonts w:ascii="Goudy Old Style" w:hAnsi="Goudy Old Style" w:cs="Times New Roman"/>
-          <w:sz w:val="24"/>
-          <w:szCs w:val="24"/>
-        </w:rPr>
-        <w:t>Look for at least one allometric equation in</w:t>
-      </w:r>
-      <w:r>
-        <w:rPr>
-          <w:rFonts w:ascii="Goudy Old Style" w:hAnsi="Goudy Old Style" w:cs="Times New Roman"/>
-          <w:sz w:val="24"/>
-          <w:szCs w:val="24"/>
-        </w:rPr>
-        <w:t xml:space="preserve"> a given grouping in</w:t>
-      </w:r>
-      <w:r>
-        <w:rPr>
-          <w:rFonts w:ascii="Goudy Old Style" w:hAnsi="Goudy Old Style" w:cs="Times New Roman"/>
-          <w:sz w:val="24"/>
-          <w:szCs w:val="24"/>
-        </w:rPr>
-        <w:t xml:space="preserve"> the following order: species to family, traits, suborder to </w:t>
-      </w:r>
-      <w:r>
-        <w:rPr>
-          <w:rFonts w:ascii="Goudy Old Style" w:hAnsi="Goudy Old Style" w:cs="Times New Roman"/>
-          <w:sz w:val="24"/>
-          <w:szCs w:val="24"/>
-        </w:rPr>
-        <w:t>phylum</w:t>
-      </w:r>
-    </w:p>
-    <w:p>
-      <w:pPr>
-        <w:contextualSpacing/>
-        <w:rPr>
-          <w:rFonts w:ascii="Goudy Old Style" w:hAnsi="Goudy Old Style" w:cs="Times New Roman"/>
-          <w:sz w:val="24"/>
-          <w:szCs w:val="24"/>
-        </w:rPr>
-      </w:pPr>
-      <w:r>
-        <w:rPr>
-          <w:rFonts w:ascii="Goudy Old Style" w:hAnsi="Goudy Old Style" w:cs="Times New Roman"/>
-          <w:sz w:val="24"/>
-          <w:szCs w:val="24"/>
-        </w:rPr>
-        <w:sym w:font="Wingdings" w:char="F0E0"/>
-      </w:r>
-      <w:r>
-        <w:rPr>
-          <w:rFonts w:ascii="Goudy Old Style" w:hAnsi="Goudy Old Style" w:cs="Times New Roman"/>
-          <w:sz w:val="24"/>
-          <w:szCs w:val="24"/>
-        </w:rPr>
-        <w:t xml:space="preserve"> </w:t>
-      </w:r>
-      <w:r>
-        <w:rPr>
-          <w:rFonts w:ascii="Goudy Old Style" w:hAnsi="Goudy Old Style" w:cs="Times New Roman"/>
-          <w:sz w:val="24"/>
-          <w:szCs w:val="24"/>
-        </w:rPr>
-        <w:t>Once threshold of at least one allometric equation is met</w:t>
-      </w:r>
-      <w:r>
-        <w:rPr>
-          <w:rFonts w:ascii="Goudy Old Style" w:hAnsi="Goudy Old Style" w:cs="Times New Roman"/>
-          <w:sz w:val="24"/>
-          <w:szCs w:val="24"/>
-        </w:rPr>
-        <w:t>:</w:t>
-      </w:r>
-    </w:p>
-    <w:p>
-      <w:pPr>
-        <w:contextualSpacing/>
-        <w:rPr>
-          <w:rFonts w:ascii="Goudy Old Style" w:hAnsi="Goudy Old Style" w:cs="Times New Roman"/>
-          <w:sz w:val="24"/>
-          <w:szCs w:val="24"/>
-        </w:rPr>
-      </w:pPr>
-      <w:r>
-        <w:rPr>
-          <w:rFonts w:ascii="Goudy Old Style" w:hAnsi="Goudy Old Style" w:cs="Times New Roman"/>
-          <w:sz w:val="24"/>
-          <w:szCs w:val="24"/>
-        </w:rPr>
-        <w:tab/>
-        <w:t>- if there is only one equation, compute value of biomass</w:t>
-      </w:r>
-    </w:p>
-    <w:p>
-      <w:pPr>
-        <w:contextualSpacing/>
-        <w:rPr>
-          <w:rFonts w:ascii="Goudy Old Style" w:hAnsi="Goudy Old Style" w:cs="Times New Roman"/>
-          <w:sz w:val="24"/>
-          <w:szCs w:val="24"/>
-        </w:rPr>
-      </w:pPr>
-      <w:r>
-        <w:rPr>
-          <w:rFonts w:ascii="Goudy Old Style" w:hAnsi="Goudy Old Style" w:cs="Times New Roman"/>
-          <w:sz w:val="24"/>
-          <w:szCs w:val="24"/>
-        </w:rPr>
-        <w:tab/>
-        <w:t>- if there is more than one allometric equation, average the computed values of biomass</w:t>
-      </w:r>
-    </w:p>
-    <w:p>
-      <w:pPr>
-        <w:contextualSpacing/>
-        <w:rPr>
-          <w:rFonts w:ascii="Goudy Old Style" w:hAnsi="Goudy Old Style" w:cs="Times New Roman"/>
-          <w:sz w:val="24"/>
-          <w:szCs w:val="24"/>
-        </w:rPr>
-      </w:pPr>
-    </w:p>
-    <w:p>
-      <w:pPr>
-        <w:contextualSpacing/>
-        <w:rPr>
-          <w:rFonts w:ascii="Goudy Old Style" w:hAnsi="Goudy Old Style" w:cs="Times New Roman"/>
-          <w:sz w:val="24"/>
-          <w:szCs w:val="24"/>
-        </w:rPr>
-      </w:pPr>
-    </w:p>
-    <w:p>
-      <w:pPr>
-        <w:contextualSpacing/>
-        <w:rPr>
-          <w:rFonts w:ascii="Goudy Old Style" w:hAnsi="Goudy Old Style" w:cs="Times New Roman"/>
-          <w:sz w:val="24"/>
-          <w:szCs w:val="24"/>
-        </w:rPr>
-      </w:pPr>
-      <w:r>
-        <w:rPr>
-          <w:rFonts w:ascii="Goudy Old Style" w:hAnsi="Goudy Old Style" w:cs="Times New Roman"/>
-          <w:sz w:val="24"/>
-          <w:szCs w:val="24"/>
-        </w:rPr>
-        <w:t xml:space="preserve">matcher_of_traits(species_name, </w:t>
-      </w:r>
-      <w:r>
-        <w:rPr>
-          <w:rFonts w:ascii="Goudy Old Style" w:hAnsi="Goudy Old Style" w:cs="Times New Roman"/>
-          <w:sz w:val="24"/>
-          <w:szCs w:val="24"/>
-        </w:rPr>
-        <w:t>measurement</w:t>
-      </w:r>
-      <w:r>
-        <w:rPr>
-          <w:rFonts w:ascii="Goudy Old Style" w:hAnsi="Goudy Old Style" w:cs="Times New Roman"/>
-          <w:sz w:val="24"/>
-          <w:szCs w:val="24"/>
-        </w:rPr>
-        <w:t>_table)</w:t>
-      </w:r>
-    </w:p>
-    <w:p>
-      <w:pPr>
-        <w:contextualSpacing/>
-        <w:rPr>
-          <w:rFonts w:ascii="Goudy Old Style" w:hAnsi="Goudy Old Style" w:cs="Times New Roman"/>
-          <w:sz w:val="24"/>
-          <w:szCs w:val="24"/>
-        </w:rPr>
-      </w:pPr>
-      <w:r>
-        <w:rPr>
-          <w:rFonts w:ascii="Goudy Old Style" w:hAnsi="Goudy Old Style" w:cs="Times New Roman"/>
-          <w:sz w:val="24"/>
-          <w:szCs w:val="24"/>
-        </w:rPr>
-        <w:sym w:font="Wingdings" w:char="F0E0"/>
-      </w:r>
-      <w:r>
-        <w:rPr>
-          <w:rFonts w:ascii="Goudy Old Style" w:hAnsi="Goudy Old Style" w:cs="Times New Roman"/>
-          <w:sz w:val="24"/>
-          <w:szCs w:val="24"/>
-        </w:rPr>
-        <w:t xml:space="preserve"> called if grouping in sizest or get_allometric_equations is “traits”, i.e. if threshold of at least three distinct measurements or one allometric equation not met at family level</w:t>
-      </w:r>
-    </w:p>
-    <w:p>
-      <w:pPr>
-        <w:contextualSpacing/>
-        <w:rPr>
-          <w:rFonts w:ascii="Goudy Old Style" w:hAnsi="Goudy Old Style" w:cs="Times New Roman"/>
-          <w:sz w:val="24"/>
-          <w:szCs w:val="24"/>
-        </w:rPr>
-      </w:pPr>
-      <w:r>
-        <w:rPr>
-          <w:rFonts w:ascii="Goudy Old Style" w:hAnsi="Goudy Old Style" w:cs="Times New Roman"/>
-          <w:sz w:val="24"/>
-          <w:szCs w:val="24"/>
-        </w:rPr>
-        <w:sym w:font="Wingdings" w:char="F0E0"/>
-      </w:r>
-      <w:r>
-        <w:rPr>
-          <w:rFonts w:ascii="Goudy Old Style" w:hAnsi="Goudy Old Style" w:cs="Times New Roman"/>
-          <w:sz w:val="24"/>
-          <w:szCs w:val="24"/>
-        </w:rPr>
-        <w:t xml:space="preserve"> </w:t>
-      </w:r>
-      <w:r>
-        <w:rPr>
-          <w:rFonts w:ascii="Goudy Old Style" w:hAnsi="Goudy Old Style" w:cs="Times New Roman"/>
-          <w:sz w:val="24"/>
-          <w:szCs w:val="24"/>
-        </w:rPr>
-        <w:t>Match traits of max</w:t>
-      </w:r>
-      <w:r>
-        <w:rPr>
-          <w:rFonts w:ascii="Goudy Old Style" w:hAnsi="Goudy Old Style" w:cs="Times New Roman"/>
-          <w:sz w:val="24"/>
-          <w:szCs w:val="24"/>
-        </w:rPr>
-        <w:t>imum body</w:t>
-      </w:r>
-      <w:r>
-        <w:rPr>
-          <w:rFonts w:ascii="Goudy Old Style" w:hAnsi="Goudy Old Style" w:cs="Times New Roman"/>
-          <w:sz w:val="24"/>
-          <w:szCs w:val="24"/>
-        </w:rPr>
-        <w:t xml:space="preserve"> size, body shape, locomotion and morphological defense</w:t>
-      </w:r>
-      <w:r>
-        <w:rPr>
-          <w:rFonts w:ascii="Goudy Old Style" w:hAnsi="Goudy Old Style" w:cs="Times New Roman"/>
-          <w:sz w:val="24"/>
-          <w:szCs w:val="24"/>
-        </w:rPr>
-        <w:t xml:space="preserve"> across </w:t>
-      </w:r>
-      <w:r>
-        <w:rPr>
-          <w:rFonts w:ascii="Goudy Old Style" w:hAnsi="Goudy Old Style" w:cs="Times New Roman"/>
-          <w:b/>
-          <w:bCs/>
-          <w:sz w:val="24"/>
-          <w:szCs w:val="24"/>
-        </w:rPr>
-        <w:t>all</w:t>
-      </w:r>
-      <w:r>
-        <w:rPr>
-          <w:rFonts w:ascii="Goudy Old Style" w:hAnsi="Goudy Old Style" w:cs="Times New Roman"/>
-          <w:sz w:val="24"/>
-          <w:szCs w:val="24"/>
-        </w:rPr>
-        <w:t xml:space="preserve"> species in the database</w:t>
-      </w:r>
-      <w:r>
-        <w:rPr>
-          <w:rFonts w:ascii="Goudy Old Style" w:hAnsi="Goudy Old Style" w:cs="Times New Roman"/>
-          <w:sz w:val="24"/>
-          <w:szCs w:val="24"/>
-        </w:rPr>
-        <w:t xml:space="preserve">. Those species with </w:t>
-      </w:r>
-      <w:r>
-        <w:rPr>
-          <w:rFonts w:ascii="Goudy Old Style" w:hAnsi="Goudy Old Style" w:cs="Times New Roman"/>
-          <w:b/>
-          <w:bCs/>
-          <w:sz w:val="24"/>
-          <w:szCs w:val="24"/>
-        </w:rPr>
-        <w:t>+/- 1</w:t>
-      </w:r>
-      <w:r>
-        <w:rPr>
-          <w:rFonts w:ascii="Goudy Old Style" w:hAnsi="Goudy Old Style" w:cs="Times New Roman"/>
-          <w:sz w:val="24"/>
-          <w:szCs w:val="24"/>
-        </w:rPr>
-        <w:t xml:space="preserve"> match are added to a species pool to get </w:t>
-      </w:r>
-      <w:r>
-        <w:rPr>
-          <w:rFonts w:ascii="Goudy Old Style" w:hAnsi="Goudy Old Style" w:cs="Times New Roman"/>
-          <w:sz w:val="24"/>
-          <w:szCs w:val="24"/>
-        </w:rPr>
-        <w:t xml:space="preserve">allometric </w:t>
-      </w:r>
-      <w:r>
-        <w:rPr>
-          <w:rFonts w:ascii="Goudy Old Style" w:hAnsi="Goudy Old Style" w:cs="Times New Roman"/>
-          <w:sz w:val="24"/>
-          <w:szCs w:val="24"/>
-        </w:rPr>
-        <w:t>equations or size estimates</w:t>
-      </w:r>
-      <w:r>
-        <w:rPr>
-          <w:rFonts w:ascii="Goudy Old Style" w:hAnsi="Goudy Old Style" w:cs="Times New Roman"/>
-          <w:sz w:val="24"/>
-          <w:szCs w:val="24"/>
-        </w:rPr>
-        <w:t xml:space="preserve"> (instead of a taxonomic grouping)</w:t>
-      </w:r>
-    </w:p>
-    <w:p>
-      <w:pPr>
-        <w:contextualSpacing/>
-        <w:rPr>
-          <w:rFonts w:ascii="Goudy Old Style" w:hAnsi="Goudy Old Style" w:cs="Times New Roman"/>
-          <w:b/>
-          <w:bCs/>
-          <w:sz w:val="24"/>
-          <w:szCs w:val="24"/>
-        </w:rPr>
-      </w:pPr>
-      <w:r>
-        <w:rPr>
-          <w:rFonts w:ascii="Goudy Old Style" w:hAnsi="Goudy Old Style" w:cs="Times New Roman"/>
-          <w:sz w:val="24"/>
-          <w:szCs w:val="24"/>
-        </w:rPr>
-        <w:sym w:font="Wingdings" w:char="F0E0"/>
-      </w:r>
-      <w:r>
-        <w:rPr>
-          <w:rFonts w:ascii="Goudy Old Style" w:hAnsi="Goudy Old Style" w:cs="Times New Roman"/>
-          <w:sz w:val="24"/>
-          <w:szCs w:val="24"/>
-        </w:rPr>
-        <w:t xml:space="preserve"> Does not proceed if any NA is found in the trait values of the species</w:t>
-      </w:r>
-    </w:p>
-    <w:p>
-      <w:pPr>
-        <w:contextualSpacing/>
-        <w:rPr>
-          <w:rFonts w:ascii="Goudy Old Style" w:hAnsi="Goudy Old Style" w:cs="Times New Roman"/>
-          <w:sz w:val="24"/>
-          <w:szCs w:val="24"/>
-        </w:rPr>
-      </w:pPr>
-    </w:p>
-    <w:p>
-      <w:pPr>
-        <w:contextualSpacing/>
-        <w:rPr>
-          <w:rFonts w:ascii="Goudy Old Style" w:hAnsi="Goudy Old Style" w:cs="Times New Roman"/>
-          <w:sz w:val="24"/>
-          <w:szCs w:val="24"/>
-        </w:rPr>
-      </w:pPr>
-    </w:p>
-    <w:p>
-      <w:pPr>
-        <w:contextualSpacing/>
-        <w:rPr>
-          <w:rFonts w:ascii="Goudy Old Style" w:hAnsi="Goudy Old Style" w:cs="Times New Roman"/>
-          <w:sz w:val="24"/>
-          <w:szCs w:val="24"/>
-        </w:rPr>
-      </w:pPr>
-      <w:r>
-        <w:rPr>
-          <w:rFonts w:ascii="Goudy Old Style" w:hAnsi="Goudy Old Style" w:cs="Times New Roman"/>
-          <w:sz w:val="24"/>
-          <w:szCs w:val="24"/>
-        </w:rPr>
-        <w:t xml:space="preserve">equation_finder(size, row, </w:t>
-      </w:r>
-      <w:r>
-        <w:rPr>
-          <w:rFonts w:ascii="Goudy Old Style" w:hAnsi="Goudy Old Style" w:cs="Times New Roman"/>
-          <w:sz w:val="24"/>
-          <w:szCs w:val="24"/>
-        </w:rPr>
-        <w:t>measurement_tables</w:t>
-      </w:r>
-      <w:r>
-        <w:rPr>
-          <w:rFonts w:ascii="Goudy Old Style" w:hAnsi="Goudy Old Style" w:cs="Times New Roman"/>
-          <w:sz w:val="24"/>
-          <w:szCs w:val="24"/>
-        </w:rPr>
-        <w:t>)</w:t>
-      </w:r>
-    </w:p>
-    <w:p>
-      <w:pPr>
-        <w:contextualSpacing/>
-        <w:rPr>
-          <w:rFonts w:ascii="Goudy Old Style" w:hAnsi="Goudy Old Style" w:cs="Times New Roman"/>
-          <w:sz w:val="24"/>
-          <w:szCs w:val="24"/>
-        </w:rPr>
-      </w:pPr>
-      <w:r>
-        <w:rPr>
-          <w:rFonts w:ascii="Goudy Old Style" w:hAnsi="Goudy Old Style" w:cs="Times New Roman"/>
-          <w:sz w:val="24"/>
-          <w:szCs w:val="24"/>
-        </w:rPr>
-        <w:sym w:font="Wingdings" w:char="F0E0"/>
-      </w:r>
-      <w:r>
-        <w:rPr>
-          <w:rFonts w:ascii="Goudy Old Style" w:hAnsi="Goudy Old Style" w:cs="Times New Roman"/>
-          <w:sz w:val="24"/>
-          <w:szCs w:val="24"/>
-        </w:rPr>
-        <w:t xml:space="preserve"> called when biomass computation happens because some equations are in log10 format</w:t>
-      </w:r>
-      <w:r>
-        <w:rPr>
-          <w:rFonts w:ascii="Goudy Old Style" w:hAnsi="Goudy Old Style" w:cs="Times New Roman"/>
-          <w:sz w:val="24"/>
-          <w:szCs w:val="24"/>
-        </w:rPr>
-        <w:t xml:space="preserve"> (log10(biomass) = slope x log10(size) + intercept)</w:t>
-      </w:r>
-      <w:r>
-        <w:rPr>
-          <w:rFonts w:ascii="Goudy Old Style" w:hAnsi="Goudy Old Style" w:cs="Times New Roman"/>
-          <w:sz w:val="24"/>
-          <w:szCs w:val="24"/>
-        </w:rPr>
-        <w:t>, others in ln format</w:t>
-      </w:r>
-      <w:r>
-        <w:rPr>
-          <w:rFonts w:ascii="Goudy Old Style" w:hAnsi="Goudy Old Style" w:cs="Times New Roman"/>
-          <w:sz w:val="24"/>
-          <w:szCs w:val="24"/>
-        </w:rPr>
-        <w:t xml:space="preserve"> (</w:t>
-      </w:r>
-      <w:r>
-        <w:rPr>
-          <w:rFonts w:ascii="Goudy Old Style" w:hAnsi="Goudy Old Style" w:cs="Times New Roman"/>
-          <w:sz w:val="24"/>
-          <w:szCs w:val="24"/>
-        </w:rPr>
-        <w:t xml:space="preserve">ln(biomass) = </w:t>
-      </w:r>
-      <w:r>
-        <w:rPr>
-          <w:rFonts w:ascii="Goudy Old Style" w:hAnsi="Goudy Old Style" w:cs="Times New Roman"/>
-          <w:sz w:val="24"/>
-          <w:szCs w:val="24"/>
-        </w:rPr>
-        <w:t>slope x ln(size) + ln(intercept))</w:t>
-      </w:r>
-    </w:p>
-    <w:p>
-      <w:pPr>
-        <w:contextualSpacing/>
-        <w:rPr>
-          <w:rFonts w:ascii="Goudy Old Style" w:hAnsi="Goudy Old Style" w:cs="Times New Roman"/>
-          <w:sz w:val="24"/>
-          <w:szCs w:val="24"/>
-        </w:rPr>
-      </w:pPr>
-      <w:r>
-        <w:rPr>
-          <w:rFonts w:ascii="Goudy Old Style" w:hAnsi="Goudy Old Style" w:cs="Times New Roman"/>
-          <w:sz w:val="24"/>
-          <w:szCs w:val="24"/>
-        </w:rPr>
-        <w:sym w:font="Wingdings" w:char="F0E0"/>
-      </w:r>
-      <w:r>
-        <w:rPr>
-          <w:rFonts w:ascii="Goudy Old Style" w:hAnsi="Goudy Old Style" w:cs="Times New Roman"/>
-          <w:sz w:val="24"/>
-          <w:szCs w:val="24"/>
-        </w:rPr>
-        <w:t xml:space="preserve"> has an exception argument, so far used for Acari, because equation used generates weight in micrograms, not milligrams (argument controls the conversion)</w:t>
-      </w:r>
-    </w:p>
-    <w:p>
-      <w:pPr>
-        <w:rPr>
-          <w:rFonts w:ascii="Goudy Old Style" w:hAnsi="Goudy Old Style" w:cs="Times New Roman"/>
-          <w:sz w:val="24"/>
-          <w:szCs w:val="24"/>
-        </w:rPr>
-      </w:pPr>
-      <w:r>
-        <w:rPr>
-          <w:rFonts w:ascii="Goudy Old Style" w:hAnsi="Goudy Old Style" w:cs="Times New Roman"/>
-          <w:sz w:val="24"/>
-          <w:szCs w:val="24"/>
-        </w:rPr>
-        <w:br w:type="page"/>
-      </w:r>
-      <w:r>
-        <w:rPr>
-          <w:rFonts w:ascii="Goudy Old Style" w:hAnsi="Goudy Old Style" w:cs="Times New Roman"/>
-          <w:b/>
-          <w:bCs/>
-          <w:sz w:val="28"/>
-          <w:szCs w:val="28"/>
-        </w:rPr>
-        <w:lastRenderedPageBreak/>
-        <w:t>Path nomenclature:</w:t>
-      </w:r>
-    </w:p>
-    <w:p>
-      <w:pPr>
-        <w:contextualSpacing/>
-        <w:rPr>
-          <w:rFonts w:ascii="Goudy Old Style" w:hAnsi="Goudy Old Style" w:cs="Times New Roman"/>
-          <w:sz w:val="24"/>
-          <w:szCs w:val="24"/>
-        </w:rPr>
-      </w:pPr>
-    </w:p>
-    <w:p>
-      <w:pPr>
-        <w:contextualSpacing/>
-        <w:rPr>
-          <w:rFonts w:ascii="Goudy Old Style" w:hAnsi="Goudy Old Style" w:cs="Times New Roman"/>
-          <w:sz w:val="24"/>
-          <w:szCs w:val="24"/>
-        </w:rPr>
-      </w:pPr>
-      <w:r>
-        <w:rPr>
-          <w:rFonts w:ascii="Goudy Old Style" w:hAnsi="Goudy Old Style" w:cs="Times New Roman"/>
-          <w:sz w:val="24"/>
-          <w:szCs w:val="24"/>
-        </w:rPr>
-        <w:t>1. special cases</w:t>
-      </w:r>
-    </w:p>
-    <w:p>
-      <w:pPr>
-        <w:contextualSpacing/>
-        <w:rPr>
-          <w:rFonts w:ascii="Goudy Old Style" w:hAnsi="Goudy Old Style" w:cs="Times New Roman"/>
-          <w:sz w:val="24"/>
-          <w:szCs w:val="24"/>
-        </w:rPr>
-      </w:pPr>
-      <w:r>
-        <w:rPr>
-          <w:rFonts w:ascii="Goudy Old Style" w:hAnsi="Goudy Old Style" w:cs="Times New Roman"/>
-          <w:sz w:val="24"/>
-          <w:szCs w:val="24"/>
-        </w:rPr>
-        <w:t>- “null_biomass”: if abundance was 0</w:t>
-      </w:r>
-    </w:p>
-    <w:p>
-      <w:pPr>
-        <w:contextualSpacing/>
-        <w:rPr>
-          <w:rFonts w:ascii="Goudy Old Style" w:hAnsi="Goudy Old Style" w:cs="Times New Roman"/>
-          <w:sz w:val="24"/>
-          <w:szCs w:val="24"/>
-        </w:rPr>
-      </w:pPr>
-      <w:r>
-        <w:rPr>
-          <w:rFonts w:ascii="Goudy Old Style" w:hAnsi="Goudy Old Style" w:cs="Times New Roman"/>
-          <w:sz w:val="24"/>
-          <w:szCs w:val="24"/>
-        </w:rPr>
-        <w:t>- “_size_failed”: if there was not enough close relatives or species with matching traits to compute size</w:t>
-      </w:r>
-    </w:p>
-    <w:p>
-      <w:pPr>
-        <w:contextualSpacing/>
-        <w:rPr>
-          <w:rFonts w:ascii="Goudy Old Style" w:hAnsi="Goudy Old Style" w:cs="Times New Roman"/>
-          <w:sz w:val="24"/>
-          <w:szCs w:val="24"/>
-        </w:rPr>
-      </w:pPr>
-      <w:r>
-        <w:rPr>
-          <w:rFonts w:ascii="Goudy Old Style" w:hAnsi="Goudy Old Style" w:cs="Times New Roman"/>
-          <w:sz w:val="24"/>
-          <w:szCs w:val="24"/>
-        </w:rPr>
-        <w:t>- “</w:t>
-      </w:r>
-      <w:r>
-        <w:rPr>
-          <w:rFonts w:ascii="Goudy Old Style" w:hAnsi="Goudy Old Style" w:cs="Times New Roman"/>
-          <w:sz w:val="24"/>
-          <w:szCs w:val="24"/>
-        </w:rPr>
-        <w:t>_raw</w:t>
-      </w:r>
-      <w:r>
-        <w:rPr>
-          <w:rFonts w:ascii="Goudy Old Style" w:hAnsi="Goudy Old Style" w:cs="Times New Roman"/>
-          <w:sz w:val="24"/>
-          <w:szCs w:val="24"/>
-        </w:rPr>
-        <w:t>_dry/wet</w:t>
-      </w:r>
-      <w:r>
-        <w:rPr>
-          <w:rFonts w:ascii="Goudy Old Style" w:hAnsi="Goudy Old Style" w:cs="Times New Roman"/>
-          <w:sz w:val="24"/>
-          <w:szCs w:val="24"/>
-        </w:rPr>
-        <w:t>”: if there was a raw (direc</w:t>
-      </w:r>
-      <w:r>
-        <w:rPr>
-          <w:rFonts w:ascii="Goudy Old Style" w:hAnsi="Goudy Old Style" w:cs="Times New Roman"/>
-          <w:sz w:val="24"/>
-          <w:szCs w:val="24"/>
-        </w:rPr>
-        <w:t>t</w:t>
-      </w:r>
-      <w:r>
-        <w:rPr>
-          <w:rFonts w:ascii="Goudy Old Style" w:hAnsi="Goudy Old Style" w:cs="Times New Roman"/>
-          <w:sz w:val="24"/>
-          <w:szCs w:val="24"/>
-        </w:rPr>
-        <w:t>) measurement for that particular species-size combination</w:t>
-      </w:r>
-      <w:r>
-        <w:rPr>
-          <w:rFonts w:ascii="Goudy Old Style" w:hAnsi="Goudy Old Style" w:cs="Times New Roman"/>
-          <w:sz w:val="24"/>
-          <w:szCs w:val="24"/>
-        </w:rPr>
-        <w:t>, and whether that measurement is dry or wet biomass</w:t>
-      </w:r>
-    </w:p>
-    <w:p>
-      <w:pPr>
-        <w:contextualSpacing/>
-        <w:rPr>
-          <w:rFonts w:ascii="Goudy Old Style" w:hAnsi="Goudy Old Style" w:cs="Times New Roman"/>
-          <w:sz w:val="24"/>
-          <w:szCs w:val="24"/>
-        </w:rPr>
-      </w:pPr>
-    </w:p>
-    <w:p>
-      <w:pPr>
-        <w:contextualSpacing/>
-        <w:rPr>
-          <w:rFonts w:ascii="Goudy Old Style" w:hAnsi="Goudy Old Style" w:cs="Times New Roman"/>
-          <w:sz w:val="24"/>
-          <w:szCs w:val="24"/>
-        </w:rPr>
-      </w:pPr>
-      <w:r>
-        <w:rPr>
-          <w:rFonts w:ascii="Goudy Old Style" w:hAnsi="Goudy Old Style" w:cs="Times New Roman"/>
-          <w:sz w:val="24"/>
-          <w:szCs w:val="24"/>
-        </w:rPr>
-        <w:t>2. regular cases</w:t>
-      </w:r>
-    </w:p>
-    <w:p>
-      <w:pPr>
-        <w:contextualSpacing/>
-        <w:rPr>
-          <w:rFonts w:ascii="Goudy Old Style" w:hAnsi="Goudy Old Style" w:cs="Times New Roman"/>
-          <w:sz w:val="24"/>
-          <w:szCs w:val="24"/>
-        </w:rPr>
-      </w:pPr>
-      <w:r>
-        <w:rPr>
-          <w:rFonts w:ascii="Goudy Old Style" w:hAnsi="Goudy Old Style" w:cs="Times New Roman"/>
-          <w:sz w:val="24"/>
-          <w:szCs w:val="24"/>
-        </w:rPr>
-        <w:t xml:space="preserve">- if the species goes through estimation of size (sizest()): </w:t>
-      </w:r>
-    </w:p>
-    <w:p>
-      <w:pPr>
-        <w:contextualSpacing/>
-        <w:rPr>
-          <w:rFonts w:ascii="Goudy Old Style" w:hAnsi="Goudy Old Style" w:cs="Times New Roman"/>
-          <w:sz w:val="24"/>
-          <w:szCs w:val="24"/>
-        </w:rPr>
-      </w:pPr>
-      <w:r>
-        <w:rPr>
-          <w:rFonts w:ascii="Goudy Old Style" w:hAnsi="Goudy Old Style" w:cs="Times New Roman"/>
-          <w:sz w:val="24"/>
-          <w:szCs w:val="24"/>
-        </w:rPr>
-        <w:t>estimation kind:level_number of measurements</w:t>
-      </w:r>
-    </w:p>
-    <w:p>
-      <w:pPr>
-        <w:contextualSpacing/>
-        <w:rPr>
-          <w:rFonts w:ascii="Goudy Old Style" w:hAnsi="Goudy Old Style" w:cs="Times New Roman"/>
-          <w:sz w:val="24"/>
-          <w:szCs w:val="24"/>
-        </w:rPr>
-      </w:pPr>
-      <w:r>
-        <w:rPr>
-          <w:rFonts w:ascii="Goudy Old Style" w:hAnsi="Goudy Old Style" w:cs="Times New Roman"/>
-          <w:sz w:val="24"/>
-          <w:szCs w:val="24"/>
-        </w:rPr>
-        <w:t>e.g.: _</w:t>
-      </w:r>
-      <w:r>
-        <w:rPr>
-          <w:rFonts w:ascii="Goudy Old Style" w:hAnsi="Goudy Old Style" w:cs="Times New Roman"/>
-          <w:sz w:val="24"/>
-          <w:szCs w:val="24"/>
-        </w:rPr>
-        <w:t>WA:genus_5</w:t>
-      </w:r>
-      <w:r>
-        <w:rPr>
-          <w:rFonts w:ascii="Goudy Old Style" w:hAnsi="Goudy Old Style" w:cs="Times New Roman"/>
-          <w:sz w:val="24"/>
-          <w:szCs w:val="24"/>
-        </w:rPr>
-        <w:t xml:space="preserve"> (size estimation using weighted average on 5 measurements from the species’ genus), _</w:t>
-      </w:r>
-      <w:r>
-        <w:rPr>
-          <w:rFonts w:ascii="Goudy Old Style" w:hAnsi="Goudy Old Style" w:cs="Times New Roman"/>
-          <w:sz w:val="24"/>
-          <w:szCs w:val="24"/>
-        </w:rPr>
-        <w:t>BIN:</w:t>
-      </w:r>
-      <w:r>
-        <w:rPr>
-          <w:rFonts w:ascii="Goudy Old Style" w:hAnsi="Goudy Old Style" w:cs="Times New Roman"/>
-          <w:sz w:val="24"/>
-          <w:szCs w:val="24"/>
-        </w:rPr>
-        <w:t>subfamily</w:t>
-      </w:r>
-      <w:r>
-        <w:rPr>
-          <w:rFonts w:ascii="Goudy Old Style" w:hAnsi="Goudy Old Style" w:cs="Times New Roman"/>
-          <w:sz w:val="24"/>
-          <w:szCs w:val="24"/>
-        </w:rPr>
-        <w:t>_3</w:t>
-      </w:r>
-      <w:r>
-        <w:rPr>
-          <w:rFonts w:ascii="Goudy Old Style" w:hAnsi="Goudy Old Style" w:cs="Times New Roman"/>
-          <w:sz w:val="24"/>
-          <w:szCs w:val="24"/>
-        </w:rPr>
-        <w:t xml:space="preserve"> (size estimation using size bins (S, M, L) on three measurement a the subfamily level)</w:t>
-      </w:r>
-    </w:p>
-    <w:p>
-      <w:pPr>
-        <w:contextualSpacing/>
-        <w:rPr>
-          <w:rFonts w:ascii="Goudy Old Style" w:hAnsi="Goudy Old Style" w:cs="Times New Roman"/>
-          <w:sz w:val="24"/>
-          <w:szCs w:val="24"/>
-        </w:rPr>
-      </w:pPr>
-      <w:r>
-        <w:rPr>
-          <w:rFonts w:ascii="Goudy Old Style" w:hAnsi="Goudy Old Style" w:cs="Times New Roman"/>
-          <w:sz w:val="24"/>
-          <w:szCs w:val="24"/>
-        </w:rPr>
-        <w:t xml:space="preserve">- if the allometric equations are used (get_biomass()): </w:t>
-      </w:r>
-    </w:p>
-    <w:p>
-      <w:pPr>
-        <w:contextualSpacing/>
-        <w:rPr>
-          <w:rFonts w:ascii="Goudy Old Style" w:hAnsi="Goudy Old Style" w:cs="Times New Roman"/>
-          <w:sz w:val="24"/>
-          <w:szCs w:val="24"/>
-        </w:rPr>
-      </w:pPr>
-      <w:r>
-        <w:rPr>
-          <w:rFonts w:ascii="Goudy Old Style" w:hAnsi="Goudy Old Style" w:cs="Times New Roman"/>
-          <w:sz w:val="24"/>
-          <w:szCs w:val="24"/>
-        </w:rPr>
-        <w:t>biomass estimation:taxonomic level of inference_number of equations</w:t>
-      </w:r>
-      <w:r>
-        <w:rPr>
-          <w:rFonts w:ascii="Goudy Old Style" w:hAnsi="Goudy Old Style" w:cs="Times New Roman"/>
-          <w:sz w:val="24"/>
-          <w:szCs w:val="24"/>
-        </w:rPr>
-        <w:t>_dry/wet</w:t>
-      </w:r>
-    </w:p>
-    <w:p>
-      <w:pPr>
-        <w:contextualSpacing/>
-        <w:rPr>
-          <w:rFonts w:ascii="Goudy Old Style" w:hAnsi="Goudy Old Style" w:cs="Times New Roman"/>
-          <w:sz w:val="24"/>
-          <w:szCs w:val="24"/>
-        </w:rPr>
-      </w:pPr>
-      <w:r>
-        <w:rPr>
-          <w:rFonts w:ascii="Goudy Old Style" w:hAnsi="Goudy Old Style" w:cs="Times New Roman"/>
-          <w:sz w:val="24"/>
-          <w:szCs w:val="24"/>
-        </w:rPr>
-        <w:t xml:space="preserve">e.g. </w:t>
-      </w:r>
-      <w:r>
-        <w:rPr>
-          <w:rFonts w:ascii="Goudy Old Style" w:hAnsi="Goudy Old Style" w:cs="Times New Roman"/>
-          <w:sz w:val="24"/>
-          <w:szCs w:val="24"/>
-        </w:rPr>
-        <w:t>_BM:bwg_name_1</w:t>
-      </w:r>
-      <w:r>
-        <w:rPr>
-          <w:rFonts w:ascii="Goudy Old Style" w:hAnsi="Goudy Old Style" w:cs="Times New Roman"/>
-          <w:sz w:val="24"/>
-          <w:szCs w:val="24"/>
-        </w:rPr>
-        <w:t>_wet</w:t>
-      </w:r>
-      <w:r>
-        <w:rPr>
-          <w:rFonts w:ascii="Goudy Old Style" w:hAnsi="Goudy Old Style" w:cs="Times New Roman"/>
-          <w:sz w:val="24"/>
-          <w:szCs w:val="24"/>
-        </w:rPr>
-        <w:t xml:space="preserve"> (one equation</w:t>
-      </w:r>
-      <w:r>
-        <w:rPr>
-          <w:rFonts w:ascii="Goudy Old Style" w:hAnsi="Goudy Old Style" w:cs="Times New Roman"/>
-          <w:sz w:val="24"/>
-          <w:szCs w:val="24"/>
-        </w:rPr>
-        <w:t xml:space="preserve"> from wet biomass</w:t>
-      </w:r>
-      <w:r>
-        <w:rPr>
-          <w:rFonts w:ascii="Goudy Old Style" w:hAnsi="Goudy Old Style" w:cs="Times New Roman"/>
-          <w:sz w:val="24"/>
-          <w:szCs w:val="24"/>
-        </w:rPr>
-        <w:t xml:space="preserve"> at the species level), </w:t>
-      </w:r>
-      <w:r>
-        <w:rPr>
-          <w:rFonts w:ascii="Goudy Old Style" w:hAnsi="Goudy Old Style" w:cs="Times New Roman"/>
-          <w:sz w:val="24"/>
-          <w:szCs w:val="24"/>
-        </w:rPr>
-        <w:t>_BM:</w:t>
-      </w:r>
-      <w:r>
-        <w:rPr>
-          <w:rFonts w:ascii="Goudy Old Style" w:hAnsi="Goudy Old Style" w:cs="Times New Roman"/>
-          <w:sz w:val="24"/>
-          <w:szCs w:val="24"/>
-        </w:rPr>
-        <w:t>subclass</w:t>
-      </w:r>
-      <w:r>
-        <w:rPr>
-          <w:rFonts w:ascii="Goudy Old Style" w:hAnsi="Goudy Old Style" w:cs="Times New Roman"/>
-          <w:sz w:val="24"/>
-          <w:szCs w:val="24"/>
-        </w:rPr>
-        <w:t>_</w:t>
-      </w:r>
-      <w:r>
-        <w:rPr>
-          <w:rFonts w:ascii="Goudy Old Style" w:hAnsi="Goudy Old Style" w:cs="Times New Roman"/>
-          <w:sz w:val="24"/>
-          <w:szCs w:val="24"/>
-        </w:rPr>
-        <w:t>5</w:t>
-      </w:r>
-      <w:r>
-        <w:rPr>
-          <w:rFonts w:ascii="Goudy Old Style" w:hAnsi="Goudy Old Style" w:cs="Times New Roman"/>
-          <w:sz w:val="24"/>
-          <w:szCs w:val="24"/>
-        </w:rPr>
-        <w:t xml:space="preserve">_dry </w:t>
-      </w:r>
-      <w:r>
-        <w:rPr>
-          <w:rFonts w:ascii="Goudy Old Style" w:hAnsi="Goudy Old Style" w:cs="Times New Roman"/>
-          <w:sz w:val="24"/>
-          <w:szCs w:val="24"/>
-        </w:rPr>
-        <w:t>(five equation</w:t>
-      </w:r>
-      <w:r>
-        <w:rPr>
-          <w:rFonts w:ascii="Goudy Old Style" w:hAnsi="Goudy Old Style" w:cs="Times New Roman"/>
-          <w:sz w:val="24"/>
-          <w:szCs w:val="24"/>
-        </w:rPr>
-        <w:t xml:space="preserve"> from dry biomass </w:t>
-      </w:r>
-      <w:r>
-        <w:rPr>
-          <w:rFonts w:ascii="Goudy Old Style" w:hAnsi="Goudy Old Style" w:cs="Times New Roman"/>
-          <w:sz w:val="24"/>
-          <w:szCs w:val="24"/>
-        </w:rPr>
-        <w:t xml:space="preserve">s at the </w:t>
-      </w:r>
-      <w:r>
-        <w:rPr>
-          <w:rFonts w:ascii="Goudy Old Style" w:hAnsi="Goudy Old Style" w:cs="Times New Roman"/>
-          <w:sz w:val="24"/>
-          <w:szCs w:val="24"/>
-        </w:rPr>
-        <w:t>subclass</w:t>
-      </w:r>
-      <w:r>
-        <w:rPr>
-          <w:rFonts w:ascii="Goudy Old Style" w:hAnsi="Goudy Old Style" w:cs="Times New Roman"/>
-          <w:sz w:val="24"/>
-          <w:szCs w:val="24"/>
-        </w:rPr>
-        <w:t xml:space="preserve"> level)</w:t>
-      </w:r>
-    </w:p>
-    <w:p>
-      <w:pPr>
-        <w:contextualSpacing/>
-        <w:rPr>
-          <w:rFonts w:ascii="Goudy Old Style" w:hAnsi="Goudy Old Style" w:cs="Times New Roman"/>
-          <w:sz w:val="24"/>
-          <w:szCs w:val="24"/>
-        </w:rPr>
-      </w:pPr>
-    </w:p>
-    <w:p>
-      <w:pPr>
-        <w:contextualSpacing/>
-        <w:rPr>
-          <w:rFonts w:ascii="Goudy Old Style" w:hAnsi="Goudy Old Style" w:cs="Times New Roman"/>
-          <w:sz w:val="24"/>
-          <w:szCs w:val="24"/>
-        </w:rPr>
-      </w:pPr>
-      <w:r>
-        <w:rPr>
-          <w:rFonts w:ascii="Goudy Old Style" w:hAnsi="Goudy Old Style" w:cs="Times New Roman"/>
-          <w:sz w:val="24"/>
-          <w:szCs w:val="24"/>
-        </w:rPr>
-        <w:t>If a species went through both size estimation and biomass estimations, the path will be composite, e.g. _</w:t>
-      </w:r>
-      <w:r>
-        <w:rPr>
-          <w:rFonts w:ascii="Goudy Old Style" w:hAnsi="Goudy Old Style" w:cs="Times New Roman"/>
-          <w:sz w:val="24"/>
-          <w:szCs w:val="24"/>
-        </w:rPr>
-        <w:t>WA:genus_5_BM:bwg_name_1</w:t>
-      </w:r>
-      <w:r>
-        <w:rPr>
-          <w:rFonts w:ascii="Goudy Old Style" w:hAnsi="Goudy Old Style" w:cs="Times New Roman"/>
-          <w:sz w:val="24"/>
-          <w:szCs w:val="24"/>
-        </w:rPr>
-        <w:t>_wet</w:t>
-      </w:r>
     </w:p>
     <w:sectPr>
       <w:pgSz w:w="12240" w:h="15840"/>

</xml_diff>